<commit_message>
docs: update report title to Career Graph, add all 6 Group 06 members, remove mentor and certificate page
</commit_message>
<xml_diff>
--- a/CareerGraph_Project_Report.docx
+++ b/CareerGraph_Project_Report.docx
@@ -4,7 +4,7 @@
   <w:body>
     <w:p>
       <w:pPr>
-        <w:spacing w:before="480" w:after="160"/>
+        <w:spacing w:before="400" w:after="120"/>
         <w:jc w:val="center"/>
       </w:pPr>
       <w:r>
@@ -18,21 +18,21 @@
     </w:p>
     <w:p>
       <w:pPr>
-        <w:spacing w:before="240" w:after="240"/>
+        <w:spacing w:before="200" w:after="200"/>
         <w:jc w:val="center"/>
       </w:pPr>
       <w:r>
         <w:rPr>
           <w:b/>
           <w:color w:val="1E3A8A"/>
-          <w:sz w:val="36"/>
+          <w:sz w:val="34"/>
         </w:rPr>
-        <w:t>CAREERGRAPH: AN INTERACTIVE AND PERSONALIZED IT CAREER ROADMAP PLATFORM WITH PREREQUISITE LOCKING AND SKILL VERIFICATION</w:t>
+        <w:t>CAREER GRAPH: AN INTERACTIVE AND PERSONALIZED IT CAREER ROADMAP PLATFORM WITH PREREQUISITE LOCKING AND SKILL VERIFICATION</w:t>
       </w:r>
     </w:p>
     <w:p>
       <w:pPr>
-        <w:spacing w:before="160" w:after="560"/>
+        <w:spacing w:before="120" w:after="440"/>
         <w:jc w:val="center"/>
       </w:pPr>
       <w:r>
@@ -129,7 +129,7 @@
                 <w:color w:val="1E293B"/>
                 <w:sz w:val="18"/>
               </w:rPr>
-              <w:t>CareerGraph</w:t>
+              <w:t>Career Graph</w:t>
             </w:r>
           </w:p>
         </w:tc>
@@ -167,7 +167,7 @@
                 <w:color w:val="1E293B"/>
                 <w:sz w:val="18"/>
               </w:rPr>
-              <w:t>Project Candidates:</w:t>
+              <w:t>Group No. &amp; Team Members:</w:t>
             </w:r>
           </w:p>
         </w:tc>
@@ -199,9 +199,20 @@
                 <w:color w:val="1E293B"/>
                 <w:sz w:val="18"/>
               </w:rPr>
-              <w:t>Archit Surve</w:t>
+              <w:t>GROUP NO. 06</w:t>
               <w:br/>
-              <w:t>Sanika Vichare</w:t>
+              <w:br/>
+              <w:t>1. Shinde Piyush Anil</w:t>
+              <w:br/>
+              <w:t>2. Surve Archit Milind</w:t>
+              <w:br/>
+              <w:t>3. Telore Jagruti Kishore</w:t>
+              <w:br/>
+              <w:t>4. Tumma Varsha Chandraprakash</w:t>
+              <w:br/>
+              <w:t>5. Vichare Sanika Sanjay</w:t>
+              <w:br/>
+              <w:t>6. Waychal Sanyukta Amol</w:t>
             </w:r>
           </w:p>
         </w:tc>
@@ -239,7 +250,7 @@
                 <w:color w:val="1E293B"/>
                 <w:sz w:val="18"/>
               </w:rPr>
-              <w:t>Project Guide / Mentor:</w:t>
+              <w:t>Academic Year:</w:t>
             </w:r>
           </w:p>
         </w:tc>
@@ -271,7 +282,7 @@
                 <w:color w:val="1E293B"/>
                 <w:sz w:val="18"/>
               </w:rPr>
-              <w:t>Project Guide / Faculty Advisor</w:t>
+              <w:t>2025 – 2026</w:t>
             </w:r>
           </w:p>
         </w:tc>
@@ -309,7 +320,7 @@
                 <w:color w:val="1E293B"/>
                 <w:sz w:val="18"/>
               </w:rPr>
-              <w:t>Academic Year:</w:t>
+              <w:t>Department &amp; College:</w:t>
             </w:r>
           </w:p>
         </w:tc>
@@ -341,76 +352,6 @@
                 <w:color w:val="1E293B"/>
                 <w:sz w:val="18"/>
               </w:rPr>
-              <w:t>2025 – 2026</w:t>
-            </w:r>
-          </w:p>
-        </w:tc>
-      </w:tr>
-      <w:tr>
-        <w:trPr>
-          <w:cantSplit/>
-        </w:trPr>
-        <w:tc>
-          <w:tcPr>
-            <w:tcW w:type="dxa" w:w="3600"/>
-            <w:tcMar>
-              <w:top w:w="60" w:type="dxa"/>
-              <w:bottom w:w="60" w:type="dxa"/>
-              <w:left w:w="100" w:type="dxa"/>
-              <w:right w:w="100" w:type="dxa"/>
-            </w:tcMar>
-            <w:shd w:fill="F8FAFC"/>
-            <w:vAlign w:val="center"/>
-            <w:tcMar>
-              <w:top w:w="100" w:type="dxa"/>
-              <w:bottom w:w="100" w:type="dxa"/>
-              <w:left w:w="140" w:type="dxa"/>
-              <w:right w:w="140" w:type="dxa"/>
-            </w:tcMar>
-            <w:shd w:fill="F8FAFC"/>
-          </w:tcPr>
-          <w:p>
-            <w:pPr>
-              <w:spacing w:before="20" w:after="20"/>
-            </w:pPr>
-            <w:r>
-              <w:rPr>
-                <w:b/>
-                <w:color w:val="1E293B"/>
-                <w:sz w:val="18"/>
-              </w:rPr>
-              <w:t>Department &amp; College:</w:t>
-            </w:r>
-          </w:p>
-        </w:tc>
-        <w:tc>
-          <w:tcPr>
-            <w:tcW w:type="dxa" w:w="5760"/>
-            <w:tcMar>
-              <w:top w:w="60" w:type="dxa"/>
-              <w:bottom w:w="60" w:type="dxa"/>
-              <w:left w:w="100" w:type="dxa"/>
-              <w:right w:w="100" w:type="dxa"/>
-            </w:tcMar>
-            <w:shd w:fill="FFFFFF"/>
-            <w:vAlign w:val="center"/>
-            <w:tcMar>
-              <w:top w:w="100" w:type="dxa"/>
-              <w:bottom w:w="100" w:type="dxa"/>
-              <w:left w:w="140" w:type="dxa"/>
-              <w:right w:w="140" w:type="dxa"/>
-            </w:tcMar>
-            <w:shd w:fill="F8FAFC"/>
-          </w:tcPr>
-          <w:p>
-            <w:pPr>
-              <w:spacing w:before="20" w:after="20"/>
-            </w:pPr>
-            <w:r>
-              <w:rPr>
-                <w:color w:val="1E293B"/>
-                <w:sz w:val="18"/>
-              </w:rPr>
               <w:t>Department of Computer Engineering / IT</w:t>
             </w:r>
           </w:p>
@@ -424,7 +365,7 @@
     </w:p>
     <w:p>
       <w:pPr>
-        <w:spacing w:before="320" w:after="240"/>
+        <w:spacing w:before="400" w:after="240"/>
         <w:jc w:val="center"/>
       </w:pPr>
       <w:r>
@@ -433,58 +374,50 @@
           <w:color w:val="1E3A8A"/>
           <w:sz w:val="32"/>
         </w:rPr>
-        <w:t>CERTIFICATE</w:t>
+        <w:t>ACKNOWLEDGEMENT</w:t>
       </w:r>
     </w:p>
     <w:p>
       <w:r>
-        <w:t>This is to certify that the project report entitled "CareerGraph: An Interactive and Personalized IT Career Roadmap Platform with Prerequisite Locking and Skill Verification" is a bona fide record of work carried out by Archit Surve and Sanika Vichare in partial fulfillment of the requirements for the award of the Bachelor's Degree in Computer Engineering / Information Technology.</w:t>
+        <w:t>We, the members of Group No. 06, express our sincere gratitude to our faculty members, project mentors, and department staff for their valuable guidance, encouragement, and insightful feedback throughout the design, development, and testing of Career Graph.</w:t>
       </w:r>
     </w:p>
     <w:p>
       <w:r>
-        <w:t>The work embodied in this project report has been completed under our supervision and guidance, and complies with the prescribed academic guidelines and standards.</w:t>
+        <w:t>We are also thankful to our institution for providing the required infrastructure, laboratory facilities, and computing resources essential for completing this full-stack engineering project.</w:t>
+      </w:r>
+    </w:p>
+    <w:p>
+      <w:r>
+        <w:t>Finally, we extend our heartfelt appreciation to our fellow team members for their collaborative spirit, dedication, and joint efforts in making this project successful.</w:t>
       </w:r>
     </w:p>
     <w:p>
       <w:pPr>
-        <w:spacing w:before="800" w:after="400"/>
+        <w:spacing w:before="560" w:after="200"/>
       </w:pPr>
       <w:r>
         <w:rPr>
           <w:b/>
           <w:color w:val="1E293B"/>
-          <w:sz w:val="20"/>
+          <w:sz w:val="19"/>
         </w:rPr>
-        <w:t>_________________________</w:t>
+        <w:t>Group No. 06 Team Members:</w:t>
+        <w:br/>
+        <w:t>• Shinde Piyush Anil</w:t>
         <w:tab/>
         <w:tab/>
-        <w:tab/>
-        <w:t>_________________________</w:t>
+        <w:t>• Surve Archit Milind</w:t>
         <w:br/>
-        <w:t>Project Guide / Mentor</w:t>
+        <w:t>• Telore Jagruti Kishore</w:t>
         <w:tab/>
         <w:tab/>
+        <w:t>• Tumma Varsha Chandraprakash</w:t>
+        <w:br/>
+        <w:t>• Vichare Sanika Sanjay</w:t>
         <w:tab/>
-        <w:t>Head of Department (HOD)</w:t>
-      </w:r>
-    </w:p>
-    <w:p>
-      <w:pPr>
-        <w:spacing w:before="480" w:after="160"/>
-      </w:pPr>
-      <w:r>
-        <w:rPr>
-          <w:b/>
-          <w:color w:val="1E3A8A"/>
-          <w:sz w:val="26"/>
-        </w:rPr>
-        <w:t>ACKNOWLEDGEMENT</w:t>
-      </w:r>
-    </w:p>
-    <w:p>
-      <w:r>
-        <w:t>We express our sincere gratitude to our Project Guide and faculty members for their constant encouragement, insightful advice, and constructive feedback throughout the design, development, and deployment of CareerGraph. We are also thankful to our institution for providing the infrastructure, computing resources, and academic environment necessary to carry out this full-stack engineering project.</w:t>
+        <w:tab/>
+        <w:t>• Waychal Sanyukta Amol</w:t>
       </w:r>
     </w:p>
     <w:p>
@@ -513,7 +446,7 @@
     </w:p>
     <w:p>
       <w:r>
-        <w:t>To solve these challenges, we designed and implemented CareerGraph, an interactive full-stack web application built with Vue 3, Node.js, Express, and MongoDB Atlas. CareerGraph introduces four core innovations: (1) a 5-tier learning hierarchy (Career Track → Skill → Course → Level/Module → Lesson), (2) a topological prerequisite locking engine that organizes learning into Foundations, Core Stack, and Advanced phases, (3) universal cross-track skill progress reflection, ensuring that foundational skills (e.g., Git or Python) mastered in one track automatically credit towards other tracks, and (4) a server-side Proof-of-Skill validation quiz engine that unlocks a verified badge upon passing.</w:t>
+        <w:t>To solve these challenges, Group No. 06 developed Career Graph, an interactive full-stack web application built with Vue 3, Node.js, Express, and MongoDB Atlas. Career Graph introduces four core innovations: (1) a 5-tier learning hierarchy (Career Track → Skill → Course → Level/Module → Lesson), (2) a topological prerequisite locking engine that organizes learning into Foundations, Core Stack, and Advanced phases, (3) universal cross-track skill progress reflection, ensuring that foundational skills (e.g., Git or Python) mastered in one track automatically credit towards other tracks, and (4) a server-side Proof-of-Skill validation quiz engine that unlocks a verified badge upon passing.</w:t>
       </w:r>
     </w:p>
     <w:p>
@@ -591,7 +524,7 @@
                 <w:color w:val="1E3A8A"/>
                 <w:sz w:val="19"/>
               </w:rPr>
-              <w:t>Certificate &amp; Acknowledgement</w:t>
+              <w:t>Acknowledgement</w:t>
             </w:r>
           </w:p>
         </w:tc>
@@ -3146,7 +3079,7 @@
     </w:p>
     <w:p>
       <w:r>
-        <w:t>Many students attempt to learn high-level frameworks like React or Docker before mastering fundamentals like HTML/CSS layout concepts, JavaScript event loops, or command-line Git operations. Skipping core fundamentals leads to conceptual confusion, fragile projects, and high abandonment rates. CareerGraph was developed to provide a structured, interactive guidance system that enforces foundational prerequisites before unlocking advanced topics.</w:t>
+        <w:t>Many students attempt to learn high-level frameworks like React or Docker before mastering fundamentals like HTML/CSS layout concepts, JavaScript event loops, or command-line Git operations. Skipping core fundamentals leads to conceptual confusion, fragile projects, and high abandonment rates. Career Graph was developed to provide a structured, interactive guidance system that enforces foundational prerequisites before unlocking advanced topics.</w:t>
       </w:r>
     </w:p>
     <w:p>
@@ -3260,7 +3193,7 @@
     </w:p>
     <w:p>
       <w:r>
-        <w:t>The primary objectives of CareerGraph are:</w:t>
+        <w:t>The primary objectives of Career Graph are:</w:t>
       </w:r>
     </w:p>
     <w:p>
@@ -3374,7 +3307,7 @@
     </w:p>
     <w:p>
       <w:r>
-        <w:t>CareerGraph focuses on major Computer Science and Information Technology career tracks: Full Stack Developer, DevOps Engineer, AI/ML Engineer, Frontend Developer, Backend Developer, and Data Analyst. The project includes complete onboarding questionnaires, dynamic graph generation, interactive checklists, server-side quiz evaluation, and live cloud deployment on Vercel and Render.</w:t>
+        <w:t>Career Graph focuses on major Computer Science and Information Technology career tracks: Full Stack Developer, DevOps Engineer, AI/ML Engineer, Frontend Developer, Backend Developer, and Data Analyst. The project includes complete onboarding questionnaires, dynamic graph generation, interactive checklists, server-side quiz evaluation, and live cloud deployment on Vercel and Render.</w:t>
       </w:r>
     </w:p>
     <w:p>
@@ -3429,7 +3362,7 @@
     </w:p>
     <w:p>
       <w:r>
-        <w:t>To establish the context of CareerGraph, we analyzed existing tools used by students and industry developers:</w:t>
+        <w:t>To establish the context of Career Graph, we analyzed existing tools used by students and industry developers:</w:t>
       </w:r>
     </w:p>
     <w:p>
@@ -3519,12 +3452,12 @@
           <w:color w:val="1E293B"/>
           <w:sz w:val="25"/>
         </w:rPr>
-        <w:t>2.3  Proposed CareerGraph Highlights</w:t>
+        <w:t>2.3  Proposed Career Graph Highlights</w:t>
       </w:r>
     </w:p>
     <w:p>
       <w:r>
-        <w:t>CareerGraph bridges the gap between static reference roadmaps and interactive learning portals. It introduces dynamic roadmap assembly, visual graph navigation, and server-side proof-of-skill validation.</w:t>
+        <w:t>Career Graph bridges the gap between static reference roadmaps and interactive learning portals. It introduces dynamic roadmap assembly, visual graph navigation, and server-side proof-of-skill validation.</w:t>
       </w:r>
     </w:p>
     <w:p>
@@ -3634,7 +3567,7 @@
           </w:tcPr>
           <w:p>
             <w:r>
-              <w:t>CareerGraph (Proposed)</w:t>
+              <w:t>Career Graph (Proposed)</w:t>
             </w:r>
           </w:p>
         </w:tc>
@@ -4548,7 +4481,7 @@
     </w:p>
     <w:p>
       <w:r>
-        <w:t>CareerGraph adopts a clean three-tier architecture to maintain separation of concerns, facilitate team collaboration, and allow independent deployment and scaling.</w:t>
+        <w:t>Career Graph adopts a clean three-tier architecture to maintain separation of concerns, facilitate team collaboration, and allow independent deployment and scaling.</w:t>
       </w:r>
     </w:p>
     <w:p>
@@ -4604,7 +4537,7 @@
           <w:color w:val="64748B"/>
           <w:sz w:val="17"/>
         </w:rPr>
-        <w:t>Figure 3.1: Three-Tier System Architecture of CareerGraph</w:t>
+        <w:t>Figure 3.1: Three-Tier System Architecture of Career Graph</w:t>
       </w:r>
     </w:p>
     <w:p>
@@ -5640,7 +5573,7 @@
     </w:p>
     <w:p>
       <w:r>
-        <w:t>To provide credible proof that a student has mastered a subject, CareerGraph incorporates an integrated validation quiz engine (quizController.js):</w:t>
+        <w:t>To provide credible proof that a student has mastered a subject, Career Graph incorporates an integrated validation quiz engine (quizController.js):</w:t>
       </w:r>
     </w:p>
     <w:p>
@@ -7362,7 +7295,7 @@
     </w:p>
     <w:p>
       <w:r>
-        <w:t>CareerGraph successfully addresses the challenges of unstructured and fragmented IT education. By implementing a 5-tier learning hierarchy and a topological prerequisite locking engine, the platform ensures that students master foundational skills before venturing into advanced production technologies. The inclusion of universal cross-track skill sharing prevents redundant work, while server-graded Proof-of-Skill micro-quizzes provide genuine validation of student capabilities.</w:t>
+        <w:t>Career Graph successfully addresses the challenges of unstructured and fragmented IT education. By implementing a 5-tier learning hierarchy and a topological prerequisite locking engine, the platform ensures that students master foundational skills before venturing into advanced production technologies. The inclusion of universal cross-track skill sharing prevents redundant work, while server-graded Proof-of-Skill micro-quizzes provide genuine validation of student capabilities.</w:t>
       </w:r>
     </w:p>
     <w:p>
@@ -7386,7 +7319,7 @@
     </w:p>
     <w:p>
       <w:r>
-        <w:t>Potential future directions to expand CareerGraph include:</w:t>
+        <w:t>Potential future directions to expand Career Graph include:</w:t>
       </w:r>
     </w:p>
     <w:p>
@@ -7606,7 +7539,7 @@
         <w:color w:val="64748B"/>
         <w:sz w:val="17"/>
       </w:rPr>
-      <w:t>CareerGraph — Project Report</w:t>
+      <w:t>Career Graph — Project Report</w:t>
     </w:r>
   </w:p>
 </w:hdr>

</xml_diff>

<commit_message>
docs: align table of contents page numbers with rendered document pages
</commit_message>
<xml_diff>
--- a/CareerGraph_Project_Report.docx
+++ b/CareerGraph_Project_Report.docx
@@ -461,14 +461,14 @@
     </w:p>
     <w:p>
       <w:pPr>
-        <w:spacing w:before="320" w:after="280"/>
+        <w:spacing w:before="160" w:after="120"/>
         <w:jc w:val="center"/>
       </w:pPr>
       <w:r>
         <w:rPr>
           <w:b/>
           <w:color w:val="1E3A8A"/>
-          <w:sz w:val="32"/>
+          <w:sz w:val="28"/>
         </w:rPr>
         <w:t>TABLE OF CONTENTS</w:t>
       </w:r>
@@ -497,7 +497,7 @@
         </w:trPr>
         <w:tc>
           <w:tcPr>
-            <w:tcW w:type="dxa" w:w="7632"/>
+            <w:tcW w:type="dxa" w:w="7920"/>
             <w:vAlign w:val="center"/>
             <w:tcMar>
               <w:top w:w="100" w:type="dxa"/>
@@ -507,22 +507,22 @@
             </w:tcMar>
             <w:shd w:fill="F8FAFC"/>
             <w:tcMar>
-              <w:top w:w="30" w:type="dxa"/>
-              <w:bottom w:w="30" w:type="dxa"/>
-              <w:left w:w="60" w:type="dxa"/>
-              <w:right w:w="60" w:type="dxa"/>
+              <w:top w:w="10" w:type="dxa"/>
+              <w:bottom w:w="10" w:type="dxa"/>
+              <w:left w:w="40" w:type="dxa"/>
+              <w:right w:w="40" w:type="dxa"/>
             </w:tcMar>
             <w:shd w:fill="FFFFFF"/>
           </w:tcPr>
           <w:p>
             <w:pPr>
-              <w:spacing w:before="20" w:after="20"/>
+              <w:spacing w:before="0" w:after="20"/>
             </w:pPr>
             <w:r>
               <w:rPr>
                 <w:b/>
                 <w:color w:val="1E3A8A"/>
-                <w:sz w:val="19"/>
+                <w:sz w:val="17"/>
               </w:rPr>
               <w:t>Acknowledgement</w:t>
             </w:r>
@@ -530,7 +530,7 @@
         </w:tc>
         <w:tc>
           <w:tcPr>
-            <w:tcW w:type="dxa" w:w="1728"/>
+            <w:tcW w:type="dxa" w:w="1440"/>
             <w:vAlign w:val="center"/>
             <w:tcMar>
               <w:top w:w="100" w:type="dxa"/>
@@ -540,374 +540,22 @@
             </w:tcMar>
             <w:shd w:fill="F8FAFC"/>
             <w:tcMar>
-              <w:top w:w="30" w:type="dxa"/>
-              <w:bottom w:w="30" w:type="dxa"/>
-              <w:left w:w="60" w:type="dxa"/>
-              <w:right w:w="60" w:type="dxa"/>
+              <w:top w:w="10" w:type="dxa"/>
+              <w:bottom w:w="10" w:type="dxa"/>
+              <w:left w:w="40" w:type="dxa"/>
+              <w:right w:w="40" w:type="dxa"/>
             </w:tcMar>
             <w:shd w:fill="FFFFFF"/>
           </w:tcPr>
           <w:p>
             <w:pPr>
-              <w:spacing w:before="20" w:after="20"/>
+              <w:spacing w:before="0" w:after="20"/>
               <w:jc w:val="right"/>
             </w:pPr>
             <w:r>
               <w:rPr>
                 <w:color w:val="64748B"/>
-                <w:sz w:val="19"/>
-              </w:rPr>
-              <w:t>ii</w:t>
-            </w:r>
-          </w:p>
-        </w:tc>
-      </w:tr>
-      <w:tr>
-        <w:trPr>
-          <w:cantSplit/>
-        </w:trPr>
-        <w:tc>
-          <w:tcPr>
-            <w:tcW w:type="dxa" w:w="7632"/>
-            <w:vAlign w:val="center"/>
-            <w:tcMar>
-              <w:top w:w="100" w:type="dxa"/>
-              <w:bottom w:w="100" w:type="dxa"/>
-              <w:left w:w="140" w:type="dxa"/>
-              <w:right w:w="140" w:type="dxa"/>
-            </w:tcMar>
-            <w:shd w:fill="FFFFFF"/>
-            <w:tcMar>
-              <w:top w:w="30" w:type="dxa"/>
-              <w:bottom w:w="30" w:type="dxa"/>
-              <w:left w:w="60" w:type="dxa"/>
-              <w:right w:w="60" w:type="dxa"/>
-            </w:tcMar>
-            <w:shd w:fill="FFFFFF"/>
-          </w:tcPr>
-          <w:p>
-            <w:pPr>
-              <w:spacing w:before="20" w:after="20"/>
-            </w:pPr>
-            <w:r>
-              <w:rPr>
-                <w:b/>
-                <w:color w:val="1E3A8A"/>
-                <w:sz w:val="19"/>
-              </w:rPr>
-              <w:t>Abstract</w:t>
-            </w:r>
-          </w:p>
-        </w:tc>
-        <w:tc>
-          <w:tcPr>
-            <w:tcW w:type="dxa" w:w="1728"/>
-            <w:vAlign w:val="center"/>
-            <w:tcMar>
-              <w:top w:w="100" w:type="dxa"/>
-              <w:bottom w:w="100" w:type="dxa"/>
-              <w:left w:w="140" w:type="dxa"/>
-              <w:right w:w="140" w:type="dxa"/>
-            </w:tcMar>
-            <w:shd w:fill="FFFFFF"/>
-            <w:tcMar>
-              <w:top w:w="30" w:type="dxa"/>
-              <w:bottom w:w="30" w:type="dxa"/>
-              <w:left w:w="60" w:type="dxa"/>
-              <w:right w:w="60" w:type="dxa"/>
-            </w:tcMar>
-            <w:shd w:fill="FFFFFF"/>
-          </w:tcPr>
-          <w:p>
-            <w:pPr>
-              <w:spacing w:before="20" w:after="20"/>
-              <w:jc w:val="right"/>
-            </w:pPr>
-            <w:r>
-              <w:rPr>
-                <w:color w:val="64748B"/>
-                <w:sz w:val="19"/>
-              </w:rPr>
-              <w:t>iii</w:t>
-            </w:r>
-          </w:p>
-        </w:tc>
-      </w:tr>
-      <w:tr>
-        <w:trPr>
-          <w:cantSplit/>
-        </w:trPr>
-        <w:tc>
-          <w:tcPr>
-            <w:tcW w:type="dxa" w:w="7632"/>
-            <w:vAlign w:val="center"/>
-            <w:tcMar>
-              <w:top w:w="100" w:type="dxa"/>
-              <w:bottom w:w="100" w:type="dxa"/>
-              <w:left w:w="140" w:type="dxa"/>
-              <w:right w:w="140" w:type="dxa"/>
-            </w:tcMar>
-            <w:shd w:fill="F8FAFC"/>
-            <w:tcMar>
-              <w:top w:w="30" w:type="dxa"/>
-              <w:bottom w:w="30" w:type="dxa"/>
-              <w:left w:w="60" w:type="dxa"/>
-              <w:right w:w="60" w:type="dxa"/>
-            </w:tcMar>
-            <w:shd w:fill="FFFFFF"/>
-          </w:tcPr>
-          <w:p>
-            <w:pPr>
-              <w:spacing w:before="20" w:after="20"/>
-            </w:pPr>
-            <w:r>
-              <w:rPr>
-                <w:b/>
-                <w:color w:val="1E3A8A"/>
-                <w:sz w:val="19"/>
-              </w:rPr>
-              <w:t>Chapter 1: Introduction</w:t>
-            </w:r>
-          </w:p>
-        </w:tc>
-        <w:tc>
-          <w:tcPr>
-            <w:tcW w:type="dxa" w:w="1728"/>
-            <w:vAlign w:val="center"/>
-            <w:tcMar>
-              <w:top w:w="100" w:type="dxa"/>
-              <w:bottom w:w="100" w:type="dxa"/>
-              <w:left w:w="140" w:type="dxa"/>
-              <w:right w:w="140" w:type="dxa"/>
-            </w:tcMar>
-            <w:shd w:fill="F8FAFC"/>
-            <w:tcMar>
-              <w:top w:w="30" w:type="dxa"/>
-              <w:bottom w:w="30" w:type="dxa"/>
-              <w:left w:w="60" w:type="dxa"/>
-              <w:right w:w="60" w:type="dxa"/>
-            </w:tcMar>
-            <w:shd w:fill="FFFFFF"/>
-          </w:tcPr>
-          <w:p>
-            <w:pPr>
-              <w:spacing w:before="20" w:after="20"/>
-              <w:jc w:val="right"/>
-            </w:pPr>
-            <w:r>
-              <w:rPr>
-                <w:color w:val="64748B"/>
-                <w:sz w:val="19"/>
-              </w:rPr>
-              <w:t>1</w:t>
-            </w:r>
-          </w:p>
-        </w:tc>
-      </w:tr>
-      <w:tr>
-        <w:trPr>
-          <w:cantSplit/>
-        </w:trPr>
-        <w:tc>
-          <w:tcPr>
-            <w:tcW w:type="dxa" w:w="7632"/>
-            <w:vAlign w:val="center"/>
-            <w:tcMar>
-              <w:top w:w="100" w:type="dxa"/>
-              <w:bottom w:w="100" w:type="dxa"/>
-              <w:left w:w="140" w:type="dxa"/>
-              <w:right w:w="140" w:type="dxa"/>
-            </w:tcMar>
-            <w:shd w:fill="FFFFFF"/>
-            <w:tcMar>
-              <w:top w:w="30" w:type="dxa"/>
-              <w:bottom w:w="30" w:type="dxa"/>
-              <w:left w:w="60" w:type="dxa"/>
-              <w:right w:w="60" w:type="dxa"/>
-            </w:tcMar>
-            <w:shd w:fill="FFFFFF"/>
-          </w:tcPr>
-          <w:p>
-            <w:pPr>
-              <w:spacing w:before="20" w:after="20"/>
-            </w:pPr>
-            <w:r>
-              <w:rPr>
-                <w:color w:val="1E293B"/>
-                <w:sz w:val="19"/>
-              </w:rPr>
-              <w:t xml:space="preserve">    1.1 Background &amp; Motivation</w:t>
-            </w:r>
-          </w:p>
-        </w:tc>
-        <w:tc>
-          <w:tcPr>
-            <w:tcW w:type="dxa" w:w="1728"/>
-            <w:vAlign w:val="center"/>
-            <w:tcMar>
-              <w:top w:w="100" w:type="dxa"/>
-              <w:bottom w:w="100" w:type="dxa"/>
-              <w:left w:w="140" w:type="dxa"/>
-              <w:right w:w="140" w:type="dxa"/>
-            </w:tcMar>
-            <w:shd w:fill="FFFFFF"/>
-            <w:tcMar>
-              <w:top w:w="30" w:type="dxa"/>
-              <w:bottom w:w="30" w:type="dxa"/>
-              <w:left w:w="60" w:type="dxa"/>
-              <w:right w:w="60" w:type="dxa"/>
-            </w:tcMar>
-            <w:shd w:fill="FFFFFF"/>
-          </w:tcPr>
-          <w:p>
-            <w:pPr>
-              <w:spacing w:before="20" w:after="20"/>
-              <w:jc w:val="right"/>
-            </w:pPr>
-            <w:r>
-              <w:rPr>
-                <w:color w:val="64748B"/>
-                <w:sz w:val="19"/>
-              </w:rPr>
-              <w:t>1</w:t>
-            </w:r>
-          </w:p>
-        </w:tc>
-      </w:tr>
-      <w:tr>
-        <w:trPr>
-          <w:cantSplit/>
-        </w:trPr>
-        <w:tc>
-          <w:tcPr>
-            <w:tcW w:type="dxa" w:w="7632"/>
-            <w:vAlign w:val="center"/>
-            <w:tcMar>
-              <w:top w:w="100" w:type="dxa"/>
-              <w:bottom w:w="100" w:type="dxa"/>
-              <w:left w:w="140" w:type="dxa"/>
-              <w:right w:w="140" w:type="dxa"/>
-            </w:tcMar>
-            <w:shd w:fill="F8FAFC"/>
-            <w:tcMar>
-              <w:top w:w="30" w:type="dxa"/>
-              <w:bottom w:w="30" w:type="dxa"/>
-              <w:left w:w="60" w:type="dxa"/>
-              <w:right w:w="60" w:type="dxa"/>
-            </w:tcMar>
-            <w:shd w:fill="FFFFFF"/>
-          </w:tcPr>
-          <w:p>
-            <w:pPr>
-              <w:spacing w:before="20" w:after="20"/>
-            </w:pPr>
-            <w:r>
-              <w:rPr>
-                <w:color w:val="1E293B"/>
-                <w:sz w:val="19"/>
-              </w:rPr>
-              <w:t xml:space="preserve">    1.2 Problem Statement</w:t>
-            </w:r>
-          </w:p>
-        </w:tc>
-        <w:tc>
-          <w:tcPr>
-            <w:tcW w:type="dxa" w:w="1728"/>
-            <w:vAlign w:val="center"/>
-            <w:tcMar>
-              <w:top w:w="100" w:type="dxa"/>
-              <w:bottom w:w="100" w:type="dxa"/>
-              <w:left w:w="140" w:type="dxa"/>
-              <w:right w:w="140" w:type="dxa"/>
-            </w:tcMar>
-            <w:shd w:fill="F8FAFC"/>
-            <w:tcMar>
-              <w:top w:w="30" w:type="dxa"/>
-              <w:bottom w:w="30" w:type="dxa"/>
-              <w:left w:w="60" w:type="dxa"/>
-              <w:right w:w="60" w:type="dxa"/>
-            </w:tcMar>
-            <w:shd w:fill="FFFFFF"/>
-          </w:tcPr>
-          <w:p>
-            <w:pPr>
-              <w:spacing w:before="20" w:after="20"/>
-              <w:jc w:val="right"/>
-            </w:pPr>
-            <w:r>
-              <w:rPr>
-                <w:color w:val="64748B"/>
-                <w:sz w:val="19"/>
-              </w:rPr>
-              <w:t>1</w:t>
-            </w:r>
-          </w:p>
-        </w:tc>
-      </w:tr>
-      <w:tr>
-        <w:trPr>
-          <w:cantSplit/>
-        </w:trPr>
-        <w:tc>
-          <w:tcPr>
-            <w:tcW w:type="dxa" w:w="7632"/>
-            <w:vAlign w:val="center"/>
-            <w:tcMar>
-              <w:top w:w="100" w:type="dxa"/>
-              <w:bottom w:w="100" w:type="dxa"/>
-              <w:left w:w="140" w:type="dxa"/>
-              <w:right w:w="140" w:type="dxa"/>
-            </w:tcMar>
-            <w:shd w:fill="FFFFFF"/>
-            <w:tcMar>
-              <w:top w:w="30" w:type="dxa"/>
-              <w:bottom w:w="30" w:type="dxa"/>
-              <w:left w:w="60" w:type="dxa"/>
-              <w:right w:w="60" w:type="dxa"/>
-            </w:tcMar>
-            <w:shd w:fill="FFFFFF"/>
-          </w:tcPr>
-          <w:p>
-            <w:pPr>
-              <w:spacing w:before="20" w:after="20"/>
-            </w:pPr>
-            <w:r>
-              <w:rPr>
-                <w:color w:val="1E293B"/>
-                <w:sz w:val="19"/>
-              </w:rPr>
-              <w:t xml:space="preserve">    1.3 Project Objectives</w:t>
-            </w:r>
-          </w:p>
-        </w:tc>
-        <w:tc>
-          <w:tcPr>
-            <w:tcW w:type="dxa" w:w="1728"/>
-            <w:vAlign w:val="center"/>
-            <w:tcMar>
-              <w:top w:w="100" w:type="dxa"/>
-              <w:bottom w:w="100" w:type="dxa"/>
-              <w:left w:w="140" w:type="dxa"/>
-              <w:right w:w="140" w:type="dxa"/>
-            </w:tcMar>
-            <w:shd w:fill="FFFFFF"/>
-            <w:tcMar>
-              <w:top w:w="30" w:type="dxa"/>
-              <w:bottom w:w="30" w:type="dxa"/>
-              <w:left w:w="60" w:type="dxa"/>
-              <w:right w:w="60" w:type="dxa"/>
-            </w:tcMar>
-            <w:shd w:fill="FFFFFF"/>
-          </w:tcPr>
-          <w:p>
-            <w:pPr>
-              <w:spacing w:before="20" w:after="20"/>
-              <w:jc w:val="right"/>
-            </w:pPr>
-            <w:r>
-              <w:rPr>
-                <w:color w:val="64748B"/>
-                <w:sz w:val="19"/>
+                <w:sz w:val="17"/>
               </w:rPr>
               <w:t>2</w:t>
             </w:r>
@@ -920,77 +568,7 @@
         </w:trPr>
         <w:tc>
           <w:tcPr>
-            <w:tcW w:type="dxa" w:w="7632"/>
-            <w:vAlign w:val="center"/>
-            <w:tcMar>
-              <w:top w:w="100" w:type="dxa"/>
-              <w:bottom w:w="100" w:type="dxa"/>
-              <w:left w:w="140" w:type="dxa"/>
-              <w:right w:w="140" w:type="dxa"/>
-            </w:tcMar>
-            <w:shd w:fill="F8FAFC"/>
-            <w:tcMar>
-              <w:top w:w="30" w:type="dxa"/>
-              <w:bottom w:w="30" w:type="dxa"/>
-              <w:left w:w="60" w:type="dxa"/>
-              <w:right w:w="60" w:type="dxa"/>
-            </w:tcMar>
-            <w:shd w:fill="FFFFFF"/>
-          </w:tcPr>
-          <w:p>
-            <w:pPr>
-              <w:spacing w:before="20" w:after="20"/>
-            </w:pPr>
-            <w:r>
-              <w:rPr>
-                <w:color w:val="1E293B"/>
-                <w:sz w:val="19"/>
-              </w:rPr>
-              <w:t xml:space="preserve">    1.4 Scope of the Project</w:t>
-            </w:r>
-          </w:p>
-        </w:tc>
-        <w:tc>
-          <w:tcPr>
-            <w:tcW w:type="dxa" w:w="1728"/>
-            <w:vAlign w:val="center"/>
-            <w:tcMar>
-              <w:top w:w="100" w:type="dxa"/>
-              <w:bottom w:w="100" w:type="dxa"/>
-              <w:left w:w="140" w:type="dxa"/>
-              <w:right w:w="140" w:type="dxa"/>
-            </w:tcMar>
-            <w:shd w:fill="F8FAFC"/>
-            <w:tcMar>
-              <w:top w:w="30" w:type="dxa"/>
-              <w:bottom w:w="30" w:type="dxa"/>
-              <w:left w:w="60" w:type="dxa"/>
-              <w:right w:w="60" w:type="dxa"/>
-            </w:tcMar>
-            <w:shd w:fill="FFFFFF"/>
-          </w:tcPr>
-          <w:p>
-            <w:pPr>
-              <w:spacing w:before="20" w:after="20"/>
-              <w:jc w:val="right"/>
-            </w:pPr>
-            <w:r>
-              <w:rPr>
-                <w:color w:val="64748B"/>
-                <w:sz w:val="19"/>
-              </w:rPr>
-              <w:t>2</w:t>
-            </w:r>
-          </w:p>
-        </w:tc>
-      </w:tr>
-      <w:tr>
-        <w:trPr>
-          <w:cantSplit/>
-        </w:trPr>
-        <w:tc>
-          <w:tcPr>
-            <w:tcW w:type="dxa" w:w="7632"/>
+            <w:tcW w:type="dxa" w:w="7920"/>
             <w:vAlign w:val="center"/>
             <w:tcMar>
               <w:top w:w="100" w:type="dxa"/>
@@ -1000,30 +578,30 @@
             </w:tcMar>
             <w:shd w:fill="FFFFFF"/>
             <w:tcMar>
-              <w:top w:w="30" w:type="dxa"/>
-              <w:bottom w:w="30" w:type="dxa"/>
-              <w:left w:w="60" w:type="dxa"/>
-              <w:right w:w="60" w:type="dxa"/>
+              <w:top w:w="10" w:type="dxa"/>
+              <w:bottom w:w="10" w:type="dxa"/>
+              <w:left w:w="40" w:type="dxa"/>
+              <w:right w:w="40" w:type="dxa"/>
             </w:tcMar>
             <w:shd w:fill="FFFFFF"/>
           </w:tcPr>
           <w:p>
             <w:pPr>
-              <w:spacing w:before="20" w:after="20"/>
+              <w:spacing w:before="0" w:after="20"/>
             </w:pPr>
             <w:r>
               <w:rPr>
                 <w:b/>
                 <w:color w:val="1E3A8A"/>
-                <w:sz w:val="19"/>
+                <w:sz w:val="17"/>
               </w:rPr>
-              <w:t>Chapter 2: Literature Survey &amp; Existing System Analysis</w:t>
+              <w:t>Abstract</w:t>
             </w:r>
           </w:p>
         </w:tc>
         <w:tc>
           <w:tcPr>
-            <w:tcW w:type="dxa" w:w="1728"/>
+            <w:tcW w:type="dxa" w:w="1440"/>
             <w:vAlign w:val="center"/>
             <w:tcMar>
               <w:top w:w="100" w:type="dxa"/>
@@ -1033,22 +611,22 @@
             </w:tcMar>
             <w:shd w:fill="FFFFFF"/>
             <w:tcMar>
-              <w:top w:w="30" w:type="dxa"/>
-              <w:bottom w:w="30" w:type="dxa"/>
-              <w:left w:w="60" w:type="dxa"/>
-              <w:right w:w="60" w:type="dxa"/>
+              <w:top w:w="10" w:type="dxa"/>
+              <w:bottom w:w="10" w:type="dxa"/>
+              <w:left w:w="40" w:type="dxa"/>
+              <w:right w:w="40" w:type="dxa"/>
             </w:tcMar>
             <w:shd w:fill="FFFFFF"/>
           </w:tcPr>
           <w:p>
             <w:pPr>
-              <w:spacing w:before="20" w:after="20"/>
+              <w:spacing w:before="0" w:after="20"/>
               <w:jc w:val="right"/>
             </w:pPr>
             <w:r>
               <w:rPr>
                 <w:color w:val="64748B"/>
-                <w:sz w:val="19"/>
+                <w:sz w:val="17"/>
               </w:rPr>
               <w:t>3</w:t>
             </w:r>
@@ -1061,7 +639,7 @@
         </w:trPr>
         <w:tc>
           <w:tcPr>
-            <w:tcW w:type="dxa" w:w="7632"/>
+            <w:tcW w:type="dxa" w:w="7920"/>
             <w:vAlign w:val="center"/>
             <w:tcMar>
               <w:top w:w="100" w:type="dxa"/>
@@ -1071,29 +649,30 @@
             </w:tcMar>
             <w:shd w:fill="F8FAFC"/>
             <w:tcMar>
-              <w:top w:w="30" w:type="dxa"/>
-              <w:bottom w:w="30" w:type="dxa"/>
-              <w:left w:w="60" w:type="dxa"/>
-              <w:right w:w="60" w:type="dxa"/>
+              <w:top w:w="10" w:type="dxa"/>
+              <w:bottom w:w="10" w:type="dxa"/>
+              <w:left w:w="40" w:type="dxa"/>
+              <w:right w:w="40" w:type="dxa"/>
             </w:tcMar>
             <w:shd w:fill="FFFFFF"/>
           </w:tcPr>
           <w:p>
             <w:pPr>
-              <w:spacing w:before="20" w:after="20"/>
+              <w:spacing w:before="0" w:after="20"/>
             </w:pPr>
             <w:r>
               <w:rPr>
-                <w:color w:val="1E293B"/>
-                <w:sz w:val="19"/>
+                <w:b/>
+                <w:color w:val="1E3A8A"/>
+                <w:sz w:val="17"/>
               </w:rPr>
-              <w:t xml:space="preserve">    2.1 Review of Existing Platforms</w:t>
+              <w:t>Chapter 1: Introduction</w:t>
             </w:r>
           </w:p>
         </w:tc>
         <w:tc>
           <w:tcPr>
-            <w:tcW w:type="dxa" w:w="1728"/>
+            <w:tcW w:type="dxa" w:w="1440"/>
             <w:vAlign w:val="center"/>
             <w:tcMar>
               <w:top w:w="100" w:type="dxa"/>
@@ -1103,303 +682,22 @@
             </w:tcMar>
             <w:shd w:fill="F8FAFC"/>
             <w:tcMar>
-              <w:top w:w="30" w:type="dxa"/>
-              <w:bottom w:w="30" w:type="dxa"/>
-              <w:left w:w="60" w:type="dxa"/>
-              <w:right w:w="60" w:type="dxa"/>
+              <w:top w:w="10" w:type="dxa"/>
+              <w:bottom w:w="10" w:type="dxa"/>
+              <w:left w:w="40" w:type="dxa"/>
+              <w:right w:w="40" w:type="dxa"/>
             </w:tcMar>
             <w:shd w:fill="FFFFFF"/>
           </w:tcPr>
           <w:p>
             <w:pPr>
-              <w:spacing w:before="20" w:after="20"/>
+              <w:spacing w:before="0" w:after="20"/>
               <w:jc w:val="right"/>
             </w:pPr>
             <w:r>
               <w:rPr>
                 <w:color w:val="64748B"/>
-                <w:sz w:val="19"/>
-              </w:rPr>
-              <w:t>3</w:t>
-            </w:r>
-          </w:p>
-        </w:tc>
-      </w:tr>
-      <w:tr>
-        <w:trPr>
-          <w:cantSplit/>
-        </w:trPr>
-        <w:tc>
-          <w:tcPr>
-            <w:tcW w:type="dxa" w:w="7632"/>
-            <w:vAlign w:val="center"/>
-            <w:tcMar>
-              <w:top w:w="100" w:type="dxa"/>
-              <w:bottom w:w="100" w:type="dxa"/>
-              <w:left w:w="140" w:type="dxa"/>
-              <w:right w:w="140" w:type="dxa"/>
-            </w:tcMar>
-            <w:shd w:fill="FFFFFF"/>
-            <w:tcMar>
-              <w:top w:w="30" w:type="dxa"/>
-              <w:bottom w:w="30" w:type="dxa"/>
-              <w:left w:w="60" w:type="dxa"/>
-              <w:right w:w="60" w:type="dxa"/>
-            </w:tcMar>
-            <w:shd w:fill="FFFFFF"/>
-          </w:tcPr>
-          <w:p>
-            <w:pPr>
-              <w:spacing w:before="20" w:after="20"/>
-            </w:pPr>
-            <w:r>
-              <w:rPr>
-                <w:color w:val="1E293B"/>
-                <w:sz w:val="19"/>
-              </w:rPr>
-              <w:t xml:space="preserve">    2.2 Drawbacks of Current Systems</w:t>
-            </w:r>
-          </w:p>
-        </w:tc>
-        <w:tc>
-          <w:tcPr>
-            <w:tcW w:type="dxa" w:w="1728"/>
-            <w:vAlign w:val="center"/>
-            <w:tcMar>
-              <w:top w:w="100" w:type="dxa"/>
-              <w:bottom w:w="100" w:type="dxa"/>
-              <w:left w:w="140" w:type="dxa"/>
-              <w:right w:w="140" w:type="dxa"/>
-            </w:tcMar>
-            <w:shd w:fill="FFFFFF"/>
-            <w:tcMar>
-              <w:top w:w="30" w:type="dxa"/>
-              <w:bottom w:w="30" w:type="dxa"/>
-              <w:left w:w="60" w:type="dxa"/>
-              <w:right w:w="60" w:type="dxa"/>
-            </w:tcMar>
-            <w:shd w:fill="FFFFFF"/>
-          </w:tcPr>
-          <w:p>
-            <w:pPr>
-              <w:spacing w:before="20" w:after="20"/>
-              <w:jc w:val="right"/>
-            </w:pPr>
-            <w:r>
-              <w:rPr>
-                <w:color w:val="64748B"/>
-                <w:sz w:val="19"/>
-              </w:rPr>
-              <w:t>3</w:t>
-            </w:r>
-          </w:p>
-        </w:tc>
-      </w:tr>
-      <w:tr>
-        <w:trPr>
-          <w:cantSplit/>
-        </w:trPr>
-        <w:tc>
-          <w:tcPr>
-            <w:tcW w:type="dxa" w:w="7632"/>
-            <w:vAlign w:val="center"/>
-            <w:tcMar>
-              <w:top w:w="100" w:type="dxa"/>
-              <w:bottom w:w="100" w:type="dxa"/>
-              <w:left w:w="140" w:type="dxa"/>
-              <w:right w:w="140" w:type="dxa"/>
-            </w:tcMar>
-            <w:shd w:fill="F8FAFC"/>
-            <w:tcMar>
-              <w:top w:w="30" w:type="dxa"/>
-              <w:bottom w:w="30" w:type="dxa"/>
-              <w:left w:w="60" w:type="dxa"/>
-              <w:right w:w="60" w:type="dxa"/>
-            </w:tcMar>
-            <w:shd w:fill="FFFFFF"/>
-          </w:tcPr>
-          <w:p>
-            <w:pPr>
-              <w:spacing w:before="20" w:after="20"/>
-            </w:pPr>
-            <w:r>
-              <w:rPr>
-                <w:color w:val="1E293B"/>
-                <w:sz w:val="19"/>
-              </w:rPr>
-              <w:t xml:space="preserve">    2.3 Proposed System Highlights</w:t>
-            </w:r>
-          </w:p>
-        </w:tc>
-        <w:tc>
-          <w:tcPr>
-            <w:tcW w:type="dxa" w:w="1728"/>
-            <w:vAlign w:val="center"/>
-            <w:tcMar>
-              <w:top w:w="100" w:type="dxa"/>
-              <w:bottom w:w="100" w:type="dxa"/>
-              <w:left w:w="140" w:type="dxa"/>
-              <w:right w:w="140" w:type="dxa"/>
-            </w:tcMar>
-            <w:shd w:fill="F8FAFC"/>
-            <w:tcMar>
-              <w:top w:w="30" w:type="dxa"/>
-              <w:bottom w:w="30" w:type="dxa"/>
-              <w:left w:w="60" w:type="dxa"/>
-              <w:right w:w="60" w:type="dxa"/>
-            </w:tcMar>
-            <w:shd w:fill="FFFFFF"/>
-          </w:tcPr>
-          <w:p>
-            <w:pPr>
-              <w:spacing w:before="20" w:after="20"/>
-              <w:jc w:val="right"/>
-            </w:pPr>
-            <w:r>
-              <w:rPr>
-                <w:color w:val="64748B"/>
-                <w:sz w:val="19"/>
-              </w:rPr>
-              <w:t>4</w:t>
-            </w:r>
-          </w:p>
-        </w:tc>
-      </w:tr>
-      <w:tr>
-        <w:trPr>
-          <w:cantSplit/>
-        </w:trPr>
-        <w:tc>
-          <w:tcPr>
-            <w:tcW w:type="dxa" w:w="7632"/>
-            <w:vAlign w:val="center"/>
-            <w:tcMar>
-              <w:top w:w="100" w:type="dxa"/>
-              <w:bottom w:w="100" w:type="dxa"/>
-              <w:left w:w="140" w:type="dxa"/>
-              <w:right w:w="140" w:type="dxa"/>
-            </w:tcMar>
-            <w:shd w:fill="FFFFFF"/>
-            <w:tcMar>
-              <w:top w:w="30" w:type="dxa"/>
-              <w:bottom w:w="30" w:type="dxa"/>
-              <w:left w:w="60" w:type="dxa"/>
-              <w:right w:w="60" w:type="dxa"/>
-            </w:tcMar>
-            <w:shd w:fill="FFFFFF"/>
-          </w:tcPr>
-          <w:p>
-            <w:pPr>
-              <w:spacing w:before="20" w:after="20"/>
-            </w:pPr>
-            <w:r>
-              <w:rPr>
-                <w:color w:val="1E293B"/>
-                <w:sz w:val="19"/>
-              </w:rPr>
-              <w:t xml:space="preserve">    2.4 Feature Comparison Table</w:t>
-            </w:r>
-          </w:p>
-        </w:tc>
-        <w:tc>
-          <w:tcPr>
-            <w:tcW w:type="dxa" w:w="1728"/>
-            <w:vAlign w:val="center"/>
-            <w:tcMar>
-              <w:top w:w="100" w:type="dxa"/>
-              <w:bottom w:w="100" w:type="dxa"/>
-              <w:left w:w="140" w:type="dxa"/>
-              <w:right w:w="140" w:type="dxa"/>
-            </w:tcMar>
-            <w:shd w:fill="FFFFFF"/>
-            <w:tcMar>
-              <w:top w:w="30" w:type="dxa"/>
-              <w:bottom w:w="30" w:type="dxa"/>
-              <w:left w:w="60" w:type="dxa"/>
-              <w:right w:w="60" w:type="dxa"/>
-            </w:tcMar>
-            <w:shd w:fill="FFFFFF"/>
-          </w:tcPr>
-          <w:p>
-            <w:pPr>
-              <w:spacing w:before="20" w:after="20"/>
-              <w:jc w:val="right"/>
-            </w:pPr>
-            <w:r>
-              <w:rPr>
-                <w:color w:val="64748B"/>
-                <w:sz w:val="19"/>
-              </w:rPr>
-              <w:t>4</w:t>
-            </w:r>
-          </w:p>
-        </w:tc>
-      </w:tr>
-      <w:tr>
-        <w:trPr>
-          <w:cantSplit/>
-        </w:trPr>
-        <w:tc>
-          <w:tcPr>
-            <w:tcW w:type="dxa" w:w="7632"/>
-            <w:vAlign w:val="center"/>
-            <w:tcMar>
-              <w:top w:w="100" w:type="dxa"/>
-              <w:bottom w:w="100" w:type="dxa"/>
-              <w:left w:w="140" w:type="dxa"/>
-              <w:right w:w="140" w:type="dxa"/>
-            </w:tcMar>
-            <w:shd w:fill="F8FAFC"/>
-            <w:tcMar>
-              <w:top w:w="30" w:type="dxa"/>
-              <w:bottom w:w="30" w:type="dxa"/>
-              <w:left w:w="60" w:type="dxa"/>
-              <w:right w:w="60" w:type="dxa"/>
-            </w:tcMar>
-            <w:shd w:fill="FFFFFF"/>
-          </w:tcPr>
-          <w:p>
-            <w:pPr>
-              <w:spacing w:before="20" w:after="20"/>
-            </w:pPr>
-            <w:r>
-              <w:rPr>
-                <w:b/>
-                <w:color w:val="1E3A8A"/>
-                <w:sz w:val="19"/>
-              </w:rPr>
-              <w:t>Chapter 3: System Requirements &amp; Architecture</w:t>
-            </w:r>
-          </w:p>
-        </w:tc>
-        <w:tc>
-          <w:tcPr>
-            <w:tcW w:type="dxa" w:w="1728"/>
-            <w:vAlign w:val="center"/>
-            <w:tcMar>
-              <w:top w:w="100" w:type="dxa"/>
-              <w:bottom w:w="100" w:type="dxa"/>
-              <w:left w:w="140" w:type="dxa"/>
-              <w:right w:w="140" w:type="dxa"/>
-            </w:tcMar>
-            <w:shd w:fill="F8FAFC"/>
-            <w:tcMar>
-              <w:top w:w="30" w:type="dxa"/>
-              <w:bottom w:w="30" w:type="dxa"/>
-              <w:left w:w="60" w:type="dxa"/>
-              <w:right w:w="60" w:type="dxa"/>
-            </w:tcMar>
-            <w:shd w:fill="FFFFFF"/>
-          </w:tcPr>
-          <w:p>
-            <w:pPr>
-              <w:spacing w:before="20" w:after="20"/>
-              <w:jc w:val="right"/>
-            </w:pPr>
-            <w:r>
-              <w:rPr>
-                <w:color w:val="64748B"/>
-                <w:sz w:val="19"/>
+                <w:sz w:val="17"/>
               </w:rPr>
               <w:t>5</w:t>
             </w:r>
@@ -1412,7 +710,7 @@
         </w:trPr>
         <w:tc>
           <w:tcPr>
-            <w:tcW w:type="dxa" w:w="7632"/>
+            <w:tcW w:type="dxa" w:w="7920"/>
             <w:vAlign w:val="center"/>
             <w:tcMar>
               <w:top w:w="100" w:type="dxa"/>
@@ -1422,29 +720,29 @@
             </w:tcMar>
             <w:shd w:fill="FFFFFF"/>
             <w:tcMar>
-              <w:top w:w="30" w:type="dxa"/>
-              <w:bottom w:w="30" w:type="dxa"/>
-              <w:left w:w="60" w:type="dxa"/>
-              <w:right w:w="60" w:type="dxa"/>
+              <w:top w:w="10" w:type="dxa"/>
+              <w:bottom w:w="10" w:type="dxa"/>
+              <w:left w:w="40" w:type="dxa"/>
+              <w:right w:w="40" w:type="dxa"/>
             </w:tcMar>
             <w:shd w:fill="FFFFFF"/>
           </w:tcPr>
           <w:p>
             <w:pPr>
-              <w:spacing w:before="20" w:after="20"/>
+              <w:spacing w:before="0" w:after="20"/>
             </w:pPr>
             <w:r>
               <w:rPr>
                 <w:color w:val="1E293B"/>
-                <w:sz w:val="19"/>
+                <w:sz w:val="17"/>
               </w:rPr>
-              <w:t xml:space="preserve">    3.1 Hardware and Software Requirements</w:t>
+              <w:t xml:space="preserve">    1.1 Background &amp; Motivation</w:t>
             </w:r>
           </w:p>
         </w:tc>
         <w:tc>
           <w:tcPr>
-            <w:tcW w:type="dxa" w:w="1728"/>
+            <w:tcW w:type="dxa" w:w="1440"/>
             <w:vAlign w:val="center"/>
             <w:tcMar>
               <w:top w:w="100" w:type="dxa"/>
@@ -1454,22 +752,22 @@
             </w:tcMar>
             <w:shd w:fill="FFFFFF"/>
             <w:tcMar>
-              <w:top w:w="30" w:type="dxa"/>
-              <w:bottom w:w="30" w:type="dxa"/>
-              <w:left w:w="60" w:type="dxa"/>
-              <w:right w:w="60" w:type="dxa"/>
+              <w:top w:w="10" w:type="dxa"/>
+              <w:bottom w:w="10" w:type="dxa"/>
+              <w:left w:w="40" w:type="dxa"/>
+              <w:right w:w="40" w:type="dxa"/>
             </w:tcMar>
             <w:shd w:fill="FFFFFF"/>
           </w:tcPr>
           <w:p>
             <w:pPr>
-              <w:spacing w:before="20" w:after="20"/>
+              <w:spacing w:before="0" w:after="20"/>
               <w:jc w:val="right"/>
             </w:pPr>
             <w:r>
               <w:rPr>
                 <w:color w:val="64748B"/>
-                <w:sz w:val="19"/>
+                <w:sz w:val="17"/>
               </w:rPr>
               <w:t>5</w:t>
             </w:r>
@@ -1482,7 +780,7 @@
         </w:trPr>
         <w:tc>
           <w:tcPr>
-            <w:tcW w:type="dxa" w:w="7632"/>
+            <w:tcW w:type="dxa" w:w="7920"/>
             <w:vAlign w:val="center"/>
             <w:tcMar>
               <w:top w:w="100" w:type="dxa"/>
@@ -1492,29 +790,29 @@
             </w:tcMar>
             <w:shd w:fill="F8FAFC"/>
             <w:tcMar>
-              <w:top w:w="30" w:type="dxa"/>
-              <w:bottom w:w="30" w:type="dxa"/>
-              <w:left w:w="60" w:type="dxa"/>
-              <w:right w:w="60" w:type="dxa"/>
+              <w:top w:w="10" w:type="dxa"/>
+              <w:bottom w:w="10" w:type="dxa"/>
+              <w:left w:w="40" w:type="dxa"/>
+              <w:right w:w="40" w:type="dxa"/>
             </w:tcMar>
             <w:shd w:fill="FFFFFF"/>
           </w:tcPr>
           <w:p>
             <w:pPr>
-              <w:spacing w:before="20" w:after="20"/>
+              <w:spacing w:before="0" w:after="20"/>
             </w:pPr>
             <w:r>
               <w:rPr>
                 <w:color w:val="1E293B"/>
-                <w:sz w:val="19"/>
+                <w:sz w:val="17"/>
               </w:rPr>
-              <w:t xml:space="preserve">    3.2 Three-Tier Decoupled Architecture</w:t>
+              <w:t xml:space="preserve">    1.2 Problem Statement</w:t>
             </w:r>
           </w:p>
         </w:tc>
         <w:tc>
           <w:tcPr>
-            <w:tcW w:type="dxa" w:w="1728"/>
+            <w:tcW w:type="dxa" w:w="1440"/>
             <w:vAlign w:val="center"/>
             <w:tcMar>
               <w:top w:w="100" w:type="dxa"/>
@@ -1524,22 +822,22 @@
             </w:tcMar>
             <w:shd w:fill="F8FAFC"/>
             <w:tcMar>
-              <w:top w:w="30" w:type="dxa"/>
-              <w:bottom w:w="30" w:type="dxa"/>
-              <w:left w:w="60" w:type="dxa"/>
-              <w:right w:w="60" w:type="dxa"/>
+              <w:top w:w="10" w:type="dxa"/>
+              <w:bottom w:w="10" w:type="dxa"/>
+              <w:left w:w="40" w:type="dxa"/>
+              <w:right w:w="40" w:type="dxa"/>
             </w:tcMar>
             <w:shd w:fill="FFFFFF"/>
           </w:tcPr>
           <w:p>
             <w:pPr>
-              <w:spacing w:before="20" w:after="20"/>
+              <w:spacing w:before="0" w:after="20"/>
               <w:jc w:val="right"/>
             </w:pPr>
             <w:r>
               <w:rPr>
                 <w:color w:val="64748B"/>
-                <w:sz w:val="19"/>
+                <w:sz w:val="17"/>
               </w:rPr>
               <w:t>5</w:t>
             </w:r>
@@ -1552,7 +850,7 @@
         </w:trPr>
         <w:tc>
           <w:tcPr>
-            <w:tcW w:type="dxa" w:w="7632"/>
+            <w:tcW w:type="dxa" w:w="7920"/>
             <w:vAlign w:val="center"/>
             <w:tcMar>
               <w:top w:w="100" w:type="dxa"/>
@@ -1562,29 +860,29 @@
             </w:tcMar>
             <w:shd w:fill="FFFFFF"/>
             <w:tcMar>
-              <w:top w:w="30" w:type="dxa"/>
-              <w:bottom w:w="30" w:type="dxa"/>
-              <w:left w:w="60" w:type="dxa"/>
-              <w:right w:w="60" w:type="dxa"/>
+              <w:top w:w="10" w:type="dxa"/>
+              <w:bottom w:w="10" w:type="dxa"/>
+              <w:left w:w="40" w:type="dxa"/>
+              <w:right w:w="40" w:type="dxa"/>
             </w:tcMar>
             <w:shd w:fill="FFFFFF"/>
           </w:tcPr>
           <w:p>
             <w:pPr>
-              <w:spacing w:before="20" w:after="20"/>
+              <w:spacing w:before="0" w:after="20"/>
             </w:pPr>
             <w:r>
               <w:rPr>
                 <w:color w:val="1E293B"/>
-                <w:sz w:val="19"/>
+                <w:sz w:val="17"/>
               </w:rPr>
-              <w:t xml:space="preserve">    3.3 Database Modeling &amp; Entity Relationship Diagram</w:t>
+              <w:t xml:space="preserve">    1.3 Project Objectives</w:t>
             </w:r>
           </w:p>
         </w:tc>
         <w:tc>
           <w:tcPr>
-            <w:tcW w:type="dxa" w:w="1728"/>
+            <w:tcW w:type="dxa" w:w="1440"/>
             <w:vAlign w:val="center"/>
             <w:tcMar>
               <w:top w:w="100" w:type="dxa"/>
@@ -1594,22 +892,163 @@
             </w:tcMar>
             <w:shd w:fill="FFFFFF"/>
             <w:tcMar>
-              <w:top w:w="30" w:type="dxa"/>
-              <w:bottom w:w="30" w:type="dxa"/>
-              <w:left w:w="60" w:type="dxa"/>
-              <w:right w:w="60" w:type="dxa"/>
+              <w:top w:w="10" w:type="dxa"/>
+              <w:bottom w:w="10" w:type="dxa"/>
+              <w:left w:w="40" w:type="dxa"/>
+              <w:right w:w="40" w:type="dxa"/>
             </w:tcMar>
             <w:shd w:fill="FFFFFF"/>
           </w:tcPr>
           <w:p>
             <w:pPr>
-              <w:spacing w:before="20" w:after="20"/>
+              <w:spacing w:before="0" w:after="20"/>
               <w:jc w:val="right"/>
             </w:pPr>
             <w:r>
               <w:rPr>
                 <w:color w:val="64748B"/>
-                <w:sz w:val="19"/>
+                <w:sz w:val="17"/>
+              </w:rPr>
+              <w:t>5</w:t>
+            </w:r>
+          </w:p>
+        </w:tc>
+      </w:tr>
+      <w:tr>
+        <w:trPr>
+          <w:cantSplit/>
+        </w:trPr>
+        <w:tc>
+          <w:tcPr>
+            <w:tcW w:type="dxa" w:w="7920"/>
+            <w:vAlign w:val="center"/>
+            <w:tcMar>
+              <w:top w:w="100" w:type="dxa"/>
+              <w:bottom w:w="100" w:type="dxa"/>
+              <w:left w:w="140" w:type="dxa"/>
+              <w:right w:w="140" w:type="dxa"/>
+            </w:tcMar>
+            <w:shd w:fill="F8FAFC"/>
+            <w:tcMar>
+              <w:top w:w="10" w:type="dxa"/>
+              <w:bottom w:w="10" w:type="dxa"/>
+              <w:left w:w="40" w:type="dxa"/>
+              <w:right w:w="40" w:type="dxa"/>
+            </w:tcMar>
+            <w:shd w:fill="FFFFFF"/>
+          </w:tcPr>
+          <w:p>
+            <w:pPr>
+              <w:spacing w:before="0" w:after="20"/>
+            </w:pPr>
+            <w:r>
+              <w:rPr>
+                <w:color w:val="1E293B"/>
+                <w:sz w:val="17"/>
+              </w:rPr>
+              <w:t xml:space="preserve">    1.4 Scope of the Project</w:t>
+            </w:r>
+          </w:p>
+        </w:tc>
+        <w:tc>
+          <w:tcPr>
+            <w:tcW w:type="dxa" w:w="1440"/>
+            <w:vAlign w:val="center"/>
+            <w:tcMar>
+              <w:top w:w="100" w:type="dxa"/>
+              <w:bottom w:w="100" w:type="dxa"/>
+              <w:left w:w="140" w:type="dxa"/>
+              <w:right w:w="140" w:type="dxa"/>
+            </w:tcMar>
+            <w:shd w:fill="F8FAFC"/>
+            <w:tcMar>
+              <w:top w:w="10" w:type="dxa"/>
+              <w:bottom w:w="10" w:type="dxa"/>
+              <w:left w:w="40" w:type="dxa"/>
+              <w:right w:w="40" w:type="dxa"/>
+            </w:tcMar>
+            <w:shd w:fill="FFFFFF"/>
+          </w:tcPr>
+          <w:p>
+            <w:pPr>
+              <w:spacing w:before="0" w:after="20"/>
+              <w:jc w:val="right"/>
+            </w:pPr>
+            <w:r>
+              <w:rPr>
+                <w:color w:val="64748B"/>
+                <w:sz w:val="17"/>
+              </w:rPr>
+              <w:t>6</w:t>
+            </w:r>
+          </w:p>
+        </w:tc>
+      </w:tr>
+      <w:tr>
+        <w:trPr>
+          <w:cantSplit/>
+        </w:trPr>
+        <w:tc>
+          <w:tcPr>
+            <w:tcW w:type="dxa" w:w="7920"/>
+            <w:vAlign w:val="center"/>
+            <w:tcMar>
+              <w:top w:w="100" w:type="dxa"/>
+              <w:bottom w:w="100" w:type="dxa"/>
+              <w:left w:w="140" w:type="dxa"/>
+              <w:right w:w="140" w:type="dxa"/>
+            </w:tcMar>
+            <w:shd w:fill="FFFFFF"/>
+            <w:tcMar>
+              <w:top w:w="10" w:type="dxa"/>
+              <w:bottom w:w="10" w:type="dxa"/>
+              <w:left w:w="40" w:type="dxa"/>
+              <w:right w:w="40" w:type="dxa"/>
+            </w:tcMar>
+            <w:shd w:fill="FFFFFF"/>
+          </w:tcPr>
+          <w:p>
+            <w:pPr>
+              <w:spacing w:before="0" w:after="20"/>
+            </w:pPr>
+            <w:r>
+              <w:rPr>
+                <w:b/>
+                <w:color w:val="1E3A8A"/>
+                <w:sz w:val="17"/>
+              </w:rPr>
+              <w:t>Chapter 2: Literature Survey &amp; Existing System Analysis</w:t>
+            </w:r>
+          </w:p>
+        </w:tc>
+        <w:tc>
+          <w:tcPr>
+            <w:tcW w:type="dxa" w:w="1440"/>
+            <w:vAlign w:val="center"/>
+            <w:tcMar>
+              <w:top w:w="100" w:type="dxa"/>
+              <w:bottom w:w="100" w:type="dxa"/>
+              <w:left w:w="140" w:type="dxa"/>
+              <w:right w:w="140" w:type="dxa"/>
+            </w:tcMar>
+            <w:shd w:fill="FFFFFF"/>
+            <w:tcMar>
+              <w:top w:w="10" w:type="dxa"/>
+              <w:bottom w:w="10" w:type="dxa"/>
+              <w:left w:w="40" w:type="dxa"/>
+              <w:right w:w="40" w:type="dxa"/>
+            </w:tcMar>
+            <w:shd w:fill="FFFFFF"/>
+          </w:tcPr>
+          <w:p>
+            <w:pPr>
+              <w:spacing w:before="0" w:after="20"/>
+              <w:jc w:val="right"/>
+            </w:pPr>
+            <w:r>
+              <w:rPr>
+                <w:color w:val="64748B"/>
+                <w:sz w:val="17"/>
               </w:rPr>
               <w:t>7</w:t>
             </w:r>
@@ -1622,7 +1061,7 @@
         </w:trPr>
         <w:tc>
           <w:tcPr>
-            <w:tcW w:type="dxa" w:w="7632"/>
+            <w:tcW w:type="dxa" w:w="7920"/>
             <w:vAlign w:val="center"/>
             <w:tcMar>
               <w:top w:w="100" w:type="dxa"/>
@@ -1632,29 +1071,29 @@
             </w:tcMar>
             <w:shd w:fill="F8FAFC"/>
             <w:tcMar>
-              <w:top w:w="30" w:type="dxa"/>
-              <w:bottom w:w="30" w:type="dxa"/>
-              <w:left w:w="60" w:type="dxa"/>
-              <w:right w:w="60" w:type="dxa"/>
+              <w:top w:w="10" w:type="dxa"/>
+              <w:bottom w:w="10" w:type="dxa"/>
+              <w:left w:w="40" w:type="dxa"/>
+              <w:right w:w="40" w:type="dxa"/>
             </w:tcMar>
             <w:shd w:fill="FFFFFF"/>
           </w:tcPr>
           <w:p>
             <w:pPr>
-              <w:spacing w:before="20" w:after="20"/>
+              <w:spacing w:before="0" w:after="20"/>
             </w:pPr>
             <w:r>
               <w:rPr>
                 <w:color w:val="1E293B"/>
-                <w:sz w:val="19"/>
+                <w:sz w:val="17"/>
               </w:rPr>
-              <w:t xml:space="preserve">    3.4 Database Collections Summary</w:t>
+              <w:t xml:space="preserve">    2.1 Review of Existing Platforms</w:t>
             </w:r>
           </w:p>
         </w:tc>
         <w:tc>
           <w:tcPr>
-            <w:tcW w:type="dxa" w:w="1728"/>
+            <w:tcW w:type="dxa" w:w="1440"/>
             <w:vAlign w:val="center"/>
             <w:tcMar>
               <w:top w:w="100" w:type="dxa"/>
@@ -1664,24 +1103,24 @@
             </w:tcMar>
             <w:shd w:fill="F8FAFC"/>
             <w:tcMar>
-              <w:top w:w="30" w:type="dxa"/>
-              <w:bottom w:w="30" w:type="dxa"/>
-              <w:left w:w="60" w:type="dxa"/>
-              <w:right w:w="60" w:type="dxa"/>
+              <w:top w:w="10" w:type="dxa"/>
+              <w:bottom w:w="10" w:type="dxa"/>
+              <w:left w:w="40" w:type="dxa"/>
+              <w:right w:w="40" w:type="dxa"/>
             </w:tcMar>
             <w:shd w:fill="FFFFFF"/>
           </w:tcPr>
           <w:p>
             <w:pPr>
-              <w:spacing w:before="20" w:after="20"/>
+              <w:spacing w:before="0" w:after="20"/>
               <w:jc w:val="right"/>
             </w:pPr>
             <w:r>
               <w:rPr>
                 <w:color w:val="64748B"/>
-                <w:sz w:val="19"/>
+                <w:sz w:val="17"/>
               </w:rPr>
-              <w:t>8</w:t>
+              <w:t>7</w:t>
             </w:r>
           </w:p>
         </w:tc>
@@ -1692,7 +1131,7 @@
         </w:trPr>
         <w:tc>
           <w:tcPr>
-            <w:tcW w:type="dxa" w:w="7632"/>
+            <w:tcW w:type="dxa" w:w="7920"/>
             <w:vAlign w:val="center"/>
             <w:tcMar>
               <w:top w:w="100" w:type="dxa"/>
@@ -1702,30 +1141,29 @@
             </w:tcMar>
             <w:shd w:fill="FFFFFF"/>
             <w:tcMar>
-              <w:top w:w="30" w:type="dxa"/>
-              <w:bottom w:w="30" w:type="dxa"/>
-              <w:left w:w="60" w:type="dxa"/>
-              <w:right w:w="60" w:type="dxa"/>
+              <w:top w:w="10" w:type="dxa"/>
+              <w:bottom w:w="10" w:type="dxa"/>
+              <w:left w:w="40" w:type="dxa"/>
+              <w:right w:w="40" w:type="dxa"/>
             </w:tcMar>
             <w:shd w:fill="FFFFFF"/>
           </w:tcPr>
           <w:p>
             <w:pPr>
-              <w:spacing w:before="20" w:after="20"/>
+              <w:spacing w:before="0" w:after="20"/>
             </w:pPr>
             <w:r>
               <w:rPr>
-                <w:b/>
-                <w:color w:val="1E3A8A"/>
-                <w:sz w:val="19"/>
+                <w:color w:val="1E293B"/>
+                <w:sz w:val="17"/>
               </w:rPr>
-              <w:t>Chapter 4: Implementation of Core Modules</w:t>
+              <w:t xml:space="preserve">    2.2 Drawbacks of Current Systems</w:t>
             </w:r>
           </w:p>
         </w:tc>
         <w:tc>
           <w:tcPr>
-            <w:tcW w:type="dxa" w:w="1728"/>
+            <w:tcW w:type="dxa" w:w="1440"/>
             <w:vAlign w:val="center"/>
             <w:tcMar>
               <w:top w:w="100" w:type="dxa"/>
@@ -1735,22 +1173,233 @@
             </w:tcMar>
             <w:shd w:fill="FFFFFF"/>
             <w:tcMar>
-              <w:top w:w="30" w:type="dxa"/>
-              <w:bottom w:w="30" w:type="dxa"/>
-              <w:left w:w="60" w:type="dxa"/>
-              <w:right w:w="60" w:type="dxa"/>
+              <w:top w:w="10" w:type="dxa"/>
+              <w:bottom w:w="10" w:type="dxa"/>
+              <w:left w:w="40" w:type="dxa"/>
+              <w:right w:w="40" w:type="dxa"/>
             </w:tcMar>
             <w:shd w:fill="FFFFFF"/>
           </w:tcPr>
           <w:p>
             <w:pPr>
-              <w:spacing w:before="20" w:after="20"/>
+              <w:spacing w:before="0" w:after="20"/>
               <w:jc w:val="right"/>
             </w:pPr>
             <w:r>
               <w:rPr>
                 <w:color w:val="64748B"/>
-                <w:sz w:val="19"/>
+                <w:sz w:val="17"/>
+              </w:rPr>
+              <w:t>7</w:t>
+            </w:r>
+          </w:p>
+        </w:tc>
+      </w:tr>
+      <w:tr>
+        <w:trPr>
+          <w:cantSplit/>
+        </w:trPr>
+        <w:tc>
+          <w:tcPr>
+            <w:tcW w:type="dxa" w:w="7920"/>
+            <w:vAlign w:val="center"/>
+            <w:tcMar>
+              <w:top w:w="100" w:type="dxa"/>
+              <w:bottom w:w="100" w:type="dxa"/>
+              <w:left w:w="140" w:type="dxa"/>
+              <w:right w:w="140" w:type="dxa"/>
+            </w:tcMar>
+            <w:shd w:fill="F8FAFC"/>
+            <w:tcMar>
+              <w:top w:w="10" w:type="dxa"/>
+              <w:bottom w:w="10" w:type="dxa"/>
+              <w:left w:w="40" w:type="dxa"/>
+              <w:right w:w="40" w:type="dxa"/>
+            </w:tcMar>
+            <w:shd w:fill="FFFFFF"/>
+          </w:tcPr>
+          <w:p>
+            <w:pPr>
+              <w:spacing w:before="0" w:after="20"/>
+            </w:pPr>
+            <w:r>
+              <w:rPr>
+                <w:color w:val="1E293B"/>
+                <w:sz w:val="17"/>
+              </w:rPr>
+              <w:t xml:space="preserve">    2.3 Proposed Career Graph Highlights</w:t>
+            </w:r>
+          </w:p>
+        </w:tc>
+        <w:tc>
+          <w:tcPr>
+            <w:tcW w:type="dxa" w:w="1440"/>
+            <w:vAlign w:val="center"/>
+            <w:tcMar>
+              <w:top w:w="100" w:type="dxa"/>
+              <w:bottom w:w="100" w:type="dxa"/>
+              <w:left w:w="140" w:type="dxa"/>
+              <w:right w:w="140" w:type="dxa"/>
+            </w:tcMar>
+            <w:shd w:fill="F8FAFC"/>
+            <w:tcMar>
+              <w:top w:w="10" w:type="dxa"/>
+              <w:bottom w:w="10" w:type="dxa"/>
+              <w:left w:w="40" w:type="dxa"/>
+              <w:right w:w="40" w:type="dxa"/>
+            </w:tcMar>
+            <w:shd w:fill="FFFFFF"/>
+          </w:tcPr>
+          <w:p>
+            <w:pPr>
+              <w:spacing w:before="0" w:after="20"/>
+              <w:jc w:val="right"/>
+            </w:pPr>
+            <w:r>
+              <w:rPr>
+                <w:color w:val="64748B"/>
+                <w:sz w:val="17"/>
+              </w:rPr>
+              <w:t>7</w:t>
+            </w:r>
+          </w:p>
+        </w:tc>
+      </w:tr>
+      <w:tr>
+        <w:trPr>
+          <w:cantSplit/>
+        </w:trPr>
+        <w:tc>
+          <w:tcPr>
+            <w:tcW w:type="dxa" w:w="7920"/>
+            <w:vAlign w:val="center"/>
+            <w:tcMar>
+              <w:top w:w="100" w:type="dxa"/>
+              <w:bottom w:w="100" w:type="dxa"/>
+              <w:left w:w="140" w:type="dxa"/>
+              <w:right w:w="140" w:type="dxa"/>
+            </w:tcMar>
+            <w:shd w:fill="FFFFFF"/>
+            <w:tcMar>
+              <w:top w:w="10" w:type="dxa"/>
+              <w:bottom w:w="10" w:type="dxa"/>
+              <w:left w:w="40" w:type="dxa"/>
+              <w:right w:w="40" w:type="dxa"/>
+            </w:tcMar>
+            <w:shd w:fill="FFFFFF"/>
+          </w:tcPr>
+          <w:p>
+            <w:pPr>
+              <w:spacing w:before="0" w:after="20"/>
+            </w:pPr>
+            <w:r>
+              <w:rPr>
+                <w:color w:val="1E293B"/>
+                <w:sz w:val="17"/>
+              </w:rPr>
+              <w:t xml:space="preserve">    2.4 Feature Comparison Table</w:t>
+            </w:r>
+          </w:p>
+        </w:tc>
+        <w:tc>
+          <w:tcPr>
+            <w:tcW w:type="dxa" w:w="1440"/>
+            <w:vAlign w:val="center"/>
+            <w:tcMar>
+              <w:top w:w="100" w:type="dxa"/>
+              <w:bottom w:w="100" w:type="dxa"/>
+              <w:left w:w="140" w:type="dxa"/>
+              <w:right w:w="140" w:type="dxa"/>
+            </w:tcMar>
+            <w:shd w:fill="FFFFFF"/>
+            <w:tcMar>
+              <w:top w:w="10" w:type="dxa"/>
+              <w:bottom w:w="10" w:type="dxa"/>
+              <w:left w:w="40" w:type="dxa"/>
+              <w:right w:w="40" w:type="dxa"/>
+            </w:tcMar>
+            <w:shd w:fill="FFFFFF"/>
+          </w:tcPr>
+          <w:p>
+            <w:pPr>
+              <w:spacing w:before="0" w:after="20"/>
+              <w:jc w:val="right"/>
+            </w:pPr>
+            <w:r>
+              <w:rPr>
+                <w:color w:val="64748B"/>
+                <w:sz w:val="17"/>
+              </w:rPr>
+              <w:t>7</w:t>
+            </w:r>
+          </w:p>
+        </w:tc>
+      </w:tr>
+      <w:tr>
+        <w:trPr>
+          <w:cantSplit/>
+        </w:trPr>
+        <w:tc>
+          <w:tcPr>
+            <w:tcW w:type="dxa" w:w="7920"/>
+            <w:vAlign w:val="center"/>
+            <w:tcMar>
+              <w:top w:w="100" w:type="dxa"/>
+              <w:bottom w:w="100" w:type="dxa"/>
+              <w:left w:w="140" w:type="dxa"/>
+              <w:right w:w="140" w:type="dxa"/>
+            </w:tcMar>
+            <w:shd w:fill="F8FAFC"/>
+            <w:tcMar>
+              <w:top w:w="10" w:type="dxa"/>
+              <w:bottom w:w="10" w:type="dxa"/>
+              <w:left w:w="40" w:type="dxa"/>
+              <w:right w:w="40" w:type="dxa"/>
+            </w:tcMar>
+            <w:shd w:fill="FFFFFF"/>
+          </w:tcPr>
+          <w:p>
+            <w:pPr>
+              <w:spacing w:before="0" w:after="20"/>
+            </w:pPr>
+            <w:r>
+              <w:rPr>
+                <w:b/>
+                <w:color w:val="1E3A8A"/>
+                <w:sz w:val="17"/>
+              </w:rPr>
+              <w:t>Chapter 3: System Requirements &amp; Architecture</w:t>
+            </w:r>
+          </w:p>
+        </w:tc>
+        <w:tc>
+          <w:tcPr>
+            <w:tcW w:type="dxa" w:w="1440"/>
+            <w:vAlign w:val="center"/>
+            <w:tcMar>
+              <w:top w:w="100" w:type="dxa"/>
+              <w:bottom w:w="100" w:type="dxa"/>
+              <w:left w:w="140" w:type="dxa"/>
+              <w:right w:w="140" w:type="dxa"/>
+            </w:tcMar>
+            <w:shd w:fill="F8FAFC"/>
+            <w:tcMar>
+              <w:top w:w="10" w:type="dxa"/>
+              <w:bottom w:w="10" w:type="dxa"/>
+              <w:left w:w="40" w:type="dxa"/>
+              <w:right w:w="40" w:type="dxa"/>
+            </w:tcMar>
+            <w:shd w:fill="FFFFFF"/>
+          </w:tcPr>
+          <w:p>
+            <w:pPr>
+              <w:spacing w:before="0" w:after="20"/>
+              <w:jc w:val="right"/>
+            </w:pPr>
+            <w:r>
+              <w:rPr>
+                <w:color w:val="64748B"/>
+                <w:sz w:val="17"/>
               </w:rPr>
               <w:t>9</w:t>
             </w:r>
@@ -1763,7 +1412,7 @@
         </w:trPr>
         <w:tc>
           <w:tcPr>
-            <w:tcW w:type="dxa" w:w="7632"/>
+            <w:tcW w:type="dxa" w:w="7920"/>
             <w:vAlign w:val="center"/>
             <w:tcMar>
               <w:top w:w="100" w:type="dxa"/>
@@ -1771,31 +1420,31 @@
               <w:left w:w="140" w:type="dxa"/>
               <w:right w:w="140" w:type="dxa"/>
             </w:tcMar>
-            <w:shd w:fill="F8FAFC"/>
+            <w:shd w:fill="FFFFFF"/>
             <w:tcMar>
-              <w:top w:w="30" w:type="dxa"/>
-              <w:bottom w:w="30" w:type="dxa"/>
-              <w:left w:w="60" w:type="dxa"/>
-              <w:right w:w="60" w:type="dxa"/>
+              <w:top w:w="10" w:type="dxa"/>
+              <w:bottom w:w="10" w:type="dxa"/>
+              <w:left w:w="40" w:type="dxa"/>
+              <w:right w:w="40" w:type="dxa"/>
             </w:tcMar>
             <w:shd w:fill="FFFFFF"/>
           </w:tcPr>
           <w:p>
             <w:pPr>
-              <w:spacing w:before="20" w:after="20"/>
+              <w:spacing w:before="0" w:after="20"/>
             </w:pPr>
             <w:r>
               <w:rPr>
                 <w:color w:val="1E293B"/>
-                <w:sz w:val="19"/>
+                <w:sz w:val="17"/>
               </w:rPr>
-              <w:t xml:space="preserve">    4.1 Module 1: User Authentication &amp; Onboarding Assessment</w:t>
+              <w:t xml:space="preserve">    3.1 Hardware and Software Requirements</w:t>
             </w:r>
           </w:p>
         </w:tc>
         <w:tc>
           <w:tcPr>
-            <w:tcW w:type="dxa" w:w="1728"/>
+            <w:tcW w:type="dxa" w:w="1440"/>
             <w:vAlign w:val="center"/>
             <w:tcMar>
               <w:top w:w="100" w:type="dxa"/>
@@ -1803,24 +1452,24 @@
               <w:left w:w="140" w:type="dxa"/>
               <w:right w:w="140" w:type="dxa"/>
             </w:tcMar>
-            <w:shd w:fill="F8FAFC"/>
+            <w:shd w:fill="FFFFFF"/>
             <w:tcMar>
-              <w:top w:w="30" w:type="dxa"/>
-              <w:bottom w:w="30" w:type="dxa"/>
-              <w:left w:w="60" w:type="dxa"/>
-              <w:right w:w="60" w:type="dxa"/>
+              <w:top w:w="10" w:type="dxa"/>
+              <w:bottom w:w="10" w:type="dxa"/>
+              <w:left w:w="40" w:type="dxa"/>
+              <w:right w:w="40" w:type="dxa"/>
             </w:tcMar>
             <w:shd w:fill="FFFFFF"/>
           </w:tcPr>
           <w:p>
             <w:pPr>
-              <w:spacing w:before="20" w:after="20"/>
+              <w:spacing w:before="0" w:after="20"/>
               <w:jc w:val="right"/>
             </w:pPr>
             <w:r>
               <w:rPr>
                 <w:color w:val="64748B"/>
-                <w:sz w:val="19"/>
+                <w:sz w:val="17"/>
               </w:rPr>
               <w:t>9</w:t>
             </w:r>
@@ -1833,7 +1482,7 @@
         </w:trPr>
         <w:tc>
           <w:tcPr>
-            <w:tcW w:type="dxa" w:w="7632"/>
+            <w:tcW w:type="dxa" w:w="7920"/>
             <w:vAlign w:val="center"/>
             <w:tcMar>
               <w:top w:w="100" w:type="dxa"/>
@@ -1841,31 +1490,31 @@
               <w:left w:w="140" w:type="dxa"/>
               <w:right w:w="140" w:type="dxa"/>
             </w:tcMar>
-            <w:shd w:fill="FFFFFF"/>
+            <w:shd w:fill="F8FAFC"/>
             <w:tcMar>
-              <w:top w:w="30" w:type="dxa"/>
-              <w:bottom w:w="30" w:type="dxa"/>
-              <w:left w:w="60" w:type="dxa"/>
-              <w:right w:w="60" w:type="dxa"/>
+              <w:top w:w="10" w:type="dxa"/>
+              <w:bottom w:w="10" w:type="dxa"/>
+              <w:left w:w="40" w:type="dxa"/>
+              <w:right w:w="40" w:type="dxa"/>
             </w:tcMar>
             <w:shd w:fill="FFFFFF"/>
           </w:tcPr>
           <w:p>
             <w:pPr>
-              <w:spacing w:before="20" w:after="20"/>
+              <w:spacing w:before="0" w:after="20"/>
             </w:pPr>
             <w:r>
               <w:rPr>
                 <w:color w:val="1E293B"/>
-                <w:sz w:val="19"/>
+                <w:sz w:val="17"/>
               </w:rPr>
-              <w:t xml:space="preserve">    4.2 Module 2: Topological Prerequisite &amp; Phase Locking Engine</w:t>
+              <w:t xml:space="preserve">    3.2 Three-Tier Decoupled Architecture</w:t>
             </w:r>
           </w:p>
         </w:tc>
         <w:tc>
           <w:tcPr>
-            <w:tcW w:type="dxa" w:w="1728"/>
+            <w:tcW w:type="dxa" w:w="1440"/>
             <w:vAlign w:val="center"/>
             <w:tcMar>
               <w:top w:w="100" w:type="dxa"/>
@@ -1873,24 +1522,24 @@
               <w:left w:w="140" w:type="dxa"/>
               <w:right w:w="140" w:type="dxa"/>
             </w:tcMar>
-            <w:shd w:fill="FFFFFF"/>
+            <w:shd w:fill="F8FAFC"/>
             <w:tcMar>
-              <w:top w:w="30" w:type="dxa"/>
-              <w:bottom w:w="30" w:type="dxa"/>
-              <w:left w:w="60" w:type="dxa"/>
-              <w:right w:w="60" w:type="dxa"/>
+              <w:top w:w="10" w:type="dxa"/>
+              <w:bottom w:w="10" w:type="dxa"/>
+              <w:left w:w="40" w:type="dxa"/>
+              <w:right w:w="40" w:type="dxa"/>
             </w:tcMar>
             <w:shd w:fill="FFFFFF"/>
           </w:tcPr>
           <w:p>
             <w:pPr>
-              <w:spacing w:before="20" w:after="20"/>
+              <w:spacing w:before="0" w:after="20"/>
               <w:jc w:val="right"/>
             </w:pPr>
             <w:r>
               <w:rPr>
                 <w:color w:val="64748B"/>
-                <w:sz w:val="19"/>
+                <w:sz w:val="17"/>
               </w:rPr>
               <w:t>9</w:t>
             </w:r>
@@ -1903,7 +1552,7 @@
         </w:trPr>
         <w:tc>
           <w:tcPr>
-            <w:tcW w:type="dxa" w:w="7632"/>
+            <w:tcW w:type="dxa" w:w="7920"/>
             <w:vAlign w:val="center"/>
             <w:tcMar>
               <w:top w:w="100" w:type="dxa"/>
@@ -1911,31 +1560,31 @@
               <w:left w:w="140" w:type="dxa"/>
               <w:right w:w="140" w:type="dxa"/>
             </w:tcMar>
-            <w:shd w:fill="F8FAFC"/>
+            <w:shd w:fill="FFFFFF"/>
             <w:tcMar>
-              <w:top w:w="30" w:type="dxa"/>
-              <w:bottom w:w="30" w:type="dxa"/>
-              <w:left w:w="60" w:type="dxa"/>
-              <w:right w:w="60" w:type="dxa"/>
+              <w:top w:w="10" w:type="dxa"/>
+              <w:bottom w:w="10" w:type="dxa"/>
+              <w:left w:w="40" w:type="dxa"/>
+              <w:right w:w="40" w:type="dxa"/>
             </w:tcMar>
             <w:shd w:fill="FFFFFF"/>
           </w:tcPr>
           <w:p>
             <w:pPr>
-              <w:spacing w:before="20" w:after="20"/>
+              <w:spacing w:before="0" w:after="20"/>
             </w:pPr>
             <w:r>
               <w:rPr>
                 <w:color w:val="1E293B"/>
-                <w:sz w:val="19"/>
+                <w:sz w:val="17"/>
               </w:rPr>
-              <w:t xml:space="preserve">    4.3 Module 3: Learning Curriculum &amp; Progress Aggregation</w:t>
+              <w:t xml:space="preserve">    3.3 Database Modeling &amp; Entity Relationship Diagram</w:t>
             </w:r>
           </w:p>
         </w:tc>
         <w:tc>
           <w:tcPr>
-            <w:tcW w:type="dxa" w:w="1728"/>
+            <w:tcW w:type="dxa" w:w="1440"/>
             <w:vAlign w:val="center"/>
             <w:tcMar>
               <w:top w:w="100" w:type="dxa"/>
@@ -1943,24 +1592,24 @@
               <w:left w:w="140" w:type="dxa"/>
               <w:right w:w="140" w:type="dxa"/>
             </w:tcMar>
-            <w:shd w:fill="F8FAFC"/>
+            <w:shd w:fill="FFFFFF"/>
             <w:tcMar>
-              <w:top w:w="30" w:type="dxa"/>
-              <w:bottom w:w="30" w:type="dxa"/>
-              <w:left w:w="60" w:type="dxa"/>
-              <w:right w:w="60" w:type="dxa"/>
+              <w:top w:w="10" w:type="dxa"/>
+              <w:bottom w:w="10" w:type="dxa"/>
+              <w:left w:w="40" w:type="dxa"/>
+              <w:right w:w="40" w:type="dxa"/>
             </w:tcMar>
             <w:shd w:fill="FFFFFF"/>
           </w:tcPr>
           <w:p>
             <w:pPr>
-              <w:spacing w:before="20" w:after="20"/>
+              <w:spacing w:before="0" w:after="20"/>
               <w:jc w:val="right"/>
             </w:pPr>
             <w:r>
               <w:rPr>
                 <w:color w:val="64748B"/>
-                <w:sz w:val="19"/>
+                <w:sz w:val="17"/>
               </w:rPr>
               <w:t>10</w:t>
             </w:r>
@@ -1973,7 +1622,7 @@
         </w:trPr>
         <w:tc>
           <w:tcPr>
-            <w:tcW w:type="dxa" w:w="7632"/>
+            <w:tcW w:type="dxa" w:w="7920"/>
             <w:vAlign w:val="center"/>
             <w:tcMar>
               <w:top w:w="100" w:type="dxa"/>
@@ -1981,31 +1630,31 @@
               <w:left w:w="140" w:type="dxa"/>
               <w:right w:w="140" w:type="dxa"/>
             </w:tcMar>
-            <w:shd w:fill="FFFFFF"/>
+            <w:shd w:fill="F8FAFC"/>
             <w:tcMar>
-              <w:top w:w="30" w:type="dxa"/>
-              <w:bottom w:w="30" w:type="dxa"/>
-              <w:left w:w="60" w:type="dxa"/>
-              <w:right w:w="60" w:type="dxa"/>
+              <w:top w:w="10" w:type="dxa"/>
+              <w:bottom w:w="10" w:type="dxa"/>
+              <w:left w:w="40" w:type="dxa"/>
+              <w:right w:w="40" w:type="dxa"/>
             </w:tcMar>
             <w:shd w:fill="FFFFFF"/>
           </w:tcPr>
           <w:p>
             <w:pPr>
-              <w:spacing w:before="20" w:after="20"/>
+              <w:spacing w:before="0" w:after="20"/>
             </w:pPr>
             <w:r>
               <w:rPr>
                 <w:color w:val="1E293B"/>
-                <w:sz w:val="19"/>
+                <w:sz w:val="17"/>
               </w:rPr>
-              <w:t xml:space="preserve">    4.4 Module 4: Proof-of-Skill Quiz &amp; Server-Side Verification</w:t>
+              <w:t xml:space="preserve">    3.4 Database Collections Summary</w:t>
             </w:r>
           </w:p>
         </w:tc>
         <w:tc>
           <w:tcPr>
-            <w:tcW w:type="dxa" w:w="1728"/>
+            <w:tcW w:type="dxa" w:w="1440"/>
             <w:vAlign w:val="center"/>
             <w:tcMar>
               <w:top w:w="100" w:type="dxa"/>
@@ -2013,24 +1662,24 @@
               <w:left w:w="140" w:type="dxa"/>
               <w:right w:w="140" w:type="dxa"/>
             </w:tcMar>
-            <w:shd w:fill="FFFFFF"/>
+            <w:shd w:fill="F8FAFC"/>
             <w:tcMar>
-              <w:top w:w="30" w:type="dxa"/>
-              <w:bottom w:w="30" w:type="dxa"/>
-              <w:left w:w="60" w:type="dxa"/>
-              <w:right w:w="60" w:type="dxa"/>
+              <w:top w:w="10" w:type="dxa"/>
+              <w:bottom w:w="10" w:type="dxa"/>
+              <w:left w:w="40" w:type="dxa"/>
+              <w:right w:w="40" w:type="dxa"/>
             </w:tcMar>
             <w:shd w:fill="FFFFFF"/>
           </w:tcPr>
           <w:p>
             <w:pPr>
-              <w:spacing w:before="20" w:after="20"/>
+              <w:spacing w:before="0" w:after="20"/>
               <w:jc w:val="right"/>
             </w:pPr>
             <w:r>
               <w:rPr>
                 <w:color w:val="64748B"/>
-                <w:sz w:val="19"/>
+                <w:sz w:val="17"/>
               </w:rPr>
               <w:t>11</w:t>
             </w:r>
@@ -2043,77 +1692,7 @@
         </w:trPr>
         <w:tc>
           <w:tcPr>
-            <w:tcW w:type="dxa" w:w="7632"/>
-            <w:vAlign w:val="center"/>
-            <w:tcMar>
-              <w:top w:w="100" w:type="dxa"/>
-              <w:bottom w:w="100" w:type="dxa"/>
-              <w:left w:w="140" w:type="dxa"/>
-              <w:right w:w="140" w:type="dxa"/>
-            </w:tcMar>
-            <w:shd w:fill="F8FAFC"/>
-            <w:tcMar>
-              <w:top w:w="30" w:type="dxa"/>
-              <w:bottom w:w="30" w:type="dxa"/>
-              <w:left w:w="60" w:type="dxa"/>
-              <w:right w:w="60" w:type="dxa"/>
-            </w:tcMar>
-            <w:shd w:fill="FFFFFF"/>
-          </w:tcPr>
-          <w:p>
-            <w:pPr>
-              <w:spacing w:before="20" w:after="20"/>
-            </w:pPr>
-            <w:r>
-              <w:rPr>
-                <w:color w:val="1E293B"/>
-                <w:sz w:val="19"/>
-              </w:rPr>
-              <w:t xml:space="preserve">    4.5 Module 5: Universal Cross-Track Skill Sharing</w:t>
-            </w:r>
-          </w:p>
-        </w:tc>
-        <w:tc>
-          <w:tcPr>
-            <w:tcW w:type="dxa" w:w="1728"/>
-            <w:vAlign w:val="center"/>
-            <w:tcMar>
-              <w:top w:w="100" w:type="dxa"/>
-              <w:bottom w:w="100" w:type="dxa"/>
-              <w:left w:w="140" w:type="dxa"/>
-              <w:right w:w="140" w:type="dxa"/>
-            </w:tcMar>
-            <w:shd w:fill="F8FAFC"/>
-            <w:tcMar>
-              <w:top w:w="30" w:type="dxa"/>
-              <w:bottom w:w="30" w:type="dxa"/>
-              <w:left w:w="60" w:type="dxa"/>
-              <w:right w:w="60" w:type="dxa"/>
-            </w:tcMar>
-            <w:shd w:fill="FFFFFF"/>
-          </w:tcPr>
-          <w:p>
-            <w:pPr>
-              <w:spacing w:before="20" w:after="20"/>
-              <w:jc w:val="right"/>
-            </w:pPr>
-            <w:r>
-              <w:rPr>
-                <w:color w:val="64748B"/>
-                <w:sz w:val="19"/>
-              </w:rPr>
-              <w:t>12</w:t>
-            </w:r>
-          </w:p>
-        </w:tc>
-      </w:tr>
-      <w:tr>
-        <w:trPr>
-          <w:cantSplit/>
-        </w:trPr>
-        <w:tc>
-          <w:tcPr>
-            <w:tcW w:type="dxa" w:w="7632"/>
+            <w:tcW w:type="dxa" w:w="7920"/>
             <w:vAlign w:val="center"/>
             <w:tcMar>
               <w:top w:w="100" w:type="dxa"/>
@@ -2123,30 +1702,30 @@
             </w:tcMar>
             <w:shd w:fill="FFFFFF"/>
             <w:tcMar>
-              <w:top w:w="30" w:type="dxa"/>
-              <w:bottom w:w="30" w:type="dxa"/>
-              <w:left w:w="60" w:type="dxa"/>
-              <w:right w:w="60" w:type="dxa"/>
+              <w:top w:w="10" w:type="dxa"/>
+              <w:bottom w:w="10" w:type="dxa"/>
+              <w:left w:w="40" w:type="dxa"/>
+              <w:right w:w="40" w:type="dxa"/>
             </w:tcMar>
             <w:shd w:fill="FFFFFF"/>
           </w:tcPr>
           <w:p>
             <w:pPr>
-              <w:spacing w:before="20" w:after="20"/>
+              <w:spacing w:before="0" w:after="20"/>
             </w:pPr>
             <w:r>
               <w:rPr>
                 <w:b/>
                 <w:color w:val="1E3A8A"/>
-                <w:sz w:val="19"/>
+                <w:sz w:val="17"/>
               </w:rPr>
-              <w:t>Chapter 5: User Interface &amp; Workflow Walkthrough</w:t>
+              <w:t>Chapter 4: Implementation of Core Modules</w:t>
             </w:r>
           </w:p>
         </w:tc>
         <w:tc>
           <w:tcPr>
-            <w:tcW w:type="dxa" w:w="1728"/>
+            <w:tcW w:type="dxa" w:w="1440"/>
             <w:vAlign w:val="center"/>
             <w:tcMar>
               <w:top w:w="100" w:type="dxa"/>
@@ -2156,22 +1735,22 @@
             </w:tcMar>
             <w:shd w:fill="FFFFFF"/>
             <w:tcMar>
-              <w:top w:w="30" w:type="dxa"/>
-              <w:bottom w:w="30" w:type="dxa"/>
-              <w:left w:w="60" w:type="dxa"/>
-              <w:right w:w="60" w:type="dxa"/>
+              <w:top w:w="10" w:type="dxa"/>
+              <w:bottom w:w="10" w:type="dxa"/>
+              <w:left w:w="40" w:type="dxa"/>
+              <w:right w:w="40" w:type="dxa"/>
             </w:tcMar>
             <w:shd w:fill="FFFFFF"/>
           </w:tcPr>
           <w:p>
             <w:pPr>
-              <w:spacing w:before="20" w:after="20"/>
+              <w:spacing w:before="0" w:after="20"/>
               <w:jc w:val="right"/>
             </w:pPr>
             <w:r>
               <w:rPr>
                 <w:color w:val="64748B"/>
-                <w:sz w:val="19"/>
+                <w:sz w:val="17"/>
               </w:rPr>
               <w:t>13</w:t>
             </w:r>
@@ -2184,7 +1763,7 @@
         </w:trPr>
         <w:tc>
           <w:tcPr>
-            <w:tcW w:type="dxa" w:w="7632"/>
+            <w:tcW w:type="dxa" w:w="7920"/>
             <w:vAlign w:val="center"/>
             <w:tcMar>
               <w:top w:w="100" w:type="dxa"/>
@@ -2194,29 +1773,29 @@
             </w:tcMar>
             <w:shd w:fill="F8FAFC"/>
             <w:tcMar>
-              <w:top w:w="30" w:type="dxa"/>
-              <w:bottom w:w="30" w:type="dxa"/>
-              <w:left w:w="60" w:type="dxa"/>
-              <w:right w:w="60" w:type="dxa"/>
+              <w:top w:w="10" w:type="dxa"/>
+              <w:bottom w:w="10" w:type="dxa"/>
+              <w:left w:w="40" w:type="dxa"/>
+              <w:right w:w="40" w:type="dxa"/>
             </w:tcMar>
             <w:shd w:fill="FFFFFF"/>
           </w:tcPr>
           <w:p>
             <w:pPr>
-              <w:spacing w:before="20" w:after="20"/>
+              <w:spacing w:before="0" w:after="20"/>
             </w:pPr>
             <w:r>
               <w:rPr>
                 <w:color w:val="1E293B"/>
-                <w:sz w:val="19"/>
+                <w:sz w:val="17"/>
               </w:rPr>
-              <w:t xml:space="preserve">    5.1 User Registration and Career Goal Selection</w:t>
+              <w:t xml:space="preserve">    4.1 Module 1: User Authentication &amp; Onboarding Assessment</w:t>
             </w:r>
           </w:p>
         </w:tc>
         <w:tc>
           <w:tcPr>
-            <w:tcW w:type="dxa" w:w="1728"/>
+            <w:tcW w:type="dxa" w:w="1440"/>
             <w:vAlign w:val="center"/>
             <w:tcMar>
               <w:top w:w="100" w:type="dxa"/>
@@ -2226,22 +1805,22 @@
             </w:tcMar>
             <w:shd w:fill="F8FAFC"/>
             <w:tcMar>
-              <w:top w:w="30" w:type="dxa"/>
-              <w:bottom w:w="30" w:type="dxa"/>
-              <w:left w:w="60" w:type="dxa"/>
-              <w:right w:w="60" w:type="dxa"/>
+              <w:top w:w="10" w:type="dxa"/>
+              <w:bottom w:w="10" w:type="dxa"/>
+              <w:left w:w="40" w:type="dxa"/>
+              <w:right w:w="40" w:type="dxa"/>
             </w:tcMar>
             <w:shd w:fill="FFFFFF"/>
           </w:tcPr>
           <w:p>
             <w:pPr>
-              <w:spacing w:before="20" w:after="20"/>
+              <w:spacing w:before="0" w:after="20"/>
               <w:jc w:val="right"/>
             </w:pPr>
             <w:r>
               <w:rPr>
                 <w:color w:val="64748B"/>
-                <w:sz w:val="19"/>
+                <w:sz w:val="17"/>
               </w:rPr>
               <w:t>13</w:t>
             </w:r>
@@ -2254,7 +1833,7 @@
         </w:trPr>
         <w:tc>
           <w:tcPr>
-            <w:tcW w:type="dxa" w:w="7632"/>
+            <w:tcW w:type="dxa" w:w="7920"/>
             <w:vAlign w:val="center"/>
             <w:tcMar>
               <w:top w:w="100" w:type="dxa"/>
@@ -2264,29 +1843,29 @@
             </w:tcMar>
             <w:shd w:fill="FFFFFF"/>
             <w:tcMar>
-              <w:top w:w="30" w:type="dxa"/>
-              <w:bottom w:w="30" w:type="dxa"/>
-              <w:left w:w="60" w:type="dxa"/>
-              <w:right w:w="60" w:type="dxa"/>
+              <w:top w:w="10" w:type="dxa"/>
+              <w:bottom w:w="10" w:type="dxa"/>
+              <w:left w:w="40" w:type="dxa"/>
+              <w:right w:w="40" w:type="dxa"/>
             </w:tcMar>
             <w:shd w:fill="FFFFFF"/>
           </w:tcPr>
           <w:p>
             <w:pPr>
-              <w:spacing w:before="20" w:after="20"/>
+              <w:spacing w:before="0" w:after="20"/>
             </w:pPr>
             <w:r>
               <w:rPr>
                 <w:color w:val="1E293B"/>
-                <w:sz w:val="19"/>
+                <w:sz w:val="17"/>
               </w:rPr>
-              <w:t xml:space="preserve">    5.2 Interactive SVG Bézier Roadmap Canvas</w:t>
+              <w:t xml:space="preserve">    4.2 Module 2: Topological Prerequisite &amp; Phase Locking Engine</w:t>
             </w:r>
           </w:p>
         </w:tc>
         <w:tc>
           <w:tcPr>
-            <w:tcW w:type="dxa" w:w="1728"/>
+            <w:tcW w:type="dxa" w:w="1440"/>
             <w:vAlign w:val="center"/>
             <w:tcMar>
               <w:top w:w="100" w:type="dxa"/>
@@ -2296,22 +1875,22 @@
             </w:tcMar>
             <w:shd w:fill="FFFFFF"/>
             <w:tcMar>
-              <w:top w:w="30" w:type="dxa"/>
-              <w:bottom w:w="30" w:type="dxa"/>
-              <w:left w:w="60" w:type="dxa"/>
-              <w:right w:w="60" w:type="dxa"/>
+              <w:top w:w="10" w:type="dxa"/>
+              <w:bottom w:w="10" w:type="dxa"/>
+              <w:left w:w="40" w:type="dxa"/>
+              <w:right w:w="40" w:type="dxa"/>
             </w:tcMar>
             <w:shd w:fill="FFFFFF"/>
           </w:tcPr>
           <w:p>
             <w:pPr>
-              <w:spacing w:before="20" w:after="20"/>
+              <w:spacing w:before="0" w:after="20"/>
               <w:jc w:val="right"/>
             </w:pPr>
             <w:r>
               <w:rPr>
                 <w:color w:val="64748B"/>
-                <w:sz w:val="19"/>
+                <w:sz w:val="17"/>
               </w:rPr>
               <w:t>13</w:t>
             </w:r>
@@ -2324,7 +1903,7 @@
         </w:trPr>
         <w:tc>
           <w:tcPr>
-            <w:tcW w:type="dxa" w:w="7632"/>
+            <w:tcW w:type="dxa" w:w="7920"/>
             <w:vAlign w:val="center"/>
             <w:tcMar>
               <w:top w:w="100" w:type="dxa"/>
@@ -2334,29 +1913,29 @@
             </w:tcMar>
             <w:shd w:fill="F8FAFC"/>
             <w:tcMar>
-              <w:top w:w="30" w:type="dxa"/>
-              <w:bottom w:w="30" w:type="dxa"/>
-              <w:left w:w="60" w:type="dxa"/>
-              <w:right w:w="60" w:type="dxa"/>
+              <w:top w:w="10" w:type="dxa"/>
+              <w:bottom w:w="10" w:type="dxa"/>
+              <w:left w:w="40" w:type="dxa"/>
+              <w:right w:w="40" w:type="dxa"/>
             </w:tcMar>
             <w:shd w:fill="FFFFFF"/>
           </w:tcPr>
           <w:p>
             <w:pPr>
-              <w:spacing w:before="20" w:after="20"/>
+              <w:spacing w:before="0" w:after="20"/>
             </w:pPr>
             <w:r>
               <w:rPr>
                 <w:color w:val="1E293B"/>
-                <w:sz w:val="19"/>
+                <w:sz w:val="17"/>
               </w:rPr>
-              <w:t xml:space="preserve">    5.3 Topic Preview Drawer &amp; Lesson Checklists</w:t>
+              <w:t xml:space="preserve">    4.3 Module 3: Learning Curriculum &amp; Progress Aggregation</w:t>
             </w:r>
           </w:p>
         </w:tc>
         <w:tc>
           <w:tcPr>
-            <w:tcW w:type="dxa" w:w="1728"/>
+            <w:tcW w:type="dxa" w:w="1440"/>
             <w:vAlign w:val="center"/>
             <w:tcMar>
               <w:top w:w="100" w:type="dxa"/>
@@ -2366,22 +1945,92 @@
             </w:tcMar>
             <w:shd w:fill="F8FAFC"/>
             <w:tcMar>
-              <w:top w:w="30" w:type="dxa"/>
-              <w:bottom w:w="30" w:type="dxa"/>
-              <w:left w:w="60" w:type="dxa"/>
-              <w:right w:w="60" w:type="dxa"/>
+              <w:top w:w="10" w:type="dxa"/>
+              <w:bottom w:w="10" w:type="dxa"/>
+              <w:left w:w="40" w:type="dxa"/>
+              <w:right w:w="40" w:type="dxa"/>
             </w:tcMar>
             <w:shd w:fill="FFFFFF"/>
           </w:tcPr>
           <w:p>
             <w:pPr>
-              <w:spacing w:before="20" w:after="20"/>
+              <w:spacing w:before="0" w:after="20"/>
               <w:jc w:val="right"/>
             </w:pPr>
             <w:r>
               <w:rPr>
                 <w:color w:val="64748B"/>
-                <w:sz w:val="19"/>
+                <w:sz w:val="17"/>
+              </w:rPr>
+              <w:t>13</w:t>
+            </w:r>
+          </w:p>
+        </w:tc>
+      </w:tr>
+      <w:tr>
+        <w:trPr>
+          <w:cantSplit/>
+        </w:trPr>
+        <w:tc>
+          <w:tcPr>
+            <w:tcW w:type="dxa" w:w="7920"/>
+            <w:vAlign w:val="center"/>
+            <w:tcMar>
+              <w:top w:w="100" w:type="dxa"/>
+              <w:bottom w:w="100" w:type="dxa"/>
+              <w:left w:w="140" w:type="dxa"/>
+              <w:right w:w="140" w:type="dxa"/>
+            </w:tcMar>
+            <w:shd w:fill="FFFFFF"/>
+            <w:tcMar>
+              <w:top w:w="10" w:type="dxa"/>
+              <w:bottom w:w="10" w:type="dxa"/>
+              <w:left w:w="40" w:type="dxa"/>
+              <w:right w:w="40" w:type="dxa"/>
+            </w:tcMar>
+            <w:shd w:fill="FFFFFF"/>
+          </w:tcPr>
+          <w:p>
+            <w:pPr>
+              <w:spacing w:before="0" w:after="20"/>
+            </w:pPr>
+            <w:r>
+              <w:rPr>
+                <w:color w:val="1E293B"/>
+                <w:sz w:val="17"/>
+              </w:rPr>
+              <w:t xml:space="preserve">    4.4 Module 4: Proof-of-Skill Quiz &amp; Server-Side Verification</w:t>
+            </w:r>
+          </w:p>
+        </w:tc>
+        <w:tc>
+          <w:tcPr>
+            <w:tcW w:type="dxa" w:w="1440"/>
+            <w:vAlign w:val="center"/>
+            <w:tcMar>
+              <w:top w:w="100" w:type="dxa"/>
+              <w:bottom w:w="100" w:type="dxa"/>
+              <w:left w:w="140" w:type="dxa"/>
+              <w:right w:w="140" w:type="dxa"/>
+            </w:tcMar>
+            <w:shd w:fill="FFFFFF"/>
+            <w:tcMar>
+              <w:top w:w="10" w:type="dxa"/>
+              <w:bottom w:w="10" w:type="dxa"/>
+              <w:left w:w="40" w:type="dxa"/>
+              <w:right w:w="40" w:type="dxa"/>
+            </w:tcMar>
+            <w:shd w:fill="FFFFFF"/>
+          </w:tcPr>
+          <w:p>
+            <w:pPr>
+              <w:spacing w:before="0" w:after="20"/>
+              <w:jc w:val="right"/>
+            </w:pPr>
+            <w:r>
+              <w:rPr>
+                <w:color w:val="64748B"/>
+                <w:sz w:val="17"/>
               </w:rPr>
               <w:t>14</w:t>
             </w:r>
@@ -2394,7 +2043,7 @@
         </w:trPr>
         <w:tc>
           <w:tcPr>
-            <w:tcW w:type="dxa" w:w="7632"/>
+            <w:tcW w:type="dxa" w:w="7920"/>
             <w:vAlign w:val="center"/>
             <w:tcMar>
               <w:top w:w="100" w:type="dxa"/>
@@ -2402,31 +2051,31 @@
               <w:left w:w="140" w:type="dxa"/>
               <w:right w:w="140" w:type="dxa"/>
             </w:tcMar>
-            <w:shd w:fill="FFFFFF"/>
+            <w:shd w:fill="F8FAFC"/>
             <w:tcMar>
-              <w:top w:w="30" w:type="dxa"/>
-              <w:bottom w:w="30" w:type="dxa"/>
-              <w:left w:w="60" w:type="dxa"/>
-              <w:right w:w="60" w:type="dxa"/>
+              <w:top w:w="10" w:type="dxa"/>
+              <w:bottom w:w="10" w:type="dxa"/>
+              <w:left w:w="40" w:type="dxa"/>
+              <w:right w:w="40" w:type="dxa"/>
             </w:tcMar>
             <w:shd w:fill="FFFFFF"/>
           </w:tcPr>
           <w:p>
             <w:pPr>
-              <w:spacing w:before="20" w:after="20"/>
+              <w:spacing w:before="0" w:after="20"/>
             </w:pPr>
             <w:r>
               <w:rPr>
                 <w:color w:val="1E293B"/>
-                <w:sz w:val="19"/>
+                <w:sz w:val="17"/>
               </w:rPr>
-              <w:t xml:space="preserve">    5.4 Taking the Verification Quiz and Earning the Badge</w:t>
+              <w:t xml:space="preserve">    4.5 Module 5: Universal Cross-Track Skill Sharing</w:t>
             </w:r>
           </w:p>
         </w:tc>
         <w:tc>
           <w:tcPr>
-            <w:tcW w:type="dxa" w:w="1728"/>
+            <w:tcW w:type="dxa" w:w="1440"/>
             <w:vAlign w:val="center"/>
             <w:tcMar>
               <w:top w:w="100" w:type="dxa"/>
@@ -2434,24 +2083,24 @@
               <w:left w:w="140" w:type="dxa"/>
               <w:right w:w="140" w:type="dxa"/>
             </w:tcMar>
-            <w:shd w:fill="FFFFFF"/>
+            <w:shd w:fill="F8FAFC"/>
             <w:tcMar>
-              <w:top w:w="30" w:type="dxa"/>
-              <w:bottom w:w="30" w:type="dxa"/>
-              <w:left w:w="60" w:type="dxa"/>
-              <w:right w:w="60" w:type="dxa"/>
+              <w:top w:w="10" w:type="dxa"/>
+              <w:bottom w:w="10" w:type="dxa"/>
+              <w:left w:w="40" w:type="dxa"/>
+              <w:right w:w="40" w:type="dxa"/>
             </w:tcMar>
             <w:shd w:fill="FFFFFF"/>
           </w:tcPr>
           <w:p>
             <w:pPr>
-              <w:spacing w:before="20" w:after="20"/>
+              <w:spacing w:before="0" w:after="20"/>
               <w:jc w:val="right"/>
             </w:pPr>
             <w:r>
               <w:rPr>
                 <w:color w:val="64748B"/>
-                <w:sz w:val="19"/>
+                <w:sz w:val="17"/>
               </w:rPr>
               <w:t>14</w:t>
             </w:r>
@@ -2464,77 +2113,7 @@
         </w:trPr>
         <w:tc>
           <w:tcPr>
-            <w:tcW w:type="dxa" w:w="7632"/>
-            <w:vAlign w:val="center"/>
-            <w:tcMar>
-              <w:top w:w="100" w:type="dxa"/>
-              <w:bottom w:w="100" w:type="dxa"/>
-              <w:left w:w="140" w:type="dxa"/>
-              <w:right w:w="140" w:type="dxa"/>
-            </w:tcMar>
-            <w:shd w:fill="F8FAFC"/>
-            <w:tcMar>
-              <w:top w:w="30" w:type="dxa"/>
-              <w:bottom w:w="30" w:type="dxa"/>
-              <w:left w:w="60" w:type="dxa"/>
-              <w:right w:w="60" w:type="dxa"/>
-            </w:tcMar>
-            <w:shd w:fill="FFFFFF"/>
-          </w:tcPr>
-          <w:p>
-            <w:pPr>
-              <w:spacing w:before="20" w:after="20"/>
-            </w:pPr>
-            <w:r>
-              <w:rPr>
-                <w:color w:val="1E293B"/>
-                <w:sz w:val="19"/>
-              </w:rPr>
-              <w:t xml:space="preserve">    5.5 Switching Career Tracks On-The-Fly</w:t>
-            </w:r>
-          </w:p>
-        </w:tc>
-        <w:tc>
-          <w:tcPr>
-            <w:tcW w:type="dxa" w:w="1728"/>
-            <w:vAlign w:val="center"/>
-            <w:tcMar>
-              <w:top w:w="100" w:type="dxa"/>
-              <w:bottom w:w="100" w:type="dxa"/>
-              <w:left w:w="140" w:type="dxa"/>
-              <w:right w:w="140" w:type="dxa"/>
-            </w:tcMar>
-            <w:shd w:fill="F8FAFC"/>
-            <w:tcMar>
-              <w:top w:w="30" w:type="dxa"/>
-              <w:bottom w:w="30" w:type="dxa"/>
-              <w:left w:w="60" w:type="dxa"/>
-              <w:right w:w="60" w:type="dxa"/>
-            </w:tcMar>
-            <w:shd w:fill="FFFFFF"/>
-          </w:tcPr>
-          <w:p>
-            <w:pPr>
-              <w:spacing w:before="20" w:after="20"/>
-              <w:jc w:val="right"/>
-            </w:pPr>
-            <w:r>
-              <w:rPr>
-                <w:color w:val="64748B"/>
-                <w:sz w:val="19"/>
-              </w:rPr>
-              <w:t>14</w:t>
-            </w:r>
-          </w:p>
-        </w:tc>
-      </w:tr>
-      <w:tr>
-        <w:trPr>
-          <w:cantSplit/>
-        </w:trPr>
-        <w:tc>
-          <w:tcPr>
-            <w:tcW w:type="dxa" w:w="7632"/>
+            <w:tcW w:type="dxa" w:w="7920"/>
             <w:vAlign w:val="center"/>
             <w:tcMar>
               <w:top w:w="100" w:type="dxa"/>
@@ -2544,30 +2123,30 @@
             </w:tcMar>
             <w:shd w:fill="FFFFFF"/>
             <w:tcMar>
-              <w:top w:w="30" w:type="dxa"/>
-              <w:bottom w:w="30" w:type="dxa"/>
-              <w:left w:w="60" w:type="dxa"/>
-              <w:right w:w="60" w:type="dxa"/>
+              <w:top w:w="10" w:type="dxa"/>
+              <w:bottom w:w="10" w:type="dxa"/>
+              <w:left w:w="40" w:type="dxa"/>
+              <w:right w:w="40" w:type="dxa"/>
             </w:tcMar>
             <w:shd w:fill="FFFFFF"/>
           </w:tcPr>
           <w:p>
             <w:pPr>
-              <w:spacing w:before="20" w:after="20"/>
+              <w:spacing w:before="0" w:after="20"/>
             </w:pPr>
             <w:r>
               <w:rPr>
                 <w:b/>
                 <w:color w:val="1E3A8A"/>
-                <w:sz w:val="19"/>
+                <w:sz w:val="17"/>
               </w:rPr>
-              <w:t>Chapter 6: System Testing &amp; Experimental Results</w:t>
+              <w:t>Chapter 5: User Interface &amp; Workflow Walkthrough</w:t>
             </w:r>
           </w:p>
         </w:tc>
         <w:tc>
           <w:tcPr>
-            <w:tcW w:type="dxa" w:w="1728"/>
+            <w:tcW w:type="dxa" w:w="1440"/>
             <w:vAlign w:val="center"/>
             <w:tcMar>
               <w:top w:w="100" w:type="dxa"/>
@@ -2577,22 +2156,22 @@
             </w:tcMar>
             <w:shd w:fill="FFFFFF"/>
             <w:tcMar>
-              <w:top w:w="30" w:type="dxa"/>
-              <w:bottom w:w="30" w:type="dxa"/>
-              <w:left w:w="60" w:type="dxa"/>
-              <w:right w:w="60" w:type="dxa"/>
+              <w:top w:w="10" w:type="dxa"/>
+              <w:bottom w:w="10" w:type="dxa"/>
+              <w:left w:w="40" w:type="dxa"/>
+              <w:right w:w="40" w:type="dxa"/>
             </w:tcMar>
             <w:shd w:fill="FFFFFF"/>
           </w:tcPr>
           <w:p>
             <w:pPr>
-              <w:spacing w:before="20" w:after="20"/>
+              <w:spacing w:before="0" w:after="20"/>
               <w:jc w:val="right"/>
             </w:pPr>
             <w:r>
               <w:rPr>
                 <w:color w:val="64748B"/>
-                <w:sz w:val="19"/>
+                <w:sz w:val="17"/>
               </w:rPr>
               <w:t>15</w:t>
             </w:r>
@@ -2605,7 +2184,7 @@
         </w:trPr>
         <w:tc>
           <w:tcPr>
-            <w:tcW w:type="dxa" w:w="7632"/>
+            <w:tcW w:type="dxa" w:w="7920"/>
             <w:vAlign w:val="center"/>
             <w:tcMar>
               <w:top w:w="100" w:type="dxa"/>
@@ -2615,29 +2194,29 @@
             </w:tcMar>
             <w:shd w:fill="F8FAFC"/>
             <w:tcMar>
-              <w:top w:w="30" w:type="dxa"/>
-              <w:bottom w:w="30" w:type="dxa"/>
-              <w:left w:w="60" w:type="dxa"/>
-              <w:right w:w="60" w:type="dxa"/>
+              <w:top w:w="10" w:type="dxa"/>
+              <w:bottom w:w="10" w:type="dxa"/>
+              <w:left w:w="40" w:type="dxa"/>
+              <w:right w:w="40" w:type="dxa"/>
             </w:tcMar>
             <w:shd w:fill="FFFFFF"/>
           </w:tcPr>
           <w:p>
             <w:pPr>
-              <w:spacing w:before="20" w:after="20"/>
+              <w:spacing w:before="0" w:after="20"/>
             </w:pPr>
             <w:r>
               <w:rPr>
                 <w:color w:val="1E293B"/>
-                <w:sz w:val="19"/>
+                <w:sz w:val="17"/>
               </w:rPr>
-              <w:t xml:space="preserve">    6.1 Testing Methodology</w:t>
+              <w:t xml:space="preserve">    5.1 User Registration and Career Goal Selection</w:t>
             </w:r>
           </w:p>
         </w:tc>
         <w:tc>
           <w:tcPr>
-            <w:tcW w:type="dxa" w:w="1728"/>
+            <w:tcW w:type="dxa" w:w="1440"/>
             <w:vAlign w:val="center"/>
             <w:tcMar>
               <w:top w:w="100" w:type="dxa"/>
@@ -2647,22 +2226,22 @@
             </w:tcMar>
             <w:shd w:fill="F8FAFC"/>
             <w:tcMar>
-              <w:top w:w="30" w:type="dxa"/>
-              <w:bottom w:w="30" w:type="dxa"/>
-              <w:left w:w="60" w:type="dxa"/>
-              <w:right w:w="60" w:type="dxa"/>
+              <w:top w:w="10" w:type="dxa"/>
+              <w:bottom w:w="10" w:type="dxa"/>
+              <w:left w:w="40" w:type="dxa"/>
+              <w:right w:w="40" w:type="dxa"/>
             </w:tcMar>
             <w:shd w:fill="FFFFFF"/>
           </w:tcPr>
           <w:p>
             <w:pPr>
-              <w:spacing w:before="20" w:after="20"/>
+              <w:spacing w:before="0" w:after="20"/>
               <w:jc w:val="right"/>
             </w:pPr>
             <w:r>
               <w:rPr>
                 <w:color w:val="64748B"/>
-                <w:sz w:val="19"/>
+                <w:sz w:val="17"/>
               </w:rPr>
               <w:t>15</w:t>
             </w:r>
@@ -2675,7 +2254,7 @@
         </w:trPr>
         <w:tc>
           <w:tcPr>
-            <w:tcW w:type="dxa" w:w="7632"/>
+            <w:tcW w:type="dxa" w:w="7920"/>
             <w:vAlign w:val="center"/>
             <w:tcMar>
               <w:top w:w="100" w:type="dxa"/>
@@ -2685,29 +2264,29 @@
             </w:tcMar>
             <w:shd w:fill="FFFFFF"/>
             <w:tcMar>
-              <w:top w:w="30" w:type="dxa"/>
-              <w:bottom w:w="30" w:type="dxa"/>
-              <w:left w:w="60" w:type="dxa"/>
-              <w:right w:w="60" w:type="dxa"/>
+              <w:top w:w="10" w:type="dxa"/>
+              <w:bottom w:w="10" w:type="dxa"/>
+              <w:left w:w="40" w:type="dxa"/>
+              <w:right w:w="40" w:type="dxa"/>
             </w:tcMar>
             <w:shd w:fill="FFFFFF"/>
           </w:tcPr>
           <w:p>
             <w:pPr>
-              <w:spacing w:before="20" w:after="20"/>
+              <w:spacing w:before="0" w:after="20"/>
             </w:pPr>
             <w:r>
               <w:rPr>
                 <w:color w:val="1E293B"/>
-                <w:sz w:val="19"/>
+                <w:sz w:val="17"/>
               </w:rPr>
-              <w:t xml:space="preserve">    6.2 Functional Test Cases &amp; Validation Results</w:t>
+              <w:t xml:space="preserve">    5.2 Interactive SVG Bézier Roadmap Canvas</w:t>
             </w:r>
           </w:p>
         </w:tc>
         <w:tc>
           <w:tcPr>
-            <w:tcW w:type="dxa" w:w="1728"/>
+            <w:tcW w:type="dxa" w:w="1440"/>
             <w:vAlign w:val="center"/>
             <w:tcMar>
               <w:top w:w="100" w:type="dxa"/>
@@ -2717,22 +2296,22 @@
             </w:tcMar>
             <w:shd w:fill="FFFFFF"/>
             <w:tcMar>
-              <w:top w:w="30" w:type="dxa"/>
-              <w:bottom w:w="30" w:type="dxa"/>
-              <w:left w:w="60" w:type="dxa"/>
-              <w:right w:w="60" w:type="dxa"/>
+              <w:top w:w="10" w:type="dxa"/>
+              <w:bottom w:w="10" w:type="dxa"/>
+              <w:left w:w="40" w:type="dxa"/>
+              <w:right w:w="40" w:type="dxa"/>
             </w:tcMar>
             <w:shd w:fill="FFFFFF"/>
           </w:tcPr>
           <w:p>
             <w:pPr>
-              <w:spacing w:before="20" w:after="20"/>
+              <w:spacing w:before="0" w:after="20"/>
               <w:jc w:val="right"/>
             </w:pPr>
             <w:r>
               <w:rPr>
                 <w:color w:val="64748B"/>
-                <w:sz w:val="19"/>
+                <w:sz w:val="17"/>
               </w:rPr>
               <w:t>15</w:t>
             </w:r>
@@ -2745,7 +2324,7 @@
         </w:trPr>
         <w:tc>
           <w:tcPr>
-            <w:tcW w:type="dxa" w:w="7632"/>
+            <w:tcW w:type="dxa" w:w="7920"/>
             <w:vAlign w:val="center"/>
             <w:tcMar>
               <w:top w:w="100" w:type="dxa"/>
@@ -2755,30 +2334,29 @@
             </w:tcMar>
             <w:shd w:fill="F8FAFC"/>
             <w:tcMar>
-              <w:top w:w="30" w:type="dxa"/>
-              <w:bottom w:w="30" w:type="dxa"/>
-              <w:left w:w="60" w:type="dxa"/>
-              <w:right w:w="60" w:type="dxa"/>
+              <w:top w:w="10" w:type="dxa"/>
+              <w:bottom w:w="10" w:type="dxa"/>
+              <w:left w:w="40" w:type="dxa"/>
+              <w:right w:w="40" w:type="dxa"/>
             </w:tcMar>
             <w:shd w:fill="FFFFFF"/>
           </w:tcPr>
           <w:p>
             <w:pPr>
-              <w:spacing w:before="20" w:after="20"/>
+              <w:spacing w:before="0" w:after="20"/>
             </w:pPr>
             <w:r>
               <w:rPr>
-                <w:b/>
-                <w:color w:val="1E3A8A"/>
-                <w:sz w:val="19"/>
+                <w:color w:val="1E293B"/>
+                <w:sz w:val="17"/>
               </w:rPr>
-              <w:t>Chapter 7: Conclusion &amp; Future Scope</w:t>
+              <w:t xml:space="preserve">    5.3 Topic Preview Drawer &amp; Lesson Checklists</w:t>
             </w:r>
           </w:p>
         </w:tc>
         <w:tc>
           <w:tcPr>
-            <w:tcW w:type="dxa" w:w="1728"/>
+            <w:tcW w:type="dxa" w:w="1440"/>
             <w:vAlign w:val="center"/>
             <w:tcMar>
               <w:top w:w="100" w:type="dxa"/>
@@ -2788,22 +2366,233 @@
             </w:tcMar>
             <w:shd w:fill="F8FAFC"/>
             <w:tcMar>
-              <w:top w:w="30" w:type="dxa"/>
-              <w:bottom w:w="30" w:type="dxa"/>
-              <w:left w:w="60" w:type="dxa"/>
-              <w:right w:w="60" w:type="dxa"/>
+              <w:top w:w="10" w:type="dxa"/>
+              <w:bottom w:w="10" w:type="dxa"/>
+              <w:left w:w="40" w:type="dxa"/>
+              <w:right w:w="40" w:type="dxa"/>
             </w:tcMar>
             <w:shd w:fill="FFFFFF"/>
           </w:tcPr>
           <w:p>
             <w:pPr>
-              <w:spacing w:before="20" w:after="20"/>
+              <w:spacing w:before="0" w:after="20"/>
               <w:jc w:val="right"/>
             </w:pPr>
             <w:r>
               <w:rPr>
                 <w:color w:val="64748B"/>
-                <w:sz w:val="19"/>
+                <w:sz w:val="17"/>
+              </w:rPr>
+              <w:t>15</w:t>
+            </w:r>
+          </w:p>
+        </w:tc>
+      </w:tr>
+      <w:tr>
+        <w:trPr>
+          <w:cantSplit/>
+        </w:trPr>
+        <w:tc>
+          <w:tcPr>
+            <w:tcW w:type="dxa" w:w="7920"/>
+            <w:vAlign w:val="center"/>
+            <w:tcMar>
+              <w:top w:w="100" w:type="dxa"/>
+              <w:bottom w:w="100" w:type="dxa"/>
+              <w:left w:w="140" w:type="dxa"/>
+              <w:right w:w="140" w:type="dxa"/>
+            </w:tcMar>
+            <w:shd w:fill="FFFFFF"/>
+            <w:tcMar>
+              <w:top w:w="10" w:type="dxa"/>
+              <w:bottom w:w="10" w:type="dxa"/>
+              <w:left w:w="40" w:type="dxa"/>
+              <w:right w:w="40" w:type="dxa"/>
+            </w:tcMar>
+            <w:shd w:fill="FFFFFF"/>
+          </w:tcPr>
+          <w:p>
+            <w:pPr>
+              <w:spacing w:before="0" w:after="20"/>
+            </w:pPr>
+            <w:r>
+              <w:rPr>
+                <w:color w:val="1E293B"/>
+                <w:sz w:val="17"/>
+              </w:rPr>
+              <w:t xml:space="preserve">    5.4 Taking the Verification Quiz and Earning the Badge</w:t>
+            </w:r>
+          </w:p>
+        </w:tc>
+        <w:tc>
+          <w:tcPr>
+            <w:tcW w:type="dxa" w:w="1440"/>
+            <w:vAlign w:val="center"/>
+            <w:tcMar>
+              <w:top w:w="100" w:type="dxa"/>
+              <w:bottom w:w="100" w:type="dxa"/>
+              <w:left w:w="140" w:type="dxa"/>
+              <w:right w:w="140" w:type="dxa"/>
+            </w:tcMar>
+            <w:shd w:fill="FFFFFF"/>
+            <w:tcMar>
+              <w:top w:w="10" w:type="dxa"/>
+              <w:bottom w:w="10" w:type="dxa"/>
+              <w:left w:w="40" w:type="dxa"/>
+              <w:right w:w="40" w:type="dxa"/>
+            </w:tcMar>
+            <w:shd w:fill="FFFFFF"/>
+          </w:tcPr>
+          <w:p>
+            <w:pPr>
+              <w:spacing w:before="0" w:after="20"/>
+              <w:jc w:val="right"/>
+            </w:pPr>
+            <w:r>
+              <w:rPr>
+                <w:color w:val="64748B"/>
+                <w:sz w:val="17"/>
+              </w:rPr>
+              <w:t>15</w:t>
+            </w:r>
+          </w:p>
+        </w:tc>
+      </w:tr>
+      <w:tr>
+        <w:trPr>
+          <w:cantSplit/>
+        </w:trPr>
+        <w:tc>
+          <w:tcPr>
+            <w:tcW w:type="dxa" w:w="7920"/>
+            <w:vAlign w:val="center"/>
+            <w:tcMar>
+              <w:top w:w="100" w:type="dxa"/>
+              <w:bottom w:w="100" w:type="dxa"/>
+              <w:left w:w="140" w:type="dxa"/>
+              <w:right w:w="140" w:type="dxa"/>
+            </w:tcMar>
+            <w:shd w:fill="F8FAFC"/>
+            <w:tcMar>
+              <w:top w:w="10" w:type="dxa"/>
+              <w:bottom w:w="10" w:type="dxa"/>
+              <w:left w:w="40" w:type="dxa"/>
+              <w:right w:w="40" w:type="dxa"/>
+            </w:tcMar>
+            <w:shd w:fill="FFFFFF"/>
+          </w:tcPr>
+          <w:p>
+            <w:pPr>
+              <w:spacing w:before="0" w:after="20"/>
+            </w:pPr>
+            <w:r>
+              <w:rPr>
+                <w:color w:val="1E293B"/>
+                <w:sz w:val="17"/>
+              </w:rPr>
+              <w:t xml:space="preserve">    5.5 Switching Career Tracks On-The-Fly</w:t>
+            </w:r>
+          </w:p>
+        </w:tc>
+        <w:tc>
+          <w:tcPr>
+            <w:tcW w:type="dxa" w:w="1440"/>
+            <w:vAlign w:val="center"/>
+            <w:tcMar>
+              <w:top w:w="100" w:type="dxa"/>
+              <w:bottom w:w="100" w:type="dxa"/>
+              <w:left w:w="140" w:type="dxa"/>
+              <w:right w:w="140" w:type="dxa"/>
+            </w:tcMar>
+            <w:shd w:fill="F8FAFC"/>
+            <w:tcMar>
+              <w:top w:w="10" w:type="dxa"/>
+              <w:bottom w:w="10" w:type="dxa"/>
+              <w:left w:w="40" w:type="dxa"/>
+              <w:right w:w="40" w:type="dxa"/>
+            </w:tcMar>
+            <w:shd w:fill="FFFFFF"/>
+          </w:tcPr>
+          <w:p>
+            <w:pPr>
+              <w:spacing w:before="0" w:after="20"/>
+              <w:jc w:val="right"/>
+            </w:pPr>
+            <w:r>
+              <w:rPr>
+                <w:color w:val="64748B"/>
+                <w:sz w:val="17"/>
+              </w:rPr>
+              <w:t>16</w:t>
+            </w:r>
+          </w:p>
+        </w:tc>
+      </w:tr>
+      <w:tr>
+        <w:trPr>
+          <w:cantSplit/>
+        </w:trPr>
+        <w:tc>
+          <w:tcPr>
+            <w:tcW w:type="dxa" w:w="7920"/>
+            <w:vAlign w:val="center"/>
+            <w:tcMar>
+              <w:top w:w="100" w:type="dxa"/>
+              <w:bottom w:w="100" w:type="dxa"/>
+              <w:left w:w="140" w:type="dxa"/>
+              <w:right w:w="140" w:type="dxa"/>
+            </w:tcMar>
+            <w:shd w:fill="FFFFFF"/>
+            <w:tcMar>
+              <w:top w:w="10" w:type="dxa"/>
+              <w:bottom w:w="10" w:type="dxa"/>
+              <w:left w:w="40" w:type="dxa"/>
+              <w:right w:w="40" w:type="dxa"/>
+            </w:tcMar>
+            <w:shd w:fill="FFFFFF"/>
+          </w:tcPr>
+          <w:p>
+            <w:pPr>
+              <w:spacing w:before="0" w:after="20"/>
+            </w:pPr>
+            <w:r>
+              <w:rPr>
+                <w:b/>
+                <w:color w:val="1E3A8A"/>
+                <w:sz w:val="17"/>
+              </w:rPr>
+              <w:t>Chapter 6: System Testing &amp; Experimental Results</w:t>
+            </w:r>
+          </w:p>
+        </w:tc>
+        <w:tc>
+          <w:tcPr>
+            <w:tcW w:type="dxa" w:w="1440"/>
+            <w:vAlign w:val="center"/>
+            <w:tcMar>
+              <w:top w:w="100" w:type="dxa"/>
+              <w:bottom w:w="100" w:type="dxa"/>
+              <w:left w:w="140" w:type="dxa"/>
+              <w:right w:w="140" w:type="dxa"/>
+            </w:tcMar>
+            <w:shd w:fill="FFFFFF"/>
+            <w:tcMar>
+              <w:top w:w="10" w:type="dxa"/>
+              <w:bottom w:w="10" w:type="dxa"/>
+              <w:left w:w="40" w:type="dxa"/>
+              <w:right w:w="40" w:type="dxa"/>
+            </w:tcMar>
+            <w:shd w:fill="FFFFFF"/>
+          </w:tcPr>
+          <w:p>
+            <w:pPr>
+              <w:spacing w:before="0" w:after="20"/>
+              <w:jc w:val="right"/>
+            </w:pPr>
+            <w:r>
+              <w:rPr>
+                <w:color w:val="64748B"/>
+                <w:sz w:val="17"/>
               </w:rPr>
               <w:t>17</w:t>
             </w:r>
@@ -2816,7 +2605,7 @@
         </w:trPr>
         <w:tc>
           <w:tcPr>
-            <w:tcW w:type="dxa" w:w="7632"/>
+            <w:tcW w:type="dxa" w:w="7920"/>
             <w:vAlign w:val="center"/>
             <w:tcMar>
               <w:top w:w="100" w:type="dxa"/>
@@ -2824,31 +2613,31 @@
               <w:left w:w="140" w:type="dxa"/>
               <w:right w:w="140" w:type="dxa"/>
             </w:tcMar>
-            <w:shd w:fill="FFFFFF"/>
+            <w:shd w:fill="F8FAFC"/>
             <w:tcMar>
-              <w:top w:w="30" w:type="dxa"/>
-              <w:bottom w:w="30" w:type="dxa"/>
-              <w:left w:w="60" w:type="dxa"/>
-              <w:right w:w="60" w:type="dxa"/>
+              <w:top w:w="10" w:type="dxa"/>
+              <w:bottom w:w="10" w:type="dxa"/>
+              <w:left w:w="40" w:type="dxa"/>
+              <w:right w:w="40" w:type="dxa"/>
             </w:tcMar>
             <w:shd w:fill="FFFFFF"/>
           </w:tcPr>
           <w:p>
             <w:pPr>
-              <w:spacing w:before="20" w:after="20"/>
+              <w:spacing w:before="0" w:after="20"/>
             </w:pPr>
             <w:r>
               <w:rPr>
                 <w:color w:val="1E293B"/>
-                <w:sz w:val="19"/>
+                <w:sz w:val="17"/>
               </w:rPr>
-              <w:t xml:space="preserve">    7.1 Conclusion</w:t>
+              <w:t xml:space="preserve">    6.1 Testing Methodology</w:t>
             </w:r>
           </w:p>
         </w:tc>
         <w:tc>
           <w:tcPr>
-            <w:tcW w:type="dxa" w:w="1728"/>
+            <w:tcW w:type="dxa" w:w="1440"/>
             <w:vAlign w:val="center"/>
             <w:tcMar>
               <w:top w:w="100" w:type="dxa"/>
@@ -2856,24 +2645,24 @@
               <w:left w:w="140" w:type="dxa"/>
               <w:right w:w="140" w:type="dxa"/>
             </w:tcMar>
-            <w:shd w:fill="FFFFFF"/>
+            <w:shd w:fill="F8FAFC"/>
             <w:tcMar>
-              <w:top w:w="30" w:type="dxa"/>
-              <w:bottom w:w="30" w:type="dxa"/>
-              <w:left w:w="60" w:type="dxa"/>
-              <w:right w:w="60" w:type="dxa"/>
+              <w:top w:w="10" w:type="dxa"/>
+              <w:bottom w:w="10" w:type="dxa"/>
+              <w:left w:w="40" w:type="dxa"/>
+              <w:right w:w="40" w:type="dxa"/>
             </w:tcMar>
             <w:shd w:fill="FFFFFF"/>
           </w:tcPr>
           <w:p>
             <w:pPr>
-              <w:spacing w:before="20" w:after="20"/>
+              <w:spacing w:before="0" w:after="20"/>
               <w:jc w:val="right"/>
             </w:pPr>
             <w:r>
               <w:rPr>
                 <w:color w:val="64748B"/>
-                <w:sz w:val="19"/>
+                <w:sz w:val="17"/>
               </w:rPr>
               <w:t>17</w:t>
             </w:r>
@@ -2886,7 +2675,7 @@
         </w:trPr>
         <w:tc>
           <w:tcPr>
-            <w:tcW w:type="dxa" w:w="7632"/>
+            <w:tcW w:type="dxa" w:w="7920"/>
             <w:vAlign w:val="center"/>
             <w:tcMar>
               <w:top w:w="100" w:type="dxa"/>
@@ -2894,31 +2683,31 @@
               <w:left w:w="140" w:type="dxa"/>
               <w:right w:w="140" w:type="dxa"/>
             </w:tcMar>
-            <w:shd w:fill="F8FAFC"/>
+            <w:shd w:fill="FFFFFF"/>
             <w:tcMar>
-              <w:top w:w="30" w:type="dxa"/>
-              <w:bottom w:w="30" w:type="dxa"/>
-              <w:left w:w="60" w:type="dxa"/>
-              <w:right w:w="60" w:type="dxa"/>
+              <w:top w:w="10" w:type="dxa"/>
+              <w:bottom w:w="10" w:type="dxa"/>
+              <w:left w:w="40" w:type="dxa"/>
+              <w:right w:w="40" w:type="dxa"/>
             </w:tcMar>
             <w:shd w:fill="FFFFFF"/>
           </w:tcPr>
           <w:p>
             <w:pPr>
-              <w:spacing w:before="20" w:after="20"/>
+              <w:spacing w:before="0" w:after="20"/>
             </w:pPr>
             <w:r>
               <w:rPr>
                 <w:color w:val="1E293B"/>
-                <w:sz w:val="19"/>
+                <w:sz w:val="17"/>
               </w:rPr>
-              <w:t xml:space="preserve">    7.2 Future Enhancements</w:t>
+              <w:t xml:space="preserve">    6.2 Functional Test Cases &amp; Validation Results</w:t>
             </w:r>
           </w:p>
         </w:tc>
         <w:tc>
           <w:tcPr>
-            <w:tcW w:type="dxa" w:w="1728"/>
+            <w:tcW w:type="dxa" w:w="1440"/>
             <w:vAlign w:val="center"/>
             <w:tcMar>
               <w:top w:w="100" w:type="dxa"/>
@@ -2926,24 +2715,24 @@
               <w:left w:w="140" w:type="dxa"/>
               <w:right w:w="140" w:type="dxa"/>
             </w:tcMar>
-            <w:shd w:fill="F8FAFC"/>
+            <w:shd w:fill="FFFFFF"/>
             <w:tcMar>
-              <w:top w:w="30" w:type="dxa"/>
-              <w:bottom w:w="30" w:type="dxa"/>
-              <w:left w:w="60" w:type="dxa"/>
-              <w:right w:w="60" w:type="dxa"/>
+              <w:top w:w="10" w:type="dxa"/>
+              <w:bottom w:w="10" w:type="dxa"/>
+              <w:left w:w="40" w:type="dxa"/>
+              <w:right w:w="40" w:type="dxa"/>
             </w:tcMar>
             <w:shd w:fill="FFFFFF"/>
           </w:tcPr>
           <w:p>
             <w:pPr>
-              <w:spacing w:before="20" w:after="20"/>
+              <w:spacing w:before="0" w:after="20"/>
               <w:jc w:val="right"/>
             </w:pPr>
             <w:r>
               <w:rPr>
                 <w:color w:val="64748B"/>
-                <w:sz w:val="19"/>
+                <w:sz w:val="17"/>
               </w:rPr>
               <w:t>17</w:t>
             </w:r>
@@ -2956,7 +2745,78 @@
         </w:trPr>
         <w:tc>
           <w:tcPr>
-            <w:tcW w:type="dxa" w:w="7632"/>
+            <w:tcW w:type="dxa" w:w="7920"/>
+            <w:vAlign w:val="center"/>
+            <w:tcMar>
+              <w:top w:w="100" w:type="dxa"/>
+              <w:bottom w:w="100" w:type="dxa"/>
+              <w:left w:w="140" w:type="dxa"/>
+              <w:right w:w="140" w:type="dxa"/>
+            </w:tcMar>
+            <w:shd w:fill="F8FAFC"/>
+            <w:tcMar>
+              <w:top w:w="10" w:type="dxa"/>
+              <w:bottom w:w="10" w:type="dxa"/>
+              <w:left w:w="40" w:type="dxa"/>
+              <w:right w:w="40" w:type="dxa"/>
+            </w:tcMar>
+            <w:shd w:fill="FFFFFF"/>
+          </w:tcPr>
+          <w:p>
+            <w:pPr>
+              <w:spacing w:before="0" w:after="20"/>
+            </w:pPr>
+            <w:r>
+              <w:rPr>
+                <w:b/>
+                <w:color w:val="1E3A8A"/>
+                <w:sz w:val="17"/>
+              </w:rPr>
+              <w:t>Chapter 7: Conclusion &amp; Future Scope</w:t>
+            </w:r>
+          </w:p>
+        </w:tc>
+        <w:tc>
+          <w:tcPr>
+            <w:tcW w:type="dxa" w:w="1440"/>
+            <w:vAlign w:val="center"/>
+            <w:tcMar>
+              <w:top w:w="100" w:type="dxa"/>
+              <w:bottom w:w="100" w:type="dxa"/>
+              <w:left w:w="140" w:type="dxa"/>
+              <w:right w:w="140" w:type="dxa"/>
+            </w:tcMar>
+            <w:shd w:fill="F8FAFC"/>
+            <w:tcMar>
+              <w:top w:w="10" w:type="dxa"/>
+              <w:bottom w:w="10" w:type="dxa"/>
+              <w:left w:w="40" w:type="dxa"/>
+              <w:right w:w="40" w:type="dxa"/>
+            </w:tcMar>
+            <w:shd w:fill="FFFFFF"/>
+          </w:tcPr>
+          <w:p>
+            <w:pPr>
+              <w:spacing w:before="0" w:after="20"/>
+              <w:jc w:val="right"/>
+            </w:pPr>
+            <w:r>
+              <w:rPr>
+                <w:color w:val="64748B"/>
+                <w:sz w:val="17"/>
+              </w:rPr>
+              <w:t>19</w:t>
+            </w:r>
+          </w:p>
+        </w:tc>
+      </w:tr>
+      <w:tr>
+        <w:trPr>
+          <w:cantSplit/>
+        </w:trPr>
+        <w:tc>
+          <w:tcPr>
+            <w:tcW w:type="dxa" w:w="7920"/>
             <w:vAlign w:val="center"/>
             <w:tcMar>
               <w:top w:w="100" w:type="dxa"/>
@@ -2966,30 +2826,29 @@
             </w:tcMar>
             <w:shd w:fill="FFFFFF"/>
             <w:tcMar>
-              <w:top w:w="30" w:type="dxa"/>
-              <w:bottom w:w="30" w:type="dxa"/>
-              <w:left w:w="60" w:type="dxa"/>
-              <w:right w:w="60" w:type="dxa"/>
+              <w:top w:w="10" w:type="dxa"/>
+              <w:bottom w:w="10" w:type="dxa"/>
+              <w:left w:w="40" w:type="dxa"/>
+              <w:right w:w="40" w:type="dxa"/>
             </w:tcMar>
             <w:shd w:fill="FFFFFF"/>
           </w:tcPr>
           <w:p>
             <w:pPr>
-              <w:spacing w:before="20" w:after="20"/>
+              <w:spacing w:before="0" w:after="20"/>
             </w:pPr>
             <w:r>
               <w:rPr>
-                <w:b/>
-                <w:color w:val="1E3A8A"/>
-                <w:sz w:val="19"/>
+                <w:color w:val="1E293B"/>
+                <w:sz w:val="17"/>
               </w:rPr>
-              <w:t>References</w:t>
+              <w:t xml:space="preserve">    7.1 Conclusion</w:t>
             </w:r>
           </w:p>
         </w:tc>
         <w:tc>
           <w:tcPr>
-            <w:tcW w:type="dxa" w:w="1728"/>
+            <w:tcW w:type="dxa" w:w="1440"/>
             <w:vAlign w:val="center"/>
             <w:tcMar>
               <w:top w:w="100" w:type="dxa"/>
@@ -2999,24 +2858,164 @@
             </w:tcMar>
             <w:shd w:fill="FFFFFF"/>
             <w:tcMar>
-              <w:top w:w="30" w:type="dxa"/>
-              <w:bottom w:w="30" w:type="dxa"/>
-              <w:left w:w="60" w:type="dxa"/>
-              <w:right w:w="60" w:type="dxa"/>
+              <w:top w:w="10" w:type="dxa"/>
+              <w:bottom w:w="10" w:type="dxa"/>
+              <w:left w:w="40" w:type="dxa"/>
+              <w:right w:w="40" w:type="dxa"/>
             </w:tcMar>
             <w:shd w:fill="FFFFFF"/>
           </w:tcPr>
           <w:p>
             <w:pPr>
-              <w:spacing w:before="20" w:after="20"/>
+              <w:spacing w:before="0" w:after="20"/>
               <w:jc w:val="right"/>
             </w:pPr>
             <w:r>
               <w:rPr>
                 <w:color w:val="64748B"/>
-                <w:sz w:val="19"/>
+                <w:sz w:val="17"/>
               </w:rPr>
-              <w:t>18</w:t>
+              <w:t>19</w:t>
+            </w:r>
+          </w:p>
+        </w:tc>
+      </w:tr>
+      <w:tr>
+        <w:trPr>
+          <w:cantSplit/>
+        </w:trPr>
+        <w:tc>
+          <w:tcPr>
+            <w:tcW w:type="dxa" w:w="7920"/>
+            <w:vAlign w:val="center"/>
+            <w:tcMar>
+              <w:top w:w="100" w:type="dxa"/>
+              <w:bottom w:w="100" w:type="dxa"/>
+              <w:left w:w="140" w:type="dxa"/>
+              <w:right w:w="140" w:type="dxa"/>
+            </w:tcMar>
+            <w:shd w:fill="F8FAFC"/>
+            <w:tcMar>
+              <w:top w:w="10" w:type="dxa"/>
+              <w:bottom w:w="10" w:type="dxa"/>
+              <w:left w:w="40" w:type="dxa"/>
+              <w:right w:w="40" w:type="dxa"/>
+            </w:tcMar>
+            <w:shd w:fill="FFFFFF"/>
+          </w:tcPr>
+          <w:p>
+            <w:pPr>
+              <w:spacing w:before="0" w:after="20"/>
+            </w:pPr>
+            <w:r>
+              <w:rPr>
+                <w:color w:val="1E293B"/>
+                <w:sz w:val="17"/>
+              </w:rPr>
+              <w:t xml:space="preserve">    7.2 Future Enhancements</w:t>
+            </w:r>
+          </w:p>
+        </w:tc>
+        <w:tc>
+          <w:tcPr>
+            <w:tcW w:type="dxa" w:w="1440"/>
+            <w:vAlign w:val="center"/>
+            <w:tcMar>
+              <w:top w:w="100" w:type="dxa"/>
+              <w:bottom w:w="100" w:type="dxa"/>
+              <w:left w:w="140" w:type="dxa"/>
+              <w:right w:w="140" w:type="dxa"/>
+            </w:tcMar>
+            <w:shd w:fill="F8FAFC"/>
+            <w:tcMar>
+              <w:top w:w="10" w:type="dxa"/>
+              <w:bottom w:w="10" w:type="dxa"/>
+              <w:left w:w="40" w:type="dxa"/>
+              <w:right w:w="40" w:type="dxa"/>
+            </w:tcMar>
+            <w:shd w:fill="FFFFFF"/>
+          </w:tcPr>
+          <w:p>
+            <w:pPr>
+              <w:spacing w:before="0" w:after="20"/>
+              <w:jc w:val="right"/>
+            </w:pPr>
+            <w:r>
+              <w:rPr>
+                <w:color w:val="64748B"/>
+                <w:sz w:val="17"/>
+              </w:rPr>
+              <w:t>19</w:t>
+            </w:r>
+          </w:p>
+        </w:tc>
+      </w:tr>
+      <w:tr>
+        <w:trPr>
+          <w:cantSplit/>
+        </w:trPr>
+        <w:tc>
+          <w:tcPr>
+            <w:tcW w:type="dxa" w:w="7920"/>
+            <w:vAlign w:val="center"/>
+            <w:tcMar>
+              <w:top w:w="100" w:type="dxa"/>
+              <w:bottom w:w="100" w:type="dxa"/>
+              <w:left w:w="140" w:type="dxa"/>
+              <w:right w:w="140" w:type="dxa"/>
+            </w:tcMar>
+            <w:shd w:fill="FFFFFF"/>
+            <w:tcMar>
+              <w:top w:w="10" w:type="dxa"/>
+              <w:bottom w:w="10" w:type="dxa"/>
+              <w:left w:w="40" w:type="dxa"/>
+              <w:right w:w="40" w:type="dxa"/>
+            </w:tcMar>
+            <w:shd w:fill="FFFFFF"/>
+          </w:tcPr>
+          <w:p>
+            <w:pPr>
+              <w:spacing w:before="0" w:after="20"/>
+            </w:pPr>
+            <w:r>
+              <w:rPr>
+                <w:color w:val="1E293B"/>
+                <w:sz w:val="17"/>
+              </w:rPr>
+              <w:t xml:space="preserve">    7.3 References</w:t>
+            </w:r>
+          </w:p>
+        </w:tc>
+        <w:tc>
+          <w:tcPr>
+            <w:tcW w:type="dxa" w:w="1440"/>
+            <w:vAlign w:val="center"/>
+            <w:tcMar>
+              <w:top w:w="100" w:type="dxa"/>
+              <w:bottom w:w="100" w:type="dxa"/>
+              <w:left w:w="140" w:type="dxa"/>
+              <w:right w:w="140" w:type="dxa"/>
+            </w:tcMar>
+            <w:shd w:fill="FFFFFF"/>
+            <w:tcMar>
+              <w:top w:w="10" w:type="dxa"/>
+              <w:bottom w:w="10" w:type="dxa"/>
+              <w:left w:w="40" w:type="dxa"/>
+              <w:right w:w="40" w:type="dxa"/>
+            </w:tcMar>
+            <w:shd w:fill="FFFFFF"/>
+          </w:tcPr>
+          <w:p>
+            <w:pPr>
+              <w:spacing w:before="0" w:after="20"/>
+              <w:jc w:val="right"/>
+            </w:pPr>
+            <w:r>
+              <w:rPr>
+                <w:color w:val="64748B"/>
+                <w:sz w:val="17"/>
+              </w:rPr>
+              <w:t>19</w:t>
             </w:r>
           </w:p>
         </w:tc>

</xml_diff>

<commit_message>
docs: remove acknowledgement and abstract pages, update TOC and re-index page numbers
</commit_message>
<xml_diff>
--- a/CareerGraph_Project_Report.docx
+++ b/CareerGraph_Project_Report.docx
@@ -365,102 +365,6 @@
     </w:p>
     <w:p>
       <w:pPr>
-        <w:spacing w:before="400" w:after="240"/>
-        <w:jc w:val="center"/>
-      </w:pPr>
-      <w:r>
-        <w:rPr>
-          <w:b/>
-          <w:color w:val="1E3A8A"/>
-          <w:sz w:val="32"/>
-        </w:rPr>
-        <w:t>ACKNOWLEDGEMENT</w:t>
-      </w:r>
-    </w:p>
-    <w:p>
-      <w:r>
-        <w:t>We, the members of Group No. 06, express our sincere gratitude to our faculty members, project mentors, and department staff for their valuable guidance, encouragement, and insightful feedback throughout the design, development, and testing of Career Graph.</w:t>
-      </w:r>
-    </w:p>
-    <w:p>
-      <w:r>
-        <w:t>We are also thankful to our institution for providing the required infrastructure, laboratory facilities, and computing resources essential for completing this full-stack engineering project.</w:t>
-      </w:r>
-    </w:p>
-    <w:p>
-      <w:r>
-        <w:t>Finally, we extend our heartfelt appreciation to our fellow team members for their collaborative spirit, dedication, and joint efforts in making this project successful.</w:t>
-      </w:r>
-    </w:p>
-    <w:p>
-      <w:pPr>
-        <w:spacing w:before="560" w:after="200"/>
-      </w:pPr>
-      <w:r>
-        <w:rPr>
-          <w:b/>
-          <w:color w:val="1E293B"/>
-          <w:sz w:val="19"/>
-        </w:rPr>
-        <w:t>Group No. 06 Team Members:</w:t>
-        <w:br/>
-        <w:t>• Shinde Piyush Anil</w:t>
-        <w:tab/>
-        <w:tab/>
-        <w:t>• Surve Archit Milind</w:t>
-        <w:br/>
-        <w:t>• Telore Jagruti Kishore</w:t>
-        <w:tab/>
-        <w:tab/>
-        <w:t>• Tumma Varsha Chandraprakash</w:t>
-        <w:br/>
-        <w:t>• Vichare Sanika Sanjay</w:t>
-        <w:tab/>
-        <w:tab/>
-        <w:t>• Waychal Sanyukta Amol</w:t>
-      </w:r>
-    </w:p>
-    <w:p>
-      <w:r>
-        <w:br w:type="page"/>
-      </w:r>
-    </w:p>
-    <w:p>
-      <w:pPr>
-        <w:spacing w:before="320" w:after="240"/>
-        <w:jc w:val="center"/>
-      </w:pPr>
-      <w:r>
-        <w:rPr>
-          <w:b/>
-          <w:color w:val="1E3A8A"/>
-          <w:sz w:val="32"/>
-        </w:rPr>
-        <w:t>ABSTRACT</w:t>
-      </w:r>
-    </w:p>
-    <w:p>
-      <w:r>
-        <w:t>In the current technical education and software industry landscape, students and career-switchers encounter an overwhelming volume of tutorials, courses, and documentation. However, learners frequently struggle because they lack structured sequencing: foundational prerequisites (such as Git and Linux) are often skipped before attempting advanced frameworks and cloud architectures. Furthermore, existing roadmap platforms (such as roadmap.sh) are largely static and cannot assess what a learner already knows, nor do they carry earned progress across adjacent career paths.</w:t>
-      </w:r>
-    </w:p>
-    <w:p>
-      <w:r>
-        <w:t>To solve these challenges, Group No. 06 developed Career Graph, an interactive full-stack web application built with Vue 3, Node.js, Express, and MongoDB Atlas. Career Graph introduces four core innovations: (1) a 5-tier learning hierarchy (Career Track → Skill → Course → Level/Module → Lesson), (2) a topological prerequisite locking engine that organizes learning into Foundations, Core Stack, and Advanced phases, (3) universal cross-track skill progress reflection, ensuring that foundational skills (e.g., Git or Python) mastered in one track automatically credit towards other tracks, and (4) a server-side Proof-of-Skill validation quiz engine that unlocks a verified badge upon passing.</w:t>
-      </w:r>
-    </w:p>
-    <w:p>
-      <w:r>
-        <w:t>The system has been fully deployed with an interactive SVG Bézier canvas on Vercel Edge and a RESTful API on Render. The application provides learners with a structured, step-by-step path to IT career readiness while offering educators a transparent mechanism to track student skill acquisition.</w:t>
-      </w:r>
-    </w:p>
-    <w:p>
-      <w:r>
-        <w:br w:type="page"/>
-      </w:r>
-    </w:p>
-    <w:p>
-      <w:pPr>
         <w:spacing w:before="160" w:after="120"/>
         <w:jc w:val="center"/>
       </w:pPr>
@@ -491,148 +395,6 @@
         <w:gridCol w:w="4680"/>
         <w:gridCol w:w="4680"/>
       </w:tblGrid>
-      <w:tr>
-        <w:trPr>
-          <w:cantSplit/>
-        </w:trPr>
-        <w:tc>
-          <w:tcPr>
-            <w:tcW w:type="dxa" w:w="7920"/>
-            <w:vAlign w:val="center"/>
-            <w:tcMar>
-              <w:top w:w="100" w:type="dxa"/>
-              <w:bottom w:w="100" w:type="dxa"/>
-              <w:left w:w="140" w:type="dxa"/>
-              <w:right w:w="140" w:type="dxa"/>
-            </w:tcMar>
-            <w:shd w:fill="F8FAFC"/>
-            <w:tcMar>
-              <w:top w:w="10" w:type="dxa"/>
-              <w:bottom w:w="10" w:type="dxa"/>
-              <w:left w:w="40" w:type="dxa"/>
-              <w:right w:w="40" w:type="dxa"/>
-            </w:tcMar>
-            <w:shd w:fill="FFFFFF"/>
-          </w:tcPr>
-          <w:p>
-            <w:pPr>
-              <w:spacing w:before="0" w:after="20"/>
-            </w:pPr>
-            <w:r>
-              <w:rPr>
-                <w:b/>
-                <w:color w:val="1E3A8A"/>
-                <w:sz w:val="17"/>
-              </w:rPr>
-              <w:t>Acknowledgement</w:t>
-            </w:r>
-          </w:p>
-        </w:tc>
-        <w:tc>
-          <w:tcPr>
-            <w:tcW w:type="dxa" w:w="1440"/>
-            <w:vAlign w:val="center"/>
-            <w:tcMar>
-              <w:top w:w="100" w:type="dxa"/>
-              <w:bottom w:w="100" w:type="dxa"/>
-              <w:left w:w="140" w:type="dxa"/>
-              <w:right w:w="140" w:type="dxa"/>
-            </w:tcMar>
-            <w:shd w:fill="F8FAFC"/>
-            <w:tcMar>
-              <w:top w:w="10" w:type="dxa"/>
-              <w:bottom w:w="10" w:type="dxa"/>
-              <w:left w:w="40" w:type="dxa"/>
-              <w:right w:w="40" w:type="dxa"/>
-            </w:tcMar>
-            <w:shd w:fill="FFFFFF"/>
-          </w:tcPr>
-          <w:p>
-            <w:pPr>
-              <w:spacing w:before="0" w:after="20"/>
-              <w:jc w:val="right"/>
-            </w:pPr>
-            <w:r>
-              <w:rPr>
-                <w:color w:val="64748B"/>
-                <w:sz w:val="17"/>
-              </w:rPr>
-              <w:t>2</w:t>
-            </w:r>
-          </w:p>
-        </w:tc>
-      </w:tr>
-      <w:tr>
-        <w:trPr>
-          <w:cantSplit/>
-        </w:trPr>
-        <w:tc>
-          <w:tcPr>
-            <w:tcW w:type="dxa" w:w="7920"/>
-            <w:vAlign w:val="center"/>
-            <w:tcMar>
-              <w:top w:w="100" w:type="dxa"/>
-              <w:bottom w:w="100" w:type="dxa"/>
-              <w:left w:w="140" w:type="dxa"/>
-              <w:right w:w="140" w:type="dxa"/>
-            </w:tcMar>
-            <w:shd w:fill="FFFFFF"/>
-            <w:tcMar>
-              <w:top w:w="10" w:type="dxa"/>
-              <w:bottom w:w="10" w:type="dxa"/>
-              <w:left w:w="40" w:type="dxa"/>
-              <w:right w:w="40" w:type="dxa"/>
-            </w:tcMar>
-            <w:shd w:fill="FFFFFF"/>
-          </w:tcPr>
-          <w:p>
-            <w:pPr>
-              <w:spacing w:before="0" w:after="20"/>
-            </w:pPr>
-            <w:r>
-              <w:rPr>
-                <w:b/>
-                <w:color w:val="1E3A8A"/>
-                <w:sz w:val="17"/>
-              </w:rPr>
-              <w:t>Abstract</w:t>
-            </w:r>
-          </w:p>
-        </w:tc>
-        <w:tc>
-          <w:tcPr>
-            <w:tcW w:type="dxa" w:w="1440"/>
-            <w:vAlign w:val="center"/>
-            <w:tcMar>
-              <w:top w:w="100" w:type="dxa"/>
-              <w:bottom w:w="100" w:type="dxa"/>
-              <w:left w:w="140" w:type="dxa"/>
-              <w:right w:w="140" w:type="dxa"/>
-            </w:tcMar>
-            <w:shd w:fill="FFFFFF"/>
-            <w:tcMar>
-              <w:top w:w="10" w:type="dxa"/>
-              <w:bottom w:w="10" w:type="dxa"/>
-              <w:left w:w="40" w:type="dxa"/>
-              <w:right w:w="40" w:type="dxa"/>
-            </w:tcMar>
-            <w:shd w:fill="FFFFFF"/>
-          </w:tcPr>
-          <w:p>
-            <w:pPr>
-              <w:spacing w:before="0" w:after="20"/>
-              <w:jc w:val="right"/>
-            </w:pPr>
-            <w:r>
-              <w:rPr>
-                <w:color w:val="64748B"/>
-                <w:sz w:val="17"/>
-              </w:rPr>
-              <w:t>3</w:t>
-            </w:r>
-          </w:p>
-        </w:tc>
-      </w:tr>
       <w:tr>
         <w:trPr>
           <w:cantSplit/>
@@ -699,7 +461,7 @@
                 <w:color w:val="64748B"/>
                 <w:sz w:val="17"/>
               </w:rPr>
-              <w:t>5</w:t>
+              <w:t>3</w:t>
             </w:r>
           </w:p>
         </w:tc>
@@ -769,7 +531,7 @@
                 <w:color w:val="64748B"/>
                 <w:sz w:val="17"/>
               </w:rPr>
-              <w:t>5</w:t>
+              <w:t>3</w:t>
             </w:r>
           </w:p>
         </w:tc>
@@ -839,7 +601,7 @@
                 <w:color w:val="64748B"/>
                 <w:sz w:val="17"/>
               </w:rPr>
-              <w:t>5</w:t>
+              <w:t>3</w:t>
             </w:r>
           </w:p>
         </w:tc>
@@ -909,7 +671,7 @@
                 <w:color w:val="64748B"/>
                 <w:sz w:val="17"/>
               </w:rPr>
-              <w:t>5</w:t>
+              <w:t>3</w:t>
             </w:r>
           </w:p>
         </w:tc>
@@ -979,7 +741,7 @@
                 <w:color w:val="64748B"/>
                 <w:sz w:val="17"/>
               </w:rPr>
-              <w:t>6</w:t>
+              <w:t>4</w:t>
             </w:r>
           </w:p>
         </w:tc>
@@ -1050,7 +812,7 @@
                 <w:color w:val="64748B"/>
                 <w:sz w:val="17"/>
               </w:rPr>
-              <w:t>7</w:t>
+              <w:t>5</w:t>
             </w:r>
           </w:p>
         </w:tc>
@@ -1120,7 +882,7 @@
                 <w:color w:val="64748B"/>
                 <w:sz w:val="17"/>
               </w:rPr>
-              <w:t>7</w:t>
+              <w:t>5</w:t>
             </w:r>
           </w:p>
         </w:tc>
@@ -1190,7 +952,7 @@
                 <w:color w:val="64748B"/>
                 <w:sz w:val="17"/>
               </w:rPr>
-              <w:t>7</w:t>
+              <w:t>5</w:t>
             </w:r>
           </w:p>
         </w:tc>
@@ -1260,7 +1022,7 @@
                 <w:color w:val="64748B"/>
                 <w:sz w:val="17"/>
               </w:rPr>
-              <w:t>7</w:t>
+              <w:t>5</w:t>
             </w:r>
           </w:p>
         </w:tc>
@@ -1330,7 +1092,7 @@
                 <w:color w:val="64748B"/>
                 <w:sz w:val="17"/>
               </w:rPr>
-              <w:t>7</w:t>
+              <w:t>5</w:t>
             </w:r>
           </w:p>
         </w:tc>
@@ -1401,7 +1163,7 @@
                 <w:color w:val="64748B"/>
                 <w:sz w:val="17"/>
               </w:rPr>
-              <w:t>9</w:t>
+              <w:t>7</w:t>
             </w:r>
           </w:p>
         </w:tc>
@@ -1471,7 +1233,7 @@
                 <w:color w:val="64748B"/>
                 <w:sz w:val="17"/>
               </w:rPr>
-              <w:t>9</w:t>
+              <w:t>7</w:t>
             </w:r>
           </w:p>
         </w:tc>
@@ -1541,7 +1303,7 @@
                 <w:color w:val="64748B"/>
                 <w:sz w:val="17"/>
               </w:rPr>
-              <w:t>9</w:t>
+              <w:t>7</w:t>
             </w:r>
           </w:p>
         </w:tc>
@@ -1611,7 +1373,7 @@
                 <w:color w:val="64748B"/>
                 <w:sz w:val="17"/>
               </w:rPr>
-              <w:t>10</w:t>
+              <w:t>8</w:t>
             </w:r>
           </w:p>
         </w:tc>
@@ -1681,7 +1443,7 @@
                 <w:color w:val="64748B"/>
                 <w:sz w:val="17"/>
               </w:rPr>
-              <w:t>11</w:t>
+              <w:t>9</w:t>
             </w:r>
           </w:p>
         </w:tc>
@@ -1752,7 +1514,7 @@
                 <w:color w:val="64748B"/>
                 <w:sz w:val="17"/>
               </w:rPr>
-              <w:t>13</w:t>
+              <w:t>11</w:t>
             </w:r>
           </w:p>
         </w:tc>
@@ -1822,7 +1584,7 @@
                 <w:color w:val="64748B"/>
                 <w:sz w:val="17"/>
               </w:rPr>
-              <w:t>13</w:t>
+              <w:t>11</w:t>
             </w:r>
           </w:p>
         </w:tc>
@@ -1892,7 +1654,7 @@
                 <w:color w:val="64748B"/>
                 <w:sz w:val="17"/>
               </w:rPr>
-              <w:t>13</w:t>
+              <w:t>11</w:t>
             </w:r>
           </w:p>
         </w:tc>
@@ -1962,7 +1724,7 @@
                 <w:color w:val="64748B"/>
                 <w:sz w:val="17"/>
               </w:rPr>
-              <w:t>13</w:t>
+              <w:t>11</w:t>
             </w:r>
           </w:p>
         </w:tc>
@@ -2032,7 +1794,7 @@
                 <w:color w:val="64748B"/>
                 <w:sz w:val="17"/>
               </w:rPr>
-              <w:t>14</w:t>
+              <w:t>12</w:t>
             </w:r>
           </w:p>
         </w:tc>
@@ -2070,6 +1832,427 @@
                 <w:sz w:val="17"/>
               </w:rPr>
               <w:t xml:space="preserve">    4.5 Module 5: Universal Cross-Track Skill Sharing</w:t>
+            </w:r>
+          </w:p>
+        </w:tc>
+        <w:tc>
+          <w:tcPr>
+            <w:tcW w:type="dxa" w:w="1440"/>
+            <w:vAlign w:val="center"/>
+            <w:tcMar>
+              <w:top w:w="100" w:type="dxa"/>
+              <w:bottom w:w="100" w:type="dxa"/>
+              <w:left w:w="140" w:type="dxa"/>
+              <w:right w:w="140" w:type="dxa"/>
+            </w:tcMar>
+            <w:shd w:fill="F8FAFC"/>
+            <w:tcMar>
+              <w:top w:w="10" w:type="dxa"/>
+              <w:bottom w:w="10" w:type="dxa"/>
+              <w:left w:w="40" w:type="dxa"/>
+              <w:right w:w="40" w:type="dxa"/>
+            </w:tcMar>
+            <w:shd w:fill="FFFFFF"/>
+          </w:tcPr>
+          <w:p>
+            <w:pPr>
+              <w:spacing w:before="0" w:after="20"/>
+              <w:jc w:val="right"/>
+            </w:pPr>
+            <w:r>
+              <w:rPr>
+                <w:color w:val="64748B"/>
+                <w:sz w:val="17"/>
+              </w:rPr>
+              <w:t>12</w:t>
+            </w:r>
+          </w:p>
+        </w:tc>
+      </w:tr>
+      <w:tr>
+        <w:trPr>
+          <w:cantSplit/>
+        </w:trPr>
+        <w:tc>
+          <w:tcPr>
+            <w:tcW w:type="dxa" w:w="7920"/>
+            <w:vAlign w:val="center"/>
+            <w:tcMar>
+              <w:top w:w="100" w:type="dxa"/>
+              <w:bottom w:w="100" w:type="dxa"/>
+              <w:left w:w="140" w:type="dxa"/>
+              <w:right w:w="140" w:type="dxa"/>
+            </w:tcMar>
+            <w:shd w:fill="FFFFFF"/>
+            <w:tcMar>
+              <w:top w:w="10" w:type="dxa"/>
+              <w:bottom w:w="10" w:type="dxa"/>
+              <w:left w:w="40" w:type="dxa"/>
+              <w:right w:w="40" w:type="dxa"/>
+            </w:tcMar>
+            <w:shd w:fill="FFFFFF"/>
+          </w:tcPr>
+          <w:p>
+            <w:pPr>
+              <w:spacing w:before="0" w:after="20"/>
+            </w:pPr>
+            <w:r>
+              <w:rPr>
+                <w:b/>
+                <w:color w:val="1E3A8A"/>
+                <w:sz w:val="17"/>
+              </w:rPr>
+              <w:t>Chapter 5: User Interface &amp; Workflow Walkthrough</w:t>
+            </w:r>
+          </w:p>
+        </w:tc>
+        <w:tc>
+          <w:tcPr>
+            <w:tcW w:type="dxa" w:w="1440"/>
+            <w:vAlign w:val="center"/>
+            <w:tcMar>
+              <w:top w:w="100" w:type="dxa"/>
+              <w:bottom w:w="100" w:type="dxa"/>
+              <w:left w:w="140" w:type="dxa"/>
+              <w:right w:w="140" w:type="dxa"/>
+            </w:tcMar>
+            <w:shd w:fill="FFFFFF"/>
+            <w:tcMar>
+              <w:top w:w="10" w:type="dxa"/>
+              <w:bottom w:w="10" w:type="dxa"/>
+              <w:left w:w="40" w:type="dxa"/>
+              <w:right w:w="40" w:type="dxa"/>
+            </w:tcMar>
+            <w:shd w:fill="FFFFFF"/>
+          </w:tcPr>
+          <w:p>
+            <w:pPr>
+              <w:spacing w:before="0" w:after="20"/>
+              <w:jc w:val="right"/>
+            </w:pPr>
+            <w:r>
+              <w:rPr>
+                <w:color w:val="64748B"/>
+                <w:sz w:val="17"/>
+              </w:rPr>
+              <w:t>13</w:t>
+            </w:r>
+          </w:p>
+        </w:tc>
+      </w:tr>
+      <w:tr>
+        <w:trPr>
+          <w:cantSplit/>
+        </w:trPr>
+        <w:tc>
+          <w:tcPr>
+            <w:tcW w:type="dxa" w:w="7920"/>
+            <w:vAlign w:val="center"/>
+            <w:tcMar>
+              <w:top w:w="100" w:type="dxa"/>
+              <w:bottom w:w="100" w:type="dxa"/>
+              <w:left w:w="140" w:type="dxa"/>
+              <w:right w:w="140" w:type="dxa"/>
+            </w:tcMar>
+            <w:shd w:fill="F8FAFC"/>
+            <w:tcMar>
+              <w:top w:w="10" w:type="dxa"/>
+              <w:bottom w:w="10" w:type="dxa"/>
+              <w:left w:w="40" w:type="dxa"/>
+              <w:right w:w="40" w:type="dxa"/>
+            </w:tcMar>
+            <w:shd w:fill="FFFFFF"/>
+          </w:tcPr>
+          <w:p>
+            <w:pPr>
+              <w:spacing w:before="0" w:after="20"/>
+            </w:pPr>
+            <w:r>
+              <w:rPr>
+                <w:color w:val="1E293B"/>
+                <w:sz w:val="17"/>
+              </w:rPr>
+              <w:t xml:space="preserve">    5.1 User Registration and Career Goal Selection</w:t>
+            </w:r>
+          </w:p>
+        </w:tc>
+        <w:tc>
+          <w:tcPr>
+            <w:tcW w:type="dxa" w:w="1440"/>
+            <w:vAlign w:val="center"/>
+            <w:tcMar>
+              <w:top w:w="100" w:type="dxa"/>
+              <w:bottom w:w="100" w:type="dxa"/>
+              <w:left w:w="140" w:type="dxa"/>
+              <w:right w:w="140" w:type="dxa"/>
+            </w:tcMar>
+            <w:shd w:fill="F8FAFC"/>
+            <w:tcMar>
+              <w:top w:w="10" w:type="dxa"/>
+              <w:bottom w:w="10" w:type="dxa"/>
+              <w:left w:w="40" w:type="dxa"/>
+              <w:right w:w="40" w:type="dxa"/>
+            </w:tcMar>
+            <w:shd w:fill="FFFFFF"/>
+          </w:tcPr>
+          <w:p>
+            <w:pPr>
+              <w:spacing w:before="0" w:after="20"/>
+              <w:jc w:val="right"/>
+            </w:pPr>
+            <w:r>
+              <w:rPr>
+                <w:color w:val="64748B"/>
+                <w:sz w:val="17"/>
+              </w:rPr>
+              <w:t>13</w:t>
+            </w:r>
+          </w:p>
+        </w:tc>
+      </w:tr>
+      <w:tr>
+        <w:trPr>
+          <w:cantSplit/>
+        </w:trPr>
+        <w:tc>
+          <w:tcPr>
+            <w:tcW w:type="dxa" w:w="7920"/>
+            <w:vAlign w:val="center"/>
+            <w:tcMar>
+              <w:top w:w="100" w:type="dxa"/>
+              <w:bottom w:w="100" w:type="dxa"/>
+              <w:left w:w="140" w:type="dxa"/>
+              <w:right w:w="140" w:type="dxa"/>
+            </w:tcMar>
+            <w:shd w:fill="FFFFFF"/>
+            <w:tcMar>
+              <w:top w:w="10" w:type="dxa"/>
+              <w:bottom w:w="10" w:type="dxa"/>
+              <w:left w:w="40" w:type="dxa"/>
+              <w:right w:w="40" w:type="dxa"/>
+            </w:tcMar>
+            <w:shd w:fill="FFFFFF"/>
+          </w:tcPr>
+          <w:p>
+            <w:pPr>
+              <w:spacing w:before="0" w:after="20"/>
+            </w:pPr>
+            <w:r>
+              <w:rPr>
+                <w:color w:val="1E293B"/>
+                <w:sz w:val="17"/>
+              </w:rPr>
+              <w:t xml:space="preserve">    5.2 Interactive SVG Bézier Roadmap Canvas</w:t>
+            </w:r>
+          </w:p>
+        </w:tc>
+        <w:tc>
+          <w:tcPr>
+            <w:tcW w:type="dxa" w:w="1440"/>
+            <w:vAlign w:val="center"/>
+            <w:tcMar>
+              <w:top w:w="100" w:type="dxa"/>
+              <w:bottom w:w="100" w:type="dxa"/>
+              <w:left w:w="140" w:type="dxa"/>
+              <w:right w:w="140" w:type="dxa"/>
+            </w:tcMar>
+            <w:shd w:fill="FFFFFF"/>
+            <w:tcMar>
+              <w:top w:w="10" w:type="dxa"/>
+              <w:bottom w:w="10" w:type="dxa"/>
+              <w:left w:w="40" w:type="dxa"/>
+              <w:right w:w="40" w:type="dxa"/>
+            </w:tcMar>
+            <w:shd w:fill="FFFFFF"/>
+          </w:tcPr>
+          <w:p>
+            <w:pPr>
+              <w:spacing w:before="0" w:after="20"/>
+              <w:jc w:val="right"/>
+            </w:pPr>
+            <w:r>
+              <w:rPr>
+                <w:color w:val="64748B"/>
+                <w:sz w:val="17"/>
+              </w:rPr>
+              <w:t>13</w:t>
+            </w:r>
+          </w:p>
+        </w:tc>
+      </w:tr>
+      <w:tr>
+        <w:trPr>
+          <w:cantSplit/>
+        </w:trPr>
+        <w:tc>
+          <w:tcPr>
+            <w:tcW w:type="dxa" w:w="7920"/>
+            <w:vAlign w:val="center"/>
+            <w:tcMar>
+              <w:top w:w="100" w:type="dxa"/>
+              <w:bottom w:w="100" w:type="dxa"/>
+              <w:left w:w="140" w:type="dxa"/>
+              <w:right w:w="140" w:type="dxa"/>
+            </w:tcMar>
+            <w:shd w:fill="F8FAFC"/>
+            <w:tcMar>
+              <w:top w:w="10" w:type="dxa"/>
+              <w:bottom w:w="10" w:type="dxa"/>
+              <w:left w:w="40" w:type="dxa"/>
+              <w:right w:w="40" w:type="dxa"/>
+            </w:tcMar>
+            <w:shd w:fill="FFFFFF"/>
+          </w:tcPr>
+          <w:p>
+            <w:pPr>
+              <w:spacing w:before="0" w:after="20"/>
+            </w:pPr>
+            <w:r>
+              <w:rPr>
+                <w:color w:val="1E293B"/>
+                <w:sz w:val="17"/>
+              </w:rPr>
+              <w:t xml:space="preserve">    5.3 Topic Preview Drawer &amp; Lesson Checklists</w:t>
+            </w:r>
+          </w:p>
+        </w:tc>
+        <w:tc>
+          <w:tcPr>
+            <w:tcW w:type="dxa" w:w="1440"/>
+            <w:vAlign w:val="center"/>
+            <w:tcMar>
+              <w:top w:w="100" w:type="dxa"/>
+              <w:bottom w:w="100" w:type="dxa"/>
+              <w:left w:w="140" w:type="dxa"/>
+              <w:right w:w="140" w:type="dxa"/>
+            </w:tcMar>
+            <w:shd w:fill="F8FAFC"/>
+            <w:tcMar>
+              <w:top w:w="10" w:type="dxa"/>
+              <w:bottom w:w="10" w:type="dxa"/>
+              <w:left w:w="40" w:type="dxa"/>
+              <w:right w:w="40" w:type="dxa"/>
+            </w:tcMar>
+            <w:shd w:fill="FFFFFF"/>
+          </w:tcPr>
+          <w:p>
+            <w:pPr>
+              <w:spacing w:before="0" w:after="20"/>
+              <w:jc w:val="right"/>
+            </w:pPr>
+            <w:r>
+              <w:rPr>
+                <w:color w:val="64748B"/>
+                <w:sz w:val="17"/>
+              </w:rPr>
+              <w:t>13</w:t>
+            </w:r>
+          </w:p>
+        </w:tc>
+      </w:tr>
+      <w:tr>
+        <w:trPr>
+          <w:cantSplit/>
+        </w:trPr>
+        <w:tc>
+          <w:tcPr>
+            <w:tcW w:type="dxa" w:w="7920"/>
+            <w:vAlign w:val="center"/>
+            <w:tcMar>
+              <w:top w:w="100" w:type="dxa"/>
+              <w:bottom w:w="100" w:type="dxa"/>
+              <w:left w:w="140" w:type="dxa"/>
+              <w:right w:w="140" w:type="dxa"/>
+            </w:tcMar>
+            <w:shd w:fill="FFFFFF"/>
+            <w:tcMar>
+              <w:top w:w="10" w:type="dxa"/>
+              <w:bottom w:w="10" w:type="dxa"/>
+              <w:left w:w="40" w:type="dxa"/>
+              <w:right w:w="40" w:type="dxa"/>
+            </w:tcMar>
+            <w:shd w:fill="FFFFFF"/>
+          </w:tcPr>
+          <w:p>
+            <w:pPr>
+              <w:spacing w:before="0" w:after="20"/>
+            </w:pPr>
+            <w:r>
+              <w:rPr>
+                <w:color w:val="1E293B"/>
+                <w:sz w:val="17"/>
+              </w:rPr>
+              <w:t xml:space="preserve">    5.4 Taking the Verification Quiz and Earning the Badge</w:t>
+            </w:r>
+          </w:p>
+        </w:tc>
+        <w:tc>
+          <w:tcPr>
+            <w:tcW w:type="dxa" w:w="1440"/>
+            <w:vAlign w:val="center"/>
+            <w:tcMar>
+              <w:top w:w="100" w:type="dxa"/>
+              <w:bottom w:w="100" w:type="dxa"/>
+              <w:left w:w="140" w:type="dxa"/>
+              <w:right w:w="140" w:type="dxa"/>
+            </w:tcMar>
+            <w:shd w:fill="FFFFFF"/>
+            <w:tcMar>
+              <w:top w:w="10" w:type="dxa"/>
+              <w:bottom w:w="10" w:type="dxa"/>
+              <w:left w:w="40" w:type="dxa"/>
+              <w:right w:w="40" w:type="dxa"/>
+            </w:tcMar>
+            <w:shd w:fill="FFFFFF"/>
+          </w:tcPr>
+          <w:p>
+            <w:pPr>
+              <w:spacing w:before="0" w:after="20"/>
+              <w:jc w:val="right"/>
+            </w:pPr>
+            <w:r>
+              <w:rPr>
+                <w:color w:val="64748B"/>
+                <w:sz w:val="17"/>
+              </w:rPr>
+              <w:t>13</w:t>
+            </w:r>
+          </w:p>
+        </w:tc>
+      </w:tr>
+      <w:tr>
+        <w:trPr>
+          <w:cantSplit/>
+        </w:trPr>
+        <w:tc>
+          <w:tcPr>
+            <w:tcW w:type="dxa" w:w="7920"/>
+            <w:vAlign w:val="center"/>
+            <w:tcMar>
+              <w:top w:w="100" w:type="dxa"/>
+              <w:bottom w:w="100" w:type="dxa"/>
+              <w:left w:w="140" w:type="dxa"/>
+              <w:right w:w="140" w:type="dxa"/>
+            </w:tcMar>
+            <w:shd w:fill="F8FAFC"/>
+            <w:tcMar>
+              <w:top w:w="10" w:type="dxa"/>
+              <w:bottom w:w="10" w:type="dxa"/>
+              <w:left w:w="40" w:type="dxa"/>
+              <w:right w:w="40" w:type="dxa"/>
+            </w:tcMar>
+            <w:shd w:fill="FFFFFF"/>
+          </w:tcPr>
+          <w:p>
+            <w:pPr>
+              <w:spacing w:before="0" w:after="20"/>
+            </w:pPr>
+            <w:r>
+              <w:rPr>
+                <w:color w:val="1E293B"/>
+                <w:sz w:val="17"/>
+              </w:rPr>
+              <w:t xml:space="preserve">    5.5 Switching Career Tracks On-The-Fly</w:t>
             </w:r>
           </w:p>
         </w:tc>
@@ -2140,7 +2323,7 @@
                 <w:color w:val="1E3A8A"/>
                 <w:sz w:val="17"/>
               </w:rPr>
-              <w:t>Chapter 5: User Interface &amp; Workflow Walkthrough</w:t>
+              <w:t>Chapter 6: System Testing &amp; Experimental Results</w:t>
             </w:r>
           </w:p>
         </w:tc>
@@ -2210,7 +2393,7 @@
                 <w:color w:val="1E293B"/>
                 <w:sz w:val="17"/>
               </w:rPr>
-              <w:t xml:space="preserve">    5.1 User Registration and Career Goal Selection</w:t>
+              <w:t xml:space="preserve">    6.1 Testing Methodology</w:t>
             </w:r>
           </w:p>
         </w:tc>
@@ -2280,7 +2463,7 @@
                 <w:color w:val="1E293B"/>
                 <w:sz w:val="17"/>
               </w:rPr>
-              <w:t xml:space="preserve">    5.2 Interactive SVG Bézier Roadmap Canvas</w:t>
+              <w:t xml:space="preserve">    6.2 Functional Test Cases &amp; Validation Results</w:t>
             </w:r>
           </w:p>
         </w:tc>
@@ -2314,427 +2497,6 @@
                 <w:sz w:val="17"/>
               </w:rPr>
               <w:t>15</w:t>
-            </w:r>
-          </w:p>
-        </w:tc>
-      </w:tr>
-      <w:tr>
-        <w:trPr>
-          <w:cantSplit/>
-        </w:trPr>
-        <w:tc>
-          <w:tcPr>
-            <w:tcW w:type="dxa" w:w="7920"/>
-            <w:vAlign w:val="center"/>
-            <w:tcMar>
-              <w:top w:w="100" w:type="dxa"/>
-              <w:bottom w:w="100" w:type="dxa"/>
-              <w:left w:w="140" w:type="dxa"/>
-              <w:right w:w="140" w:type="dxa"/>
-            </w:tcMar>
-            <w:shd w:fill="F8FAFC"/>
-            <w:tcMar>
-              <w:top w:w="10" w:type="dxa"/>
-              <w:bottom w:w="10" w:type="dxa"/>
-              <w:left w:w="40" w:type="dxa"/>
-              <w:right w:w="40" w:type="dxa"/>
-            </w:tcMar>
-            <w:shd w:fill="FFFFFF"/>
-          </w:tcPr>
-          <w:p>
-            <w:pPr>
-              <w:spacing w:before="0" w:after="20"/>
-            </w:pPr>
-            <w:r>
-              <w:rPr>
-                <w:color w:val="1E293B"/>
-                <w:sz w:val="17"/>
-              </w:rPr>
-              <w:t xml:space="preserve">    5.3 Topic Preview Drawer &amp; Lesson Checklists</w:t>
-            </w:r>
-          </w:p>
-        </w:tc>
-        <w:tc>
-          <w:tcPr>
-            <w:tcW w:type="dxa" w:w="1440"/>
-            <w:vAlign w:val="center"/>
-            <w:tcMar>
-              <w:top w:w="100" w:type="dxa"/>
-              <w:bottom w:w="100" w:type="dxa"/>
-              <w:left w:w="140" w:type="dxa"/>
-              <w:right w:w="140" w:type="dxa"/>
-            </w:tcMar>
-            <w:shd w:fill="F8FAFC"/>
-            <w:tcMar>
-              <w:top w:w="10" w:type="dxa"/>
-              <w:bottom w:w="10" w:type="dxa"/>
-              <w:left w:w="40" w:type="dxa"/>
-              <w:right w:w="40" w:type="dxa"/>
-            </w:tcMar>
-            <w:shd w:fill="FFFFFF"/>
-          </w:tcPr>
-          <w:p>
-            <w:pPr>
-              <w:spacing w:before="0" w:after="20"/>
-              <w:jc w:val="right"/>
-            </w:pPr>
-            <w:r>
-              <w:rPr>
-                <w:color w:val="64748B"/>
-                <w:sz w:val="17"/>
-              </w:rPr>
-              <w:t>15</w:t>
-            </w:r>
-          </w:p>
-        </w:tc>
-      </w:tr>
-      <w:tr>
-        <w:trPr>
-          <w:cantSplit/>
-        </w:trPr>
-        <w:tc>
-          <w:tcPr>
-            <w:tcW w:type="dxa" w:w="7920"/>
-            <w:vAlign w:val="center"/>
-            <w:tcMar>
-              <w:top w:w="100" w:type="dxa"/>
-              <w:bottom w:w="100" w:type="dxa"/>
-              <w:left w:w="140" w:type="dxa"/>
-              <w:right w:w="140" w:type="dxa"/>
-            </w:tcMar>
-            <w:shd w:fill="FFFFFF"/>
-            <w:tcMar>
-              <w:top w:w="10" w:type="dxa"/>
-              <w:bottom w:w="10" w:type="dxa"/>
-              <w:left w:w="40" w:type="dxa"/>
-              <w:right w:w="40" w:type="dxa"/>
-            </w:tcMar>
-            <w:shd w:fill="FFFFFF"/>
-          </w:tcPr>
-          <w:p>
-            <w:pPr>
-              <w:spacing w:before="0" w:after="20"/>
-            </w:pPr>
-            <w:r>
-              <w:rPr>
-                <w:color w:val="1E293B"/>
-                <w:sz w:val="17"/>
-              </w:rPr>
-              <w:t xml:space="preserve">    5.4 Taking the Verification Quiz and Earning the Badge</w:t>
-            </w:r>
-          </w:p>
-        </w:tc>
-        <w:tc>
-          <w:tcPr>
-            <w:tcW w:type="dxa" w:w="1440"/>
-            <w:vAlign w:val="center"/>
-            <w:tcMar>
-              <w:top w:w="100" w:type="dxa"/>
-              <w:bottom w:w="100" w:type="dxa"/>
-              <w:left w:w="140" w:type="dxa"/>
-              <w:right w:w="140" w:type="dxa"/>
-            </w:tcMar>
-            <w:shd w:fill="FFFFFF"/>
-            <w:tcMar>
-              <w:top w:w="10" w:type="dxa"/>
-              <w:bottom w:w="10" w:type="dxa"/>
-              <w:left w:w="40" w:type="dxa"/>
-              <w:right w:w="40" w:type="dxa"/>
-            </w:tcMar>
-            <w:shd w:fill="FFFFFF"/>
-          </w:tcPr>
-          <w:p>
-            <w:pPr>
-              <w:spacing w:before="0" w:after="20"/>
-              <w:jc w:val="right"/>
-            </w:pPr>
-            <w:r>
-              <w:rPr>
-                <w:color w:val="64748B"/>
-                <w:sz w:val="17"/>
-              </w:rPr>
-              <w:t>15</w:t>
-            </w:r>
-          </w:p>
-        </w:tc>
-      </w:tr>
-      <w:tr>
-        <w:trPr>
-          <w:cantSplit/>
-        </w:trPr>
-        <w:tc>
-          <w:tcPr>
-            <w:tcW w:type="dxa" w:w="7920"/>
-            <w:vAlign w:val="center"/>
-            <w:tcMar>
-              <w:top w:w="100" w:type="dxa"/>
-              <w:bottom w:w="100" w:type="dxa"/>
-              <w:left w:w="140" w:type="dxa"/>
-              <w:right w:w="140" w:type="dxa"/>
-            </w:tcMar>
-            <w:shd w:fill="F8FAFC"/>
-            <w:tcMar>
-              <w:top w:w="10" w:type="dxa"/>
-              <w:bottom w:w="10" w:type="dxa"/>
-              <w:left w:w="40" w:type="dxa"/>
-              <w:right w:w="40" w:type="dxa"/>
-            </w:tcMar>
-            <w:shd w:fill="FFFFFF"/>
-          </w:tcPr>
-          <w:p>
-            <w:pPr>
-              <w:spacing w:before="0" w:after="20"/>
-            </w:pPr>
-            <w:r>
-              <w:rPr>
-                <w:color w:val="1E293B"/>
-                <w:sz w:val="17"/>
-              </w:rPr>
-              <w:t xml:space="preserve">    5.5 Switching Career Tracks On-The-Fly</w:t>
-            </w:r>
-          </w:p>
-        </w:tc>
-        <w:tc>
-          <w:tcPr>
-            <w:tcW w:type="dxa" w:w="1440"/>
-            <w:vAlign w:val="center"/>
-            <w:tcMar>
-              <w:top w:w="100" w:type="dxa"/>
-              <w:bottom w:w="100" w:type="dxa"/>
-              <w:left w:w="140" w:type="dxa"/>
-              <w:right w:w="140" w:type="dxa"/>
-            </w:tcMar>
-            <w:shd w:fill="F8FAFC"/>
-            <w:tcMar>
-              <w:top w:w="10" w:type="dxa"/>
-              <w:bottom w:w="10" w:type="dxa"/>
-              <w:left w:w="40" w:type="dxa"/>
-              <w:right w:w="40" w:type="dxa"/>
-            </w:tcMar>
-            <w:shd w:fill="FFFFFF"/>
-          </w:tcPr>
-          <w:p>
-            <w:pPr>
-              <w:spacing w:before="0" w:after="20"/>
-              <w:jc w:val="right"/>
-            </w:pPr>
-            <w:r>
-              <w:rPr>
-                <w:color w:val="64748B"/>
-                <w:sz w:val="17"/>
-              </w:rPr>
-              <w:t>16</w:t>
-            </w:r>
-          </w:p>
-        </w:tc>
-      </w:tr>
-      <w:tr>
-        <w:trPr>
-          <w:cantSplit/>
-        </w:trPr>
-        <w:tc>
-          <w:tcPr>
-            <w:tcW w:type="dxa" w:w="7920"/>
-            <w:vAlign w:val="center"/>
-            <w:tcMar>
-              <w:top w:w="100" w:type="dxa"/>
-              <w:bottom w:w="100" w:type="dxa"/>
-              <w:left w:w="140" w:type="dxa"/>
-              <w:right w:w="140" w:type="dxa"/>
-            </w:tcMar>
-            <w:shd w:fill="FFFFFF"/>
-            <w:tcMar>
-              <w:top w:w="10" w:type="dxa"/>
-              <w:bottom w:w="10" w:type="dxa"/>
-              <w:left w:w="40" w:type="dxa"/>
-              <w:right w:w="40" w:type="dxa"/>
-            </w:tcMar>
-            <w:shd w:fill="FFFFFF"/>
-          </w:tcPr>
-          <w:p>
-            <w:pPr>
-              <w:spacing w:before="0" w:after="20"/>
-            </w:pPr>
-            <w:r>
-              <w:rPr>
-                <w:b/>
-                <w:color w:val="1E3A8A"/>
-                <w:sz w:val="17"/>
-              </w:rPr>
-              <w:t>Chapter 6: System Testing &amp; Experimental Results</w:t>
-            </w:r>
-          </w:p>
-        </w:tc>
-        <w:tc>
-          <w:tcPr>
-            <w:tcW w:type="dxa" w:w="1440"/>
-            <w:vAlign w:val="center"/>
-            <w:tcMar>
-              <w:top w:w="100" w:type="dxa"/>
-              <w:bottom w:w="100" w:type="dxa"/>
-              <w:left w:w="140" w:type="dxa"/>
-              <w:right w:w="140" w:type="dxa"/>
-            </w:tcMar>
-            <w:shd w:fill="FFFFFF"/>
-            <w:tcMar>
-              <w:top w:w="10" w:type="dxa"/>
-              <w:bottom w:w="10" w:type="dxa"/>
-              <w:left w:w="40" w:type="dxa"/>
-              <w:right w:w="40" w:type="dxa"/>
-            </w:tcMar>
-            <w:shd w:fill="FFFFFF"/>
-          </w:tcPr>
-          <w:p>
-            <w:pPr>
-              <w:spacing w:before="0" w:after="20"/>
-              <w:jc w:val="right"/>
-            </w:pPr>
-            <w:r>
-              <w:rPr>
-                <w:color w:val="64748B"/>
-                <w:sz w:val="17"/>
-              </w:rPr>
-              <w:t>17</w:t>
-            </w:r>
-          </w:p>
-        </w:tc>
-      </w:tr>
-      <w:tr>
-        <w:trPr>
-          <w:cantSplit/>
-        </w:trPr>
-        <w:tc>
-          <w:tcPr>
-            <w:tcW w:type="dxa" w:w="7920"/>
-            <w:vAlign w:val="center"/>
-            <w:tcMar>
-              <w:top w:w="100" w:type="dxa"/>
-              <w:bottom w:w="100" w:type="dxa"/>
-              <w:left w:w="140" w:type="dxa"/>
-              <w:right w:w="140" w:type="dxa"/>
-            </w:tcMar>
-            <w:shd w:fill="F8FAFC"/>
-            <w:tcMar>
-              <w:top w:w="10" w:type="dxa"/>
-              <w:bottom w:w="10" w:type="dxa"/>
-              <w:left w:w="40" w:type="dxa"/>
-              <w:right w:w="40" w:type="dxa"/>
-            </w:tcMar>
-            <w:shd w:fill="FFFFFF"/>
-          </w:tcPr>
-          <w:p>
-            <w:pPr>
-              <w:spacing w:before="0" w:after="20"/>
-            </w:pPr>
-            <w:r>
-              <w:rPr>
-                <w:color w:val="1E293B"/>
-                <w:sz w:val="17"/>
-              </w:rPr>
-              <w:t xml:space="preserve">    6.1 Testing Methodology</w:t>
-            </w:r>
-          </w:p>
-        </w:tc>
-        <w:tc>
-          <w:tcPr>
-            <w:tcW w:type="dxa" w:w="1440"/>
-            <w:vAlign w:val="center"/>
-            <w:tcMar>
-              <w:top w:w="100" w:type="dxa"/>
-              <w:bottom w:w="100" w:type="dxa"/>
-              <w:left w:w="140" w:type="dxa"/>
-              <w:right w:w="140" w:type="dxa"/>
-            </w:tcMar>
-            <w:shd w:fill="F8FAFC"/>
-            <w:tcMar>
-              <w:top w:w="10" w:type="dxa"/>
-              <w:bottom w:w="10" w:type="dxa"/>
-              <w:left w:w="40" w:type="dxa"/>
-              <w:right w:w="40" w:type="dxa"/>
-            </w:tcMar>
-            <w:shd w:fill="FFFFFF"/>
-          </w:tcPr>
-          <w:p>
-            <w:pPr>
-              <w:spacing w:before="0" w:after="20"/>
-              <w:jc w:val="right"/>
-            </w:pPr>
-            <w:r>
-              <w:rPr>
-                <w:color w:val="64748B"/>
-                <w:sz w:val="17"/>
-              </w:rPr>
-              <w:t>17</w:t>
-            </w:r>
-          </w:p>
-        </w:tc>
-      </w:tr>
-      <w:tr>
-        <w:trPr>
-          <w:cantSplit/>
-        </w:trPr>
-        <w:tc>
-          <w:tcPr>
-            <w:tcW w:type="dxa" w:w="7920"/>
-            <w:vAlign w:val="center"/>
-            <w:tcMar>
-              <w:top w:w="100" w:type="dxa"/>
-              <w:bottom w:w="100" w:type="dxa"/>
-              <w:left w:w="140" w:type="dxa"/>
-              <w:right w:w="140" w:type="dxa"/>
-            </w:tcMar>
-            <w:shd w:fill="FFFFFF"/>
-            <w:tcMar>
-              <w:top w:w="10" w:type="dxa"/>
-              <w:bottom w:w="10" w:type="dxa"/>
-              <w:left w:w="40" w:type="dxa"/>
-              <w:right w:w="40" w:type="dxa"/>
-            </w:tcMar>
-            <w:shd w:fill="FFFFFF"/>
-          </w:tcPr>
-          <w:p>
-            <w:pPr>
-              <w:spacing w:before="0" w:after="20"/>
-            </w:pPr>
-            <w:r>
-              <w:rPr>
-                <w:color w:val="1E293B"/>
-                <w:sz w:val="17"/>
-              </w:rPr>
-              <w:t xml:space="preserve">    6.2 Functional Test Cases &amp; Validation Results</w:t>
-            </w:r>
-          </w:p>
-        </w:tc>
-        <w:tc>
-          <w:tcPr>
-            <w:tcW w:type="dxa" w:w="1440"/>
-            <w:vAlign w:val="center"/>
-            <w:tcMar>
-              <w:top w:w="100" w:type="dxa"/>
-              <w:bottom w:w="100" w:type="dxa"/>
-              <w:left w:w="140" w:type="dxa"/>
-              <w:right w:w="140" w:type="dxa"/>
-            </w:tcMar>
-            <w:shd w:fill="FFFFFF"/>
-            <w:tcMar>
-              <w:top w:w="10" w:type="dxa"/>
-              <w:bottom w:w="10" w:type="dxa"/>
-              <w:left w:w="40" w:type="dxa"/>
-              <w:right w:w="40" w:type="dxa"/>
-            </w:tcMar>
-            <w:shd w:fill="FFFFFF"/>
-          </w:tcPr>
-          <w:p>
-            <w:pPr>
-              <w:spacing w:before="0" w:after="20"/>
-              <w:jc w:val="right"/>
-            </w:pPr>
-            <w:r>
-              <w:rPr>
-                <w:color w:val="64748B"/>
-                <w:sz w:val="17"/>
-              </w:rPr>
-              <w:t>17</w:t>
             </w:r>
           </w:p>
         </w:tc>
@@ -2805,7 +2567,7 @@
                 <w:color w:val="64748B"/>
                 <w:sz w:val="17"/>
               </w:rPr>
-              <w:t>19</w:t>
+              <w:t>17</w:t>
             </w:r>
           </w:p>
         </w:tc>
@@ -2875,7 +2637,7 @@
                 <w:color w:val="64748B"/>
                 <w:sz w:val="17"/>
               </w:rPr>
-              <w:t>19</w:t>
+              <w:t>17</w:t>
             </w:r>
           </w:p>
         </w:tc>
@@ -2945,7 +2707,7 @@
                 <w:color w:val="64748B"/>
                 <w:sz w:val="17"/>
               </w:rPr>
-              <w:t>19</w:t>
+              <w:t>17</w:t>
             </w:r>
           </w:p>
         </w:tc>
@@ -3015,7 +2777,7 @@
                 <w:color w:val="64748B"/>
                 <w:sz w:val="17"/>
               </w:rPr>
-              <w:t>19</w:t>
+              <w:t>17</w:t>
             </w:r>
           </w:p>
         </w:tc>

</xml_diff>